<commit_message>
Add Calm Arrow logic puzzle prototype (Native HTML5 & Unity 6 WebGL) to Unity Lab
</commit_message>
<xml_diff>
--- a/assets/resume/Arpit_Jaiswal_Game_Dev_Resume.docx
+++ b/assets/resume/Arpit_Jaiswal_Game_Dev_Resume.docx
@@ -4,15 +4,23 @@
   <w:body>
     <w:p>
       <w:pPr>
-        <w:spacing w:before="0" w:after="20"/>
+        <w:spacing w:before="0" w:after="10"/>
       </w:pPr>
       <w:r>
         <w:rPr>
           <w:b/>
           <w:color w:val="0F172A"/>
-          <w:sz w:val="36"/>
+          <w:sz w:val="34"/>
         </w:rPr>
         <w:t>ARPIT K. JAISWAL</w:t>
+      </w:r>
+      <w:r>
+        <w:rPr>
+          <w:b/>
+          <w:color w:val="059669"/>
+          <w:sz w:val="19"/>
+        </w:rPr>
+        <w:t xml:space="preserve">   [ UNITY DEVELOPER ]</w:t>
       </w:r>
       <w:r>
         <w:rPr>
@@ -20,7 +28,7 @@
           <w:color w:val="1D4ED8"/>
           <w:sz w:val="19"/>
         </w:rPr>
-        <w:t xml:space="preserve">   [ 3.5+ YRS EXPERIENCE ]</w:t>
+        <w:t xml:space="preserve">  [ 3.5+ YRS EXPERIENCE ]</w:t>
       </w:r>
     </w:p>
     <w:p>
@@ -31,7 +39,7 @@
         <w:rPr>
           <w:b/>
           <w:color w:val="1D4ED8"/>
-          <w:sz w:val="22"/>
+          <w:sz w:val="21"/>
         </w:rPr>
         <w:t>GAMEPLAY &amp; AI SYSTEMS DEVELOPER</w:t>
       </w:r>
@@ -39,16 +47,23 @@
         <w:rPr>
           <w:b/>
           <w:color w:val="334155"/>
-          <w:sz w:val="22"/>
+          <w:sz w:val="21"/>
         </w:rPr>
         <w:t xml:space="preserve">  |  SPECIALIZATION IN UNITY</w:t>
       </w:r>
     </w:p>
     <w:p>
       <w:pPr>
-        <w:spacing w:before="0" w:after="40"/>
+        <w:spacing w:before="0" w:after="50"/>
+        <w:pBdr>
+          <w:bottom w:val="single" w:sz="12" w:space="2" w:color="0F172A"/>
+        </w:pBdr>
       </w:pPr>
       <w:r>
+        <w:rPr>
+          <w:color w:val="334155"/>
+          <w:sz w:val="18"/>
+        </w:rPr>
         <w:t xml:space="preserve">Phone: +91 8149135849  •  Email: arpitjaiswal071@gmail.com  •  Location: PAN India  •  </w:t>
       </w:r>
       <w:hyperlink r:id="rId9">
@@ -58,11 +73,17 @@
             <w:color w:val="1D4ED8"/>
             <w:u w:val="single"/>
             <w:b/>
+            <w:sz w:val="18"/>
+            <w:szCs w:val="18"/>
           </w:rPr>
-          <w:t>Portfolio</w:t>
+          <w:t xml:space="preserve">Portfolio</w:t>
         </w:r>
       </w:hyperlink>
       <w:r>
+        <w:rPr>
+          <w:color w:val="94A3B8"/>
+          <w:sz w:val="18"/>
+        </w:rPr>
         <w:t xml:space="preserve">  |  </w:t>
       </w:r>
       <w:hyperlink r:id="rId10">
@@ -72,11 +93,17 @@
             <w:color w:val="1D4ED8"/>
             <w:u w:val="single"/>
             <w:b/>
+            <w:sz w:val="18"/>
+            <w:szCs w:val="18"/>
           </w:rPr>
-          <w:t>LinkedIn</w:t>
+          <w:t xml:space="preserve">LinkedIn</w:t>
         </w:r>
       </w:hyperlink>
       <w:r>
+        <w:rPr>
+          <w:color w:val="94A3B8"/>
+          <w:sz w:val="18"/>
+        </w:rPr>
         <w:t xml:space="preserve">  |  </w:t>
       </w:r>
       <w:hyperlink r:id="rId11">
@@ -86,11 +113,17 @@
             <w:color w:val="1D4ED8"/>
             <w:u w:val="single"/>
             <w:b/>
+            <w:sz w:val="18"/>
+            <w:szCs w:val="18"/>
           </w:rPr>
-          <w:t>GitLab</w:t>
+          <w:t xml:space="preserve">GitLab</w:t>
         </w:r>
       </w:hyperlink>
       <w:r>
+        <w:rPr>
+          <w:color w:val="94A3B8"/>
+          <w:sz w:val="18"/>
+        </w:rPr>
         <w:t xml:space="preserve">  |  </w:t>
       </w:r>
       <w:hyperlink r:id="rId12">
@@ -100,28 +133,25 @@
             <w:color w:val="047857"/>
             <w:u w:val="single"/>
             <w:b/>
+            <w:sz w:val="18"/>
+            <w:szCs w:val="18"/>
           </w:rPr>
-          <w:t>Playable Demos</w:t>
+          <w:t xml:space="preserve">Unity Playable Demo</w:t>
         </w:r>
       </w:hyperlink>
     </w:p>
     <w:p>
       <w:pPr>
-        <w:spacing w:before="0" w:after="40"/>
+        <w:spacing w:before="50" w:after="30"/>
         <w:pBdr>
-          <w:bottom w:val="single" w:sz="14" w:space="1" w:color="0F172A"/>
+          <w:bottom w:val="single" w:sz="6" w:space="1" w:color="CBD5E1"/>
         </w:pBdr>
-      </w:pPr>
-    </w:p>
-    <w:p>
-      <w:pPr>
-        <w:spacing w:before="20" w:after="20"/>
       </w:pPr>
       <w:r>
         <w:rPr>
           <w:b/>
           <w:color w:val="0F172A"/>
-          <w:sz w:val="20"/>
+          <w:sz w:val="19"/>
         </w:rPr>
         <w:t>EXECUTIVE PROFILE</w:t>
       </w:r>
@@ -129,19 +159,21 @@
     <w:p>
       <w:pPr>
         <w:pStyle w:val="ListBullet"/>
-        <w:spacing w:before="0" w:after="10"/>
+        <w:spacing w:before="0" w:after="20" w:line="245" w:lineRule="auto"/>
+        <w:ind w:left="259" w:hanging="202"/>
       </w:pPr>
       <w:r>
         <w:rPr>
           <w:b/>
           <w:color w:val="0F172A"/>
-          <w:sz w:val="21"/>
+          <w:sz w:val="18"/>
         </w:rPr>
         <w:t xml:space="preserve">Core Identity &amp; Experience: </w:t>
       </w:r>
       <w:r>
         <w:rPr>
-          <w:sz w:val="21"/>
+          <w:color w:val="334155"/>
+          <w:sz w:val="18"/>
         </w:rPr>
         <w:t>Gameplay &amp; Systems Engineer with 3.5+ years of professional studio experience developing high-performance mobile titles in Unity (C#), with 3 live commercial games published on Google Play Store.</w:t>
       </w:r>
@@ -149,19 +181,21 @@
     <w:p>
       <w:pPr>
         <w:pStyle w:val="ListBullet"/>
-        <w:spacing w:before="0" w:after="10"/>
+        <w:spacing w:before="0" w:after="20" w:line="245" w:lineRule="auto"/>
+        <w:ind w:left="259" w:hanging="202"/>
       </w:pPr>
       <w:r>
         <w:rPr>
           <w:b/>
           <w:color w:val="0F172A"/>
-          <w:sz w:val="21"/>
+          <w:sz w:val="18"/>
         </w:rPr>
         <w:t xml:space="preserve">Engineered Subsystems: </w:t>
       </w:r>
       <w:r>
         <w:rPr>
-          <w:sz w:val="21"/>
+          <w:color w:val="334155"/>
+          <w:sz w:val="18"/>
         </w:rPr>
         <w:t>Production specialist across modular game subsystems—including procedural puzzle generators, native Android/iOS bridge pipelines, deterministic logic solvers, and non-blocking OTA level sync maintaining stable 60 FPS.</w:t>
       </w:r>
@@ -169,19 +203,21 @@
     <w:p>
       <w:pPr>
         <w:pStyle w:val="ListBullet"/>
-        <w:spacing w:before="0" w:after="10"/>
+        <w:spacing w:before="0" w:after="20" w:line="245" w:lineRule="auto"/>
+        <w:ind w:left="259" w:hanging="202"/>
       </w:pPr>
       <w:r>
         <w:rPr>
           <w:b/>
           <w:color w:val="0F172A"/>
-          <w:sz w:val="21"/>
+          <w:sz w:val="18"/>
         </w:rPr>
         <w:t xml:space="preserve">AI-Augmented Engineering (Claude &amp; ChatGPT/Codex): </w:t>
       </w:r>
       <w:r>
         <w:rPr>
-          <w:sz w:val="21"/>
+          <w:color w:val="334155"/>
+          <w:sz w:val="18"/>
         </w:rPr>
         <w:t>Advanced workflow proficiency utilizing Claude 3.5/3.7, ChatGPT, and OpenAI Codex for accelerated systems architecture, algorithmic verification, rapid shader prototyping, and automated editor tooling.</w:t>
       </w:r>
@@ -189,32 +225,37 @@
     <w:p>
       <w:pPr>
         <w:pStyle w:val="ListBullet"/>
-        <w:spacing w:before="0" w:after="10"/>
+        <w:spacing w:before="0" w:after="20" w:line="245" w:lineRule="auto"/>
+        <w:ind w:left="259" w:hanging="202"/>
       </w:pPr>
       <w:r>
         <w:rPr>
           <w:b/>
           <w:color w:val="0F172A"/>
-          <w:sz w:val="21"/>
+          <w:sz w:val="18"/>
         </w:rPr>
         <w:t xml:space="preserve">Forward Vision &amp; Growth: </w:t>
       </w:r>
       <w:r>
         <w:rPr>
-          <w:sz w:val="21"/>
+          <w:color w:val="334155"/>
+          <w:sz w:val="18"/>
         </w:rPr>
         <w:t>Committed to architecting scalable, data-driven game loops, mastering next-gen multiplayer frameworks, and driving technical gameplay excellence in collaborative game studios.</w:t>
       </w:r>
     </w:p>
     <w:p>
       <w:pPr>
-        <w:spacing w:before="20" w:after="20"/>
+        <w:spacing w:before="60" w:after="40"/>
+        <w:pBdr>
+          <w:bottom w:val="single" w:sz="6" w:space="1" w:color="CBD5E1"/>
+        </w:pBdr>
       </w:pPr>
       <w:r>
         <w:rPr>
           <w:b/>
           <w:color w:val="0F172A"/>
-          <w:sz w:val="20"/>
+          <w:sz w:val="19"/>
         </w:rPr>
         <w:t>PRODUCTION TRACK RECORD (KPIS)</w:t>
       </w:r>
@@ -227,16 +268,19 @@
         <w:tblLook w:firstColumn="1" w:firstRow="1" w:lastColumn="0" w:lastRow="0" w:noHBand="0" w:noVBand="1" w:val="04A0"/>
       </w:tblPr>
       <w:tblGrid>
-        <w:gridCol w:w="5472"/>
-        <w:gridCol w:w="5472"/>
+        <w:gridCol w:w="6768"/>
+        <w:gridCol w:w="4262"/>
       </w:tblGrid>
       <w:tr>
+        <w:trPr>
+          <w:cantSplit/>
+        </w:trPr>
         <w:tc>
           <w:tcPr>
-            <w:tcW w:type="dxa" w:w="5400"/>
+            <w:tcW w:w="6768" w:type="dxa"/>
             <w:tcMar>
-              <w:top w:w="25" w:type="dxa"/>
-              <w:bottom w:w="25" w:type="dxa"/>
+              <w:top w:w="22" w:type="dxa"/>
+              <w:bottom w:w="22" w:type="dxa"/>
               <w:left w:w="70" w:type="dxa"/>
               <w:right w:w="70" w:type="dxa"/>
             </w:tcMar>
@@ -250,13 +294,13 @@
           </w:tcPr>
           <w:p>
             <w:pPr>
-              <w:spacing w:before="0" w:after="10"/>
+              <w:spacing w:before="0" w:after="20"/>
             </w:pPr>
             <w:r>
               <w:rPr>
                 <w:b/>
                 <w:color w:val="0F172A"/>
-                <w:sz w:val="23"/>
+                <w:sz w:val="20"/>
               </w:rPr>
               <w:t xml:space="preserve">3.5+ Years  </w:t>
             </w:r>
@@ -264,83 +308,91 @@
               <w:rPr>
                 <w:b/>
                 <w:color w:val="64748B"/>
-                <w:sz w:val="18"/>
+                <w:sz w:val="17"/>
               </w:rPr>
               <w:t>STUDIO EXPERIENCE</w:t>
             </w:r>
           </w:p>
           <w:p>
             <w:pPr>
-              <w:spacing w:before="0" w:after="0"/>
+              <w:spacing w:before="0" w:after="10"/>
             </w:pPr>
             <w:r>
               <w:rPr>
                 <w:b/>
+                <w:sz w:val="17"/>
               </w:rPr>
               <w:t xml:space="preserve">• </w:t>
             </w:r>
             <w:r>
               <w:rPr>
                 <w:b/>
-                <w:sz w:val="21"/>
+                <w:color w:val="0F172A"/>
+                <w:sz w:val="17"/>
               </w:rPr>
-              <w:t>Vasundhara Game Studio, Surat, GJ</w:t>
+              <w:t>Vasundhara Game Studio, Surat (2yr)</w:t>
             </w:r>
             <w:r>
               <w:rPr>
                 <w:b/>
                 <w:color w:val="1D4ED8"/>
-                <w:sz w:val="19"/>
+                <w:sz w:val="17"/>
               </w:rPr>
-              <w:t xml:space="preserve"> (Dec 2025 – Current)</w:t>
+              <w:t xml:space="preserve"> (Dec 2024 – Jan 2025 &amp;&amp; Dec 2025 – Current)</w:t>
             </w:r>
           </w:p>
           <w:p>
             <w:pPr>
-              <w:spacing w:before="0" w:after="0"/>
+              <w:spacing w:before="0" w:after="10"/>
             </w:pPr>
             <w:r>
               <w:rPr>
                 <w:b/>
+                <w:sz w:val="17"/>
               </w:rPr>
               <w:t xml:space="preserve">• </w:t>
             </w:r>
             <w:r>
               <w:rPr>
                 <w:b/>
-                <w:sz w:val="21"/>
+                <w:color w:val="0F172A"/>
+                <w:sz w:val="17"/>
               </w:rPr>
-              <w:t>StudioKrew, Delhi (Remote)</w:t>
+              <w:t>StudioKrew, Delhi (3m)</w:t>
             </w:r>
             <w:r>
               <w:rPr>
+                <w:b w:val="0"/>
                 <w:color w:val="64748B"/>
-                <w:sz w:val="19"/>
+                <w:sz w:val="17"/>
               </w:rPr>
               <w:t xml:space="preserve"> (Mar 2024 – May 2024)</w:t>
             </w:r>
           </w:p>
           <w:p>
             <w:pPr>
-              <w:spacing w:before="0" w:after="0"/>
+              <w:spacing w:before="0" w:after="10"/>
             </w:pPr>
             <w:r>
               <w:rPr>
                 <w:b/>
+                <w:sz w:val="17"/>
               </w:rPr>
               <w:t xml:space="preserve">• </w:t>
             </w:r>
             <w:r>
               <w:rPr>
                 <w:b/>
-                <w:sz w:val="21"/>
+                <w:color w:val="0F172A"/>
+                <w:sz w:val="17"/>
               </w:rPr>
-              <w:t>Appzia, Pune</w:t>
+              <w:t>Appzia, Pune (1yr)</w:t>
             </w:r>
             <w:r>
               <w:rPr>
+                <w:b w:val="0"/>
                 <w:color w:val="64748B"/>
-                <w:sz w:val="19"/>
+                <w:sz w:val="17"/>
               </w:rPr>
               <w:t xml:space="preserve"> (June 2024 – July 2025)</w:t>
             </w:r>
@@ -348,10 +400,10 @@
         </w:tc>
         <w:tc>
           <w:tcPr>
-            <w:tcW w:type="dxa" w:w="5400"/>
+            <w:tcW w:w="4262" w:type="dxa"/>
             <w:tcMar>
-              <w:top w:w="25" w:type="dxa"/>
-              <w:bottom w:w="25" w:type="dxa"/>
+              <w:top w:w="22" w:type="dxa"/>
+              <w:bottom w:w="22" w:type="dxa"/>
               <w:left w:w="70" w:type="dxa"/>
               <w:right w:w="70" w:type="dxa"/>
             </w:tcMar>
@@ -365,13 +417,13 @@
           </w:tcPr>
           <w:p>
             <w:pPr>
-              <w:spacing w:before="0" w:after="10"/>
+              <w:spacing w:before="0" w:after="20"/>
             </w:pPr>
             <w:r>
               <w:rPr>
                 <w:b/>
                 <w:color w:val="1D4ED8"/>
-                <w:sz w:val="23"/>
+                <w:sz w:val="20"/>
               </w:rPr>
               <w:t xml:space="preserve">3 Shipped Titles  </w:t>
             </w:r>
@@ -379,18 +431,19 @@
               <w:rPr>
                 <w:b/>
                 <w:color w:val="3B82F6"/>
-                <w:sz w:val="18"/>
+                <w:sz w:val="17"/>
               </w:rPr>
               <w:t>GOOGLE PLAY COMMERCIAL</w:t>
             </w:r>
           </w:p>
           <w:p>
             <w:pPr>
-              <w:spacing w:before="0" w:after="0"/>
+              <w:spacing w:before="0" w:after="10"/>
             </w:pPr>
             <w:r>
               <w:rPr>
                 <w:b/>
+                <w:sz w:val="17"/>
               </w:rPr>
               <w:t xml:space="preserve">• </w:t>
             </w:r>
@@ -398,7 +451,7 @@
               <w:rPr>
                 <w:b/>
                 <w:color w:val="1E3A8A"/>
-                <w:sz w:val="21"/>
+                <w:sz w:val="17"/>
               </w:rPr>
               <w:t xml:space="preserve">Calm Jigsaw  </w:t>
             </w:r>
@@ -409,19 +462,21 @@
                   <w:color w:val="1D4ED8"/>
                   <w:u w:val="single"/>
                   <w:b/>
-                  <w:sz w:val="19"/>
+                  <w:sz w:val="17"/>
+                  <w:szCs w:val="17"/>
                 </w:rPr>
-                <w:t>[Store ↗]</w:t>
+                <w:t xml:space="preserve">[Store ↗]</w:t>
               </w:r>
             </w:hyperlink>
           </w:p>
           <w:p>
             <w:pPr>
-              <w:spacing w:before="0" w:after="0"/>
+              <w:spacing w:before="0" w:after="10"/>
             </w:pPr>
             <w:r>
               <w:rPr>
                 <w:b/>
+                <w:sz w:val="17"/>
               </w:rPr>
               <w:t xml:space="preserve">• </w:t>
             </w:r>
@@ -429,7 +484,7 @@
               <w:rPr>
                 <w:b/>
                 <w:color w:val="1E3A8A"/>
-                <w:sz w:val="21"/>
+                <w:sz w:val="17"/>
               </w:rPr>
               <w:t xml:space="preserve">MeowSweeper  </w:t>
             </w:r>
@@ -440,19 +495,21 @@
                   <w:color w:val="1D4ED8"/>
                   <w:u w:val="single"/>
                   <w:b/>
-                  <w:sz w:val="19"/>
+                  <w:sz w:val="17"/>
+                  <w:szCs w:val="17"/>
                 </w:rPr>
-                <w:t>[Store ↗]</w:t>
+                <w:t xml:space="preserve">[Store ↗]</w:t>
               </w:r>
             </w:hyperlink>
           </w:p>
           <w:p>
             <w:pPr>
-              <w:spacing w:before="0" w:after="0"/>
+              <w:spacing w:before="0" w:after="10"/>
             </w:pPr>
             <w:r>
               <w:rPr>
                 <w:b/>
+                <w:sz w:val="17"/>
               </w:rPr>
               <w:t xml:space="preserve">• </w:t>
             </w:r>
@@ -460,7 +517,7 @@
               <w:rPr>
                 <w:b/>
                 <w:color w:val="1E3A8A"/>
-                <w:sz w:val="21"/>
+                <w:sz w:val="17"/>
               </w:rPr>
               <w:t xml:space="preserve">Calm Solitaire  </w:t>
             </w:r>
@@ -471,21 +528,26 @@
                   <w:color w:val="1D4ED8"/>
                   <w:u w:val="single"/>
                   <w:b/>
-                  <w:sz w:val="19"/>
+                  <w:sz w:val="17"/>
+                  <w:szCs w:val="17"/>
                 </w:rPr>
-                <w:t>[Store ↗]</w:t>
+                <w:t xml:space="preserve">[Store ↗]</w:t>
               </w:r>
             </w:hyperlink>
           </w:p>
         </w:tc>
       </w:tr>
       <w:tr>
+        <w:trPr>
+          <w:cantSplit/>
+        </w:trPr>
         <w:tc>
           <w:tcPr>
-            <w:tcW w:type="dxa" w:w="5400"/>
+            <w:tcW w:w="11030" w:type="dxa"/>
+            <w:gridSpan w:val="2"/>
             <w:tcMar>
-              <w:top w:w="25" w:type="dxa"/>
-              <w:bottom w:w="25" w:type="dxa"/>
+              <w:top w:w="20" w:type="dxa"/>
+              <w:bottom w:w="20" w:type="dxa"/>
               <w:left w:w="70" w:type="dxa"/>
               <w:right w:w="70" w:type="dxa"/>
             </w:tcMar>
@@ -499,23 +561,15 @@
           </w:tcPr>
           <w:p>
             <w:pPr>
-              <w:spacing w:before="0" w:after="10"/>
+              <w:spacing w:before="0" w:after="20"/>
             </w:pPr>
             <w:r>
               <w:rPr>
                 <w:b/>
                 <w:color w:val="065F46"/>
-                <w:sz w:val="22"/>
+                <w:sz w:val="19"/>
               </w:rPr>
-              <w:t xml:space="preserve">Engineered Subsystems  </w:t>
-            </w:r>
-            <w:r>
-              <w:rPr>
-                <w:b/>
-                <w:color w:val="10B981"/>
-                <w:sz w:val="18"/>
-              </w:rPr>
-              <w:t xml:space="preserve">PRODUCTION ARCHITECTURE  </w:t>
+              <w:t xml:space="preserve">Engineered Subsystems   </w:t>
             </w:r>
             <w:hyperlink r:id="rId12">
               <w:r>
@@ -524,41 +578,80 @@
                   <w:color w:val="047857"/>
                   <w:u w:val="single"/>
                   <w:b/>
-                  <w:sz w:val="18"/>
+                  <w:sz w:val="17"/>
+                  <w:szCs w:val="17"/>
                 </w:rPr>
-                <w:t>[Demo ↗]</w:t>
+                <w:t xml:space="preserve">[Unity Playable Demo ↗]</w:t>
               </w:r>
             </w:hyperlink>
           </w:p>
           <w:p>
             <w:pPr>
+              <w:tabs>
+                <w:tab w:pos="2088" w:val="left"/>
+                <w:tab w:pos="4435" w:val="left"/>
+                <w:tab w:pos="6653" w:val="left"/>
+                <w:tab w:pos="8640" w:val="left"/>
+              </w:tabs>
               <w:spacing w:before="0" w:after="10"/>
             </w:pPr>
             <w:r>
               <w:rPr>
-                <w:sz w:val="19"/>
+                <w:b/>
+                <w:color w:val="064E3B"/>
+                <w:sz w:val="17"/>
               </w:rPr>
-              <w:t>• Procedural Jigsaw   • Native Image Bridge   • Level Sync OTA</w:t>
+              <w:t>• Procedural Jigsaw</w:t>
+              <w:tab/>
+              <w:t>• Jigsaw Shader Mask</w:t>
+              <w:tab/>
+              <w:t>• Native Image Bridge</w:t>
+              <w:tab/>
+              <w:t>• Level Sync (OTA)</w:t>
+              <w:tab/>
+              <w:t>• Live-Ops Backend</w:t>
             </w:r>
           </w:p>
           <w:p>
             <w:pPr>
+              <w:tabs>
+                <w:tab w:pos="2088" w:val="left"/>
+                <w:tab w:pos="4435" w:val="left"/>
+                <w:tab w:pos="6653" w:val="left"/>
+                <w:tab w:pos="8640" w:val="left"/>
+              </w:tabs>
               <w:spacing w:before="0" w:after="0"/>
             </w:pPr>
             <w:r>
               <w:rPr>
-                <w:sz w:val="19"/>
+                <w:b/>
+                <w:color w:val="064E3B"/>
+                <w:sz w:val="17"/>
               </w:rPr>
-              <w:t>• Offline Leaderboard • IAP Currency State   • Argos Localization</w:t>
+              <w:t>• Offline Leaderboard</w:t>
+              <w:tab/>
+              <w:t>• IAP Currency State</w:t>
+              <w:tab/>
+              <w:t>• Argos Localization</w:t>
+              <w:tab/>
+              <w:t>• Asset Organizer Tool</w:t>
+              <w:tab/>
+              <w:t>• Arrow Strike</w:t>
             </w:r>
           </w:p>
         </w:tc>
+      </w:tr>
+      <w:tr>
+        <w:trPr>
+          <w:cantSplit/>
+        </w:trPr>
         <w:tc>
           <w:tcPr>
-            <w:tcW w:type="dxa" w:w="5400"/>
+            <w:tcW w:w="11030" w:type="dxa"/>
+            <w:gridSpan w:val="2"/>
             <w:tcMar>
-              <w:top w:w="25" w:type="dxa"/>
-              <w:bottom w:w="25" w:type="dxa"/>
+              <w:top w:w="20" w:type="dxa"/>
+              <w:bottom w:w="20" w:type="dxa"/>
               <w:left w:w="70" w:type="dxa"/>
               <w:right w:w="70" w:type="dxa"/>
             </w:tcMar>
@@ -572,23 +665,15 @@
           </w:tcPr>
           <w:p>
             <w:pPr>
-              <w:spacing w:before="0" w:after="10"/>
+              <w:spacing w:before="0" w:after="20"/>
             </w:pPr>
             <w:r>
               <w:rPr>
                 <w:b/>
                 <w:color w:val="6B21A8"/>
-                <w:sz w:val="22"/>
+                <w:sz w:val="19"/>
               </w:rPr>
-              <w:t xml:space="preserve">Gameplay Prototypes  </w:t>
-            </w:r>
-            <w:r>
-              <w:rPr>
-                <w:b/>
-                <w:color w:val="9333EA"/>
-                <w:sz w:val="18"/>
-              </w:rPr>
-              <w:t xml:space="preserve">R&amp;D &amp; SOURCE REPOS  </w:t>
+              <w:t xml:space="preserve">Novice Prototypes   </w:t>
             </w:r>
             <w:hyperlink r:id="rId16">
               <w:r>
@@ -597,31 +682,36 @@
                   <w:color w:val="7E22CE"/>
                   <w:u w:val="single"/>
                   <w:b/>
-                  <w:sz w:val="18"/>
+                  <w:sz w:val="17"/>
+                  <w:szCs w:val="17"/>
                 </w:rPr>
-                <w:t>[Demos ↗]</w:t>
+                <w:t xml:space="preserve">[GitHub Repo ↗]</w:t>
+              </w:r>
+            </w:hyperlink>
+            <w:r>
+              <w:rPr>
+                <w:sz w:val="17"/>
+              </w:rPr>
+              <w:t xml:space="preserve">   </w:t>
+            </w:r>
+            <w:hyperlink r:id="rId17">
+              <w:r>
+                <w:rPr>
+                  <w:rFonts w:ascii="Calibri" w:hAnsi="Calibri"/>
+                  <w:color w:val="7E22CE"/>
+                  <w:u w:val="single"/>
+                  <w:b/>
+                  <w:sz w:val="17"/>
+                  <w:szCs w:val="17"/>
+                </w:rPr>
+                <w:t xml:space="preserve">[Demos ↗]</w:t>
               </w:r>
             </w:hyperlink>
           </w:p>
           <w:p>
             <w:pPr>
-              <w:spacing w:before="0" w:after="10"/>
+              <w:spacing w:before="0" w:after="0"/>
             </w:pPr>
-            <w:hyperlink r:id="rId17">
-              <w:r>
-                <w:rPr>
-                  <w:rFonts w:ascii="Calibri" w:hAnsi="Calibri"/>
-                  <w:color w:val="6B21A8"/>
-                  <w:u w:val="single"/>
-                  <w:b/>
-                  <w:sz w:val="19"/>
-                </w:rPr>
-                <w:t>This Is Blast ↗</w:t>
-              </w:r>
-            </w:hyperlink>
-            <w:r>
-              <w:t xml:space="preserve">  •  </w:t>
-            </w:r>
             <w:hyperlink r:id="rId18">
               <w:r>
                 <w:rPr>
@@ -629,13 +719,18 @@
                   <w:color w:val="6B21A8"/>
                   <w:u w:val="single"/>
                   <w:b/>
-                  <w:sz w:val="19"/>
+                  <w:sz w:val="17"/>
+                  <w:szCs w:val="17"/>
                 </w:rPr>
-                <w:t>Arrow Strike ↗</w:t>
+                <w:t xml:space="preserve">This Is Blast ↗</w:t>
               </w:r>
             </w:hyperlink>
             <w:r>
-              <w:t xml:space="preserve">  •  </w:t>
+              <w:rPr>
+                <w:color w:val="9333EA"/>
+                <w:sz w:val="17"/>
+              </w:rPr>
+              <w:t xml:space="preserve">   •   </w:t>
             </w:r>
             <w:hyperlink r:id="rId19">
               <w:r>
@@ -644,16 +739,19 @@
                   <w:color w:val="6B21A8"/>
                   <w:u w:val="single"/>
                   <w:b/>
-                  <w:sz w:val="19"/>
+                  <w:sz w:val="17"/>
+                  <w:szCs w:val="17"/>
                 </w:rPr>
-                <w:t>Tank Battle 3D ↗</w:t>
+                <w:t xml:space="preserve">Arrow Strike ↗</w:t>
               </w:r>
             </w:hyperlink>
-          </w:p>
-          <w:p>
-            <w:pPr>
-              <w:spacing w:before="0" w:after="0"/>
-            </w:pPr>
+            <w:r>
+              <w:rPr>
+                <w:color w:val="9333EA"/>
+                <w:sz w:val="17"/>
+              </w:rPr>
+              <w:t xml:space="preserve">   •   </w:t>
+            </w:r>
             <w:hyperlink r:id="rId20">
               <w:r>
                 <w:rPr>
@@ -661,13 +759,18 @@
                   <w:color w:val="6B21A8"/>
                   <w:u w:val="single"/>
                   <w:b/>
-                  <w:sz w:val="19"/>
+                  <w:sz w:val="17"/>
+                  <w:szCs w:val="17"/>
                 </w:rPr>
-                <w:t>Bullet Chess ↗</w:t>
+                <w:t xml:space="preserve">Tank Battle 3D ↗</w:t>
               </w:r>
             </w:hyperlink>
             <w:r>
-              <w:t xml:space="preserve">  •  </w:t>
+              <w:rPr>
+                <w:color w:val="9333EA"/>
+                <w:sz w:val="17"/>
+              </w:rPr>
+              <w:t xml:space="preserve">   •   </w:t>
             </w:r>
             <w:hyperlink r:id="rId21">
               <w:r>
@@ -676,24 +779,50 @@
                   <w:color w:val="6B21A8"/>
                   <w:u w:val="single"/>
                   <w:b/>
-                  <w:sz w:val="19"/>
+                  <w:sz w:val="17"/>
+                  <w:szCs w:val="17"/>
                 </w:rPr>
-                <w:t>Tycoon RTS ↗</w:t>
+                <w:t xml:space="preserve">Bullet Chess ↗</w:t>
               </w:r>
             </w:hyperlink>
             <w:r>
-              <w:t xml:space="preserve">  •  </w:t>
+              <w:rPr>
+                <w:color w:val="9333EA"/>
+                <w:sz w:val="17"/>
+              </w:rPr>
+              <w:t xml:space="preserve">   •   </w:t>
             </w:r>
-            <w:hyperlink r:id="rId16">
+            <w:hyperlink r:id="rId22">
               <w:r>
                 <w:rPr>
                   <w:rFonts w:ascii="Calibri" w:hAnsi="Calibri"/>
                   <w:color w:val="6B21A8"/>
                   <w:u w:val="single"/>
                   <w:b/>
-                  <w:sz w:val="19"/>
+                  <w:sz w:val="17"/>
+                  <w:szCs w:val="17"/>
                 </w:rPr>
-                <w:t>Trivologist ↗</w:t>
+                <w:t xml:space="preserve">Tycoon RTS ↗</w:t>
+              </w:r>
+            </w:hyperlink>
+            <w:r>
+              <w:rPr>
+                <w:color w:val="9333EA"/>
+                <w:sz w:val="17"/>
+              </w:rPr>
+              <w:t xml:space="preserve">   •   </w:t>
+            </w:r>
+            <w:hyperlink r:id="rId17">
+              <w:r>
+                <w:rPr>
+                  <w:rFonts w:ascii="Calibri" w:hAnsi="Calibri"/>
+                  <w:color w:val="6B21A8"/>
+                  <w:u w:val="single"/>
+                  <w:b/>
+                  <w:sz w:val="17"/>
+                  <w:szCs w:val="17"/>
+                </w:rPr>
+                <w:t xml:space="preserve">Trivologist ↗</w:t>
               </w:r>
             </w:hyperlink>
           </w:p>
@@ -702,7 +831,7 @@
     </w:tbl>
     <w:p>
       <w:pPr>
-        <w:spacing w:before="40" w:after="20"/>
+        <w:spacing w:before="70" w:after="30"/>
         <w:pBdr>
           <w:bottom w:val="single" w:sz="6" w:space="1" w:color="CBD5E1"/>
         </w:pBdr>
@@ -711,20 +840,23 @@
         <w:rPr>
           <w:b/>
           <w:color w:val="0F172A"/>
-          <w:sz w:val="20"/>
+          <w:sz w:val="19"/>
         </w:rPr>
         <w:t>PROFESSIONAL STUDIO EXPERIENCE</w:t>
       </w:r>
     </w:p>
     <w:p>
       <w:pPr>
-        <w:spacing w:before="30" w:after="10"/>
+        <w:tabs>
+          <w:tab w:pos="11030" w:val="right"/>
+        </w:tabs>
+        <w:spacing w:before="50" w:after="10"/>
       </w:pPr>
       <w:r>
         <w:rPr>
           <w:b/>
           <w:color w:val="0F172A"/>
-          <w:sz w:val="24"/>
+          <w:sz w:val="20"/>
         </w:rPr>
         <w:t>Vasundhara Game Studio</w:t>
       </w:r>
@@ -732,7 +864,7 @@
         <w:rPr>
           <w:b/>
           <w:color w:val="334155"/>
-          <w:sz w:val="22"/>
+          <w:sz w:val="18"/>
         </w:rPr>
         <w:t xml:space="preserve">  |  AI Product Developer (Specialization in Unity)</w:t>
       </w:r>
@@ -740,26 +872,30 @@
         <w:rPr>
           <w:b/>
           <w:color w:val="1D4ED8"/>
-          <w:sz w:val="20"/>
+          <w:sz w:val="17"/>
         </w:rPr>
-        <w:t xml:space="preserve">   Surat, GJ  •  Dec 2025 – Current</w:t>
+        <w:tab/>
+        <w:t>Surat, GJ  •  Dec 2024 – Jan 2025 &amp;&amp; Dec 2025 – Current</w:t>
       </w:r>
     </w:p>
     <w:p>
       <w:pPr>
         <w:pStyle w:val="ListBullet"/>
-        <w:spacing w:before="0" w:after="10"/>
+        <w:spacing w:before="0" w:after="16" w:line="245" w:lineRule="auto"/>
+        <w:ind w:left="259" w:hanging="202"/>
       </w:pPr>
       <w:r>
         <w:rPr>
           <w:b/>
-          <w:sz w:val="20"/>
+          <w:color w:val="0F172A"/>
+          <w:sz w:val="18"/>
         </w:rPr>
         <w:t xml:space="preserve">Procedural Jigsaw Engine (Calm Jigsaw): </w:t>
       </w:r>
       <w:r>
         <w:rPr>
-          <w:sz w:val="20"/>
+          <w:color w:val="334155"/>
+          <w:sz w:val="18"/>
         </w:rPr>
         <w:t>Architected algorithmic N×N puzzle generator using 9 mathematical shape signatures, eliminating static art dependencies with dynamic UV quad generation.</w:t>
       </w:r>
@@ -767,18 +903,21 @@
     <w:p>
       <w:pPr>
         <w:pStyle w:val="ListBullet"/>
-        <w:spacing w:before="0" w:after="10"/>
+        <w:spacing w:before="0" w:after="16" w:line="245" w:lineRule="auto"/>
+        <w:ind w:left="259" w:hanging="202"/>
       </w:pPr>
       <w:r>
         <w:rPr>
           <w:b/>
-          <w:sz w:val="20"/>
+          <w:color w:val="0F172A"/>
+          <w:sz w:val="18"/>
         </w:rPr>
         <w:t xml:space="preserve">Native Image Bridge &amp; OTA Sync: </w:t>
       </w:r>
       <w:r>
         <w:rPr>
-          <w:sz w:val="20"/>
+          <w:color w:val="334155"/>
+          <w:sz w:val="18"/>
         </w:rPr>
         <w:t>Engineered C# bridge over native Android/iOS APIs for remote image caching, 3-tier downsampling, and non-blocking OTA manifest level delivery.</w:t>
       </w:r>
@@ -786,18 +925,21 @@
     <w:p>
       <w:pPr>
         <w:pStyle w:val="ListBullet"/>
-        <w:spacing w:before="0" w:after="10"/>
+        <w:spacing w:before="0" w:after="16" w:line="245" w:lineRule="auto"/>
+        <w:ind w:left="259" w:hanging="202"/>
       </w:pPr>
       <w:r>
         <w:rPr>
           <w:b/>
-          <w:sz w:val="20"/>
+          <w:color w:val="0F172A"/>
+          <w:sz w:val="18"/>
         </w:rPr>
         <w:t xml:space="preserve">Deterministic Logic (MeowSweeper): </w:t>
       </w:r>
       <w:r>
         <w:rPr>
-          <w:sz w:val="20"/>
+          <w:color w:val="334155"/>
+          <w:sz w:val="18"/>
         </w:rPr>
         <w:t>Implemented backtracking Sudoku solver state machine, interactive cat mechanics, and persistent powerup transaction wallet.</w:t>
       </w:r>
@@ -805,18 +947,21 @@
     <w:p>
       <w:pPr>
         <w:pStyle w:val="ListBullet"/>
-        <w:spacing w:before="0" w:after="10"/>
+        <w:spacing w:before="0" w:after="16" w:line="245" w:lineRule="auto"/>
+        <w:ind w:left="259" w:hanging="202"/>
       </w:pPr>
       <w:r>
         <w:rPr>
           <w:b/>
-          <w:sz w:val="20"/>
+          <w:color w:val="0F172A"/>
+          <w:sz w:val="18"/>
         </w:rPr>
         <w:t xml:space="preserve">Zero-Cost Offline Leaderboard: </w:t>
       </w:r>
       <w:r>
         <w:rPr>
-          <w:sz w:val="20"/>
+          <w:color w:val="334155"/>
+          <w:sz w:val="18"/>
         </w:rPr>
         <w:t>Engineered on-device simulated competitive seasons with bot population generation, dynamic rank tiers, and idempotent reward verification with zero backend costs.</w:t>
       </w:r>
@@ -824,31 +969,37 @@
     <w:p>
       <w:pPr>
         <w:pStyle w:val="ListBullet"/>
-        <w:spacing w:before="0" w:after="10"/>
+        <w:spacing w:before="0" w:after="16" w:line="245" w:lineRule="auto"/>
+        <w:ind w:left="259" w:hanging="202"/>
       </w:pPr>
       <w:r>
         <w:rPr>
           <w:b/>
-          <w:sz w:val="20"/>
+          <w:color w:val="0F172A"/>
+          <w:sz w:val="18"/>
         </w:rPr>
         <w:t xml:space="preserve">Additional Systems &amp; Tooling: </w:t>
       </w:r>
       <w:r>
         <w:rPr>
-          <w:sz w:val="20"/>
+          <w:color w:val="334155"/>
+          <w:sz w:val="18"/>
         </w:rPr>
         <w:t>Developed hybrid mechanics (Calm Solitaire), Apple/Google IAP transaction state, and automated Argos IPC tool for offline multi-language localization.</w:t>
       </w:r>
     </w:p>
     <w:p>
       <w:pPr>
-        <w:spacing w:before="30" w:after="10"/>
+        <w:tabs>
+          <w:tab w:pos="11030" w:val="right"/>
+        </w:tabs>
+        <w:spacing w:before="50" w:after="10"/>
       </w:pPr>
       <w:r>
         <w:rPr>
           <w:b/>
           <w:color w:val="0F172A"/>
-          <w:sz w:val="24"/>
+          <w:sz w:val="20"/>
         </w:rPr>
         <w:t>Appzia</w:t>
       </w:r>
@@ -856,33 +1007,38 @@
         <w:rPr>
           <w:b/>
           <w:color w:val="334155"/>
-          <w:sz w:val="22"/>
+          <w:sz w:val="18"/>
         </w:rPr>
         <w:t xml:space="preserve">  |  Unity3D Systems &amp; Gameplay Developer</w:t>
       </w:r>
       <w:r>
         <w:rPr>
+          <w:b w:val="0"/>
           <w:color w:val="64748B"/>
-          <w:sz w:val="20"/>
+          <w:sz w:val="17"/>
         </w:rPr>
-        <w:t xml:space="preserve">           Pune, India  •  June 2024 – July 2025</w:t>
+        <w:tab/>
+        <w:t>Pune, India  •  June 2024 – July 2025</w:t>
       </w:r>
     </w:p>
     <w:p>
       <w:pPr>
         <w:pStyle w:val="ListBullet"/>
-        <w:spacing w:before="0" w:after="10"/>
+        <w:spacing w:before="0" w:after="16" w:line="245" w:lineRule="auto"/>
+        <w:ind w:left="259" w:hanging="202"/>
       </w:pPr>
       <w:r>
         <w:rPr>
           <w:b/>
-          <w:sz w:val="20"/>
+          <w:color w:val="0F172A"/>
+          <w:sz w:val="18"/>
         </w:rPr>
         <w:t xml:space="preserve">Stockfish AI &amp; Real-Time Chess (Bullet Chess): </w:t>
       </w:r>
       <w:r>
         <w:rPr>
-          <w:sz w:val="20"/>
+          <w:color w:val="334155"/>
+          <w:sz w:val="18"/>
         </w:rPr>
         <w:t>Architected fast-paced multiplayer chess engine integrated with Stockfish API for live move evaluation, client-side board validation, low-latency clock synchronization, and dynamic tournament brackets.</w:t>
       </w:r>
@@ -890,31 +1046,37 @@
     <w:p>
       <w:pPr>
         <w:pStyle w:val="ListBullet"/>
-        <w:spacing w:before="0" w:after="10"/>
+        <w:spacing w:before="0" w:after="16" w:line="245" w:lineRule="auto"/>
+        <w:ind w:left="259" w:hanging="202"/>
       </w:pPr>
       <w:r>
         <w:rPr>
           <w:b/>
-          <w:sz w:val="20"/>
+          <w:color w:val="0F172A"/>
+          <w:sz w:val="18"/>
         </w:rPr>
         <w:t xml:space="preserve">Arcade Simulation &amp; Economy Systems (Pinnacle): </w:t>
       </w:r>
       <w:r>
         <w:rPr>
-          <w:sz w:val="20"/>
+          <w:color w:val="334155"/>
+          <w:sz w:val="18"/>
         </w:rPr>
         <w:t>Led development of Pinnacle gaming simulation replicating physical machines, implementing deterministic state machines, secure Apple/Google In-App Purchases (IAP), and memory pooling locked at 60 FPS.</w:t>
       </w:r>
     </w:p>
     <w:p>
       <w:pPr>
-        <w:spacing w:before="30" w:after="10"/>
+        <w:tabs>
+          <w:tab w:pos="11030" w:val="right"/>
+        </w:tabs>
+        <w:spacing w:before="50" w:after="10"/>
       </w:pPr>
       <w:r>
         <w:rPr>
           <w:b/>
           <w:color w:val="0F172A"/>
-          <w:sz w:val="24"/>
+          <w:sz w:val="20"/>
         </w:rPr>
         <w:t>StudioKrew</w:t>
       </w:r>
@@ -922,33 +1084,38 @@
         <w:rPr>
           <w:b/>
           <w:color w:val="334155"/>
-          <w:sz w:val="22"/>
+          <w:sz w:val="18"/>
         </w:rPr>
         <w:t xml:space="preserve">  |  Unity Game Developer (Remote)</w:t>
       </w:r>
       <w:r>
         <w:rPr>
+          <w:b w:val="0"/>
           <w:color w:val="64748B"/>
-          <w:sz w:val="20"/>
+          <w:sz w:val="17"/>
         </w:rPr>
-        <w:t xml:space="preserve">   Delhi, India (Remote)  •  March 2024 – May 2024</w:t>
+        <w:tab/>
+        <w:t>Delhi, India (Remote)  •  March 2024 – May 2024</w:t>
       </w:r>
     </w:p>
     <w:p>
       <w:pPr>
         <w:pStyle w:val="ListBullet"/>
-        <w:spacing w:before="0" w:after="10"/>
+        <w:spacing w:before="0" w:after="16" w:line="245" w:lineRule="auto"/>
+        <w:ind w:left="259" w:hanging="202"/>
       </w:pPr>
       <w:r>
         <w:rPr>
           <w:b/>
-          <w:sz w:val="20"/>
+          <w:color w:val="0F172A"/>
+          <w:sz w:val="18"/>
         </w:rPr>
         <w:t xml:space="preserve">Solo Card Game Architecture (FreeCell &amp; Solitaire): </w:t>
       </w:r>
       <w:r>
         <w:rPr>
-          <w:sz w:val="20"/>
+          <w:color w:val="334155"/>
+          <w:sz w:val="18"/>
         </w:rPr>
         <w:t>Delivered complete end-to-end development independently, architecting deterministic card stack rules, memento-based undo/redo state history, and responsive touch controls.</w:t>
       </w:r>
@@ -956,18 +1123,21 @@
     <w:p>
       <w:pPr>
         <w:pStyle w:val="ListBullet"/>
-        <w:spacing w:before="0" w:after="10"/>
+        <w:spacing w:before="0" w:after="16" w:line="245" w:lineRule="auto"/>
+        <w:ind w:left="259" w:hanging="202"/>
       </w:pPr>
       <w:r>
         <w:rPr>
           <w:b/>
-          <w:sz w:val="20"/>
+          <w:color w:val="0F172A"/>
+          <w:sz w:val="18"/>
         </w:rPr>
         <w:t xml:space="preserve">Dice Physics &amp; Scoring State Machine (Yahtzee): </w:t>
       </w:r>
       <w:r>
         <w:rPr>
-          <w:sz w:val="20"/>
+          <w:color w:val="334155"/>
+          <w:sz w:val="18"/>
         </w:rPr>
         <w:t>Engineered probabilistic dice-rolling physics, category score validation state machines, and turn-based round flow with fluid particle animations.</w:t>
       </w:r>
@@ -975,26 +1145,28 @@
     <w:p>
       <w:pPr>
         <w:pStyle w:val="ListBullet"/>
-        <w:spacing w:before="0" w:after="10"/>
+        <w:spacing w:before="0" w:after="16" w:line="245" w:lineRule="auto"/>
+        <w:ind w:left="259" w:hanging="202"/>
       </w:pPr>
       <w:r>
         <w:rPr>
           <w:b/>
-          <w:sz w:val="20"/>
+          <w:color w:val="0F172A"/>
+          <w:sz w:val="18"/>
         </w:rPr>
         <w:t xml:space="preserve">Grid Puzzle Engine &amp; Serialization (BrokenTiles): </w:t>
       </w:r>
       <w:r>
         <w:rPr>
-          <w:sz w:val="20"/>
+          <w:color w:val="334155"/>
+          <w:sz w:val="18"/>
         </w:rPr>
         <w:t>Developed reactive grid-matching algorithms with cascading tile clearing, implementing lightweight JSON save serialization for instant session recovery.</w:t>
       </w:r>
     </w:p>
     <w:p>
       <w:pPr>
-        <w:pageBreakBefore/>
-        <w:spacing w:before="0" w:after="20"/>
+        <w:spacing w:before="70" w:after="40"/>
         <w:pBdr>
           <w:bottom w:val="single" w:sz="6" w:space="1" w:color="CBD5E1"/>
         </w:pBdr>
@@ -1002,23 +1174,10 @@
       <w:r>
         <w:rPr>
           <w:b/>
-          <w:color w:val="64748B"/>
-          <w:sz w:val="18"/>
+          <w:color w:val="0F172A"/>
+          <w:sz w:val="19"/>
         </w:rPr>
-        <w:t>ARPIT K. JAISWAL  —  SYSTEMS ARCHITECTURE &amp; TECHNICAL DOSSIER</w:t>
-      </w:r>
-    </w:p>
-    <w:p>
-      <w:pPr>
-        <w:spacing w:before="40" w:after="20"/>
-      </w:pPr>
-      <w:r>
-        <w:rPr>
-          <w:b/>
-          <w:color w:val="0F172A"/>
-          <w:sz w:val="20"/>
-        </w:rPr>
-        <w:t>SHIPPED COMMERCIAL TITLES (GOOGLE PLAY STORE)</w:t>
+        <w:t>TECHNICAL SKILLS &amp; ENGINE STACK</w:t>
       </w:r>
     </w:p>
     <w:tbl>
@@ -1029,26 +1188,29 @@
         <w:tblLook w:firstColumn="1" w:firstRow="1" w:lastColumn="0" w:lastRow="0" w:noHBand="0" w:noVBand="1" w:val="04A0"/>
       </w:tblPr>
       <w:tblGrid>
-        <w:gridCol w:w="3648"/>
-        <w:gridCol w:w="3648"/>
-        <w:gridCol w:w="3648"/>
+        <w:gridCol w:w="3676"/>
+        <w:gridCol w:w="3676"/>
+        <w:gridCol w:w="3676"/>
       </w:tblGrid>
       <w:tr>
+        <w:trPr>
+          <w:cantSplit/>
+        </w:trPr>
         <w:tc>
           <w:tcPr>
-            <w:tcW w:type="dxa" w:w="3600"/>
+            <w:tcW w:w="3676" w:type="dxa"/>
             <w:shd w:fill="F8FAFC"/>
             <w:tcBorders>
               <w:top w:val="single" w:sz="12" w:space="0" w:color="2563EB"/>
-              <w:left w:val="single" w:sz="4" w:space="0" w:color="CBD5E1"/>
-              <w:bottom w:val="single" w:sz="4" w:space="0" w:color="CBD5E1"/>
-              <w:right w:val="single" w:sz="4" w:space="0" w:color="CBD5E1"/>
+              <w:left w:val="single" w:sz="4" w:space="0" w:color="BFDBFE"/>
+              <w:bottom w:val="single" w:sz="4" w:space="0" w:color="BFDBFE"/>
+              <w:right w:val="single" w:sz="4" w:space="0" w:color="BFDBFE"/>
             </w:tcBorders>
             <w:tcMar>
-              <w:top w:w="30" w:type="dxa"/>
-              <w:bottom w:w="30" w:type="dxa"/>
-              <w:left w:w="70" w:type="dxa"/>
-              <w:right w:w="70" w:type="dxa"/>
+              <w:top w:w="16" w:type="dxa"/>
+              <w:bottom w:w="16" w:type="dxa"/>
+              <w:left w:w="60" w:type="dxa"/>
+              <w:right w:w="60" w:type="dxa"/>
             </w:tcMar>
           </w:tcPr>
           <w:p>
@@ -1059,67 +1221,39 @@
               <w:rPr>
                 <w:b/>
                 <w:color w:val="0F172A"/>
-                <w:sz w:val="19"/>
+                <w:sz w:val="17"/>
               </w:rPr>
-              <w:t>MeowSweeper</w:t>
-            </w:r>
-            <w:r>
-              <w:t xml:space="preserve">  </w:t>
-            </w:r>
-            <w:hyperlink r:id="rId14">
-              <w:r>
-                <w:rPr>
-                  <w:rFonts w:ascii="Calibri" w:hAnsi="Calibri"/>
-                  <w:color w:val="1D4ED8"/>
-                  <w:u w:val="single"/>
-                  <w:b/>
-                  <w:sz w:val="16"/>
-                </w:rPr>
-                <w:t>[Play Store ↗]</w:t>
-              </w:r>
-            </w:hyperlink>
-          </w:p>
-          <w:p>
-            <w:pPr>
-              <w:spacing w:before="0" w:after="10"/>
-            </w:pPr>
-            <w:r>
-              <w:rPr>
-                <w:b/>
-                <w:color w:val="64748B"/>
-                <w:sz w:val="16"/>
-              </w:rPr>
-              <w:t>Sudoku Brain Puzzle</w:t>
+              <w:t>Core Engine &amp; Languages</w:t>
             </w:r>
           </w:p>
           <w:p>
             <w:pPr>
-              <w:spacing w:before="0" w:after="0"/>
+              <w:spacing w:before="0" w:after="0" w:line="240" w:lineRule="auto"/>
             </w:pPr>
             <w:r>
               <w:rPr>
                 <w:color w:val="334155"/>
-                <w:sz w:val="17"/>
+                <w:sz w:val="16"/>
               </w:rPr>
-              <w:t>Sudoku cat logic puzzle with deterministic solver, simulated offline bot leaderboards, and persistent powerup wallet.</w:t>
+              <w:t>Unity 3D (2020–2023 LTS / Unity 6) • C# (.NET) • HLSL / ShaderLab • Python</w:t>
             </w:r>
           </w:p>
         </w:tc>
         <w:tc>
           <w:tcPr>
-            <w:tcW w:type="dxa" w:w="3600"/>
+            <w:tcW w:w="3676" w:type="dxa"/>
             <w:shd w:fill="F8FAFC"/>
             <w:tcBorders>
-              <w:top w:val="single" w:sz="12" w:space="0" w:color="2563EB"/>
-              <w:left w:val="single" w:sz="4" w:space="0" w:color="CBD5E1"/>
-              <w:bottom w:val="single" w:sz="4" w:space="0" w:color="CBD5E1"/>
-              <w:right w:val="single" w:sz="4" w:space="0" w:color="CBD5E1"/>
+              <w:top w:val="single" w:sz="12" w:space="0" w:color="059669"/>
+              <w:left w:val="single" w:sz="4" w:space="0" w:color="A7F3D0"/>
+              <w:bottom w:val="single" w:sz="4" w:space="0" w:color="A7F3D0"/>
+              <w:right w:val="single" w:sz="4" w:space="0" w:color="A7F3D0"/>
             </w:tcBorders>
             <w:tcMar>
-              <w:top w:w="30" w:type="dxa"/>
-              <w:bottom w:w="30" w:type="dxa"/>
-              <w:left w:w="70" w:type="dxa"/>
-              <w:right w:w="70" w:type="dxa"/>
+              <w:top w:w="16" w:type="dxa"/>
+              <w:bottom w:w="16" w:type="dxa"/>
+              <w:left w:w="60" w:type="dxa"/>
+              <w:right w:w="60" w:type="dxa"/>
             </w:tcMar>
           </w:tcPr>
           <w:p>
@@ -1130,67 +1264,39 @@
               <w:rPr>
                 <w:b/>
                 <w:color w:val="0F172A"/>
-                <w:sz w:val="19"/>
+                <w:sz w:val="17"/>
               </w:rPr>
-              <w:t>Calm Jigsaw</w:t>
-            </w:r>
-            <w:r>
-              <w:t xml:space="preserve">  </w:t>
-            </w:r>
-            <w:hyperlink r:id="rId13">
-              <w:r>
-                <w:rPr>
-                  <w:rFonts w:ascii="Calibri" w:hAnsi="Calibri"/>
-                  <w:color w:val="1D4ED8"/>
-                  <w:u w:val="single"/>
-                  <w:b/>
-                  <w:sz w:val="16"/>
-                </w:rPr>
-                <w:t>[Play Store ↗]</w:t>
-              </w:r>
-            </w:hyperlink>
-          </w:p>
-          <w:p>
-            <w:pPr>
-              <w:spacing w:before="0" w:after="10"/>
-            </w:pPr>
-            <w:r>
-              <w:rPr>
-                <w:b/>
-                <w:color w:val="64748B"/>
-                <w:sz w:val="16"/>
-              </w:rPr>
-              <w:t>Procedural HD Puzzles</w:t>
+              <w:t>Rendering &amp; Optimization</w:t>
             </w:r>
           </w:p>
           <w:p>
             <w:pPr>
-              <w:spacing w:before="0" w:after="0"/>
+              <w:spacing w:before="0" w:after="0" w:line="240" w:lineRule="auto"/>
             </w:pPr>
             <w:r>
               <w:rPr>
                 <w:color w:val="334155"/>
-                <w:sz w:val="17"/>
+                <w:sz w:val="16"/>
               </w:rPr>
-              <w:t>Procedural NxN jigsaw puzzle engine utilizing 9 mathematical shape signatures with non-blocking OTA level sync.</w:t>
+              <w:t>URP • SRP Batcher • GPU Instancing • ASTC Compression • Custom UI Shaders</w:t>
             </w:r>
           </w:p>
         </w:tc>
         <w:tc>
           <w:tcPr>
-            <w:tcW w:type="dxa" w:w="3600"/>
+            <w:tcW w:w="3676" w:type="dxa"/>
             <w:shd w:fill="F8FAFC"/>
             <w:tcBorders>
-              <w:top w:val="single" w:sz="12" w:space="0" w:color="2563EB"/>
-              <w:left w:val="single" w:sz="4" w:space="0" w:color="CBD5E1"/>
-              <w:bottom w:val="single" w:sz="4" w:space="0" w:color="CBD5E1"/>
-              <w:right w:val="single" w:sz="4" w:space="0" w:color="CBD5E1"/>
+              <w:top w:val="single" w:sz="12" w:space="0" w:color="9333EA"/>
+              <w:left w:val="single" w:sz="4" w:space="0" w:color="E9D5FF"/>
+              <w:bottom w:val="single" w:sz="4" w:space="0" w:color="E9D5FF"/>
+              <w:right w:val="single" w:sz="4" w:space="0" w:color="E9D5FF"/>
             </w:tcBorders>
             <w:tcMar>
-              <w:top w:w="30" w:type="dxa"/>
-              <w:bottom w:w="30" w:type="dxa"/>
-              <w:left w:w="70" w:type="dxa"/>
-              <w:right w:w="70" w:type="dxa"/>
+              <w:top w:w="16" w:type="dxa"/>
+              <w:bottom w:w="16" w:type="dxa"/>
+              <w:left w:w="60" w:type="dxa"/>
+              <w:right w:w="60" w:type="dxa"/>
             </w:tcMar>
           </w:tcPr>
           <w:p>
@@ -1201,26 +1307,46 @@
               <w:rPr>
                 <w:b/>
                 <w:color w:val="0F172A"/>
-                <w:sz w:val="19"/>
+                <w:sz w:val="17"/>
               </w:rPr>
-              <w:t>Calm Solitaire</w:t>
+              <w:t>Profiling &amp; Debugging</w:t>
             </w:r>
+          </w:p>
+          <w:p>
+            <w:pPr>
+              <w:spacing w:before="0" w:after="0" w:line="240" w:lineRule="auto"/>
+            </w:pPr>
             <w:r>
-              <w:t xml:space="preserve">  </w:t>
+              <w:rPr>
+                <w:color w:val="334155"/>
+                <w:sz w:val="16"/>
+              </w:rPr>
+              <w:t>Unity Profiler • Memory Profiler • Frame Debugger • RenderDoc • Android Logcat / ADB</w:t>
             </w:r>
-            <w:hyperlink r:id="rId15">
-              <w:r>
-                <w:rPr>
-                  <w:rFonts w:ascii="Calibri" w:hAnsi="Calibri"/>
-                  <w:color w:val="1D4ED8"/>
-                  <w:u w:val="single"/>
-                  <w:b/>
-                  <w:sz w:val="16"/>
-                </w:rPr>
-                <w:t>[Play Store ↗]</w:t>
-              </w:r>
-            </w:hyperlink>
           </w:p>
+        </w:tc>
+      </w:tr>
+      <w:tr>
+        <w:trPr>
+          <w:cantSplit/>
+        </w:trPr>
+        <w:tc>
+          <w:tcPr>
+            <w:tcW w:w="3676" w:type="dxa"/>
+            <w:shd w:fill="F8FAFC"/>
+            <w:tcBorders>
+              <w:top w:val="single" w:sz="12" w:space="0" w:color="4F46E5"/>
+              <w:left w:val="single" w:sz="4" w:space="0" w:color="C7D2FE"/>
+              <w:bottom w:val="single" w:sz="4" w:space="0" w:color="C7D2FE"/>
+              <w:right w:val="single" w:sz="4" w:space="0" w:color="C7D2FE"/>
+            </w:tcBorders>
+            <w:tcMar>
+              <w:top w:w="16" w:type="dxa"/>
+              <w:bottom w:w="16" w:type="dxa"/>
+              <w:left w:w="60" w:type="dxa"/>
+              <w:right w:w="60" w:type="dxa"/>
+            </w:tcMar>
+          </w:tcPr>
           <w:p>
             <w:pPr>
               <w:spacing w:before="0" w:after="10"/>
@@ -1228,22 +1354,108 @@
             <w:r>
               <w:rPr>
                 <w:b/>
-                <w:color w:val="64748B"/>
-                <w:sz w:val="16"/>
+                <w:color w:val="0F172A"/>
+                <w:sz w:val="17"/>
               </w:rPr>
-              <w:t>Jigsaw &amp; Card Hybrid</w:t>
+              <w:t>Platform &amp; Native Bridges</w:t>
             </w:r>
           </w:p>
           <w:p>
             <w:pPr>
-              <w:spacing w:before="0" w:after="0"/>
+              <w:spacing w:before="0" w:after="0" w:line="240" w:lineRule="auto"/>
             </w:pPr>
             <w:r>
               <w:rPr>
                 <w:color w:val="334155"/>
+                <w:sz w:val="16"/>
+              </w:rPr>
+              <w:t>Android (JNI / Java) • iOS (Obj-C Bridge) • WebGL (WASM) • OTA Manifest Sync</w:t>
+            </w:r>
+          </w:p>
+        </w:tc>
+        <w:tc>
+          <w:tcPr>
+            <w:tcW w:w="3676" w:type="dxa"/>
+            <w:shd w:fill="F8FAFC"/>
+            <w:tcBorders>
+              <w:top w:val="single" w:sz="12" w:space="0" w:color="D97706"/>
+              <w:left w:val="single" w:sz="4" w:space="0" w:color="FDE68A"/>
+              <w:bottom w:val="single" w:sz="4" w:space="0" w:color="FDE68A"/>
+              <w:right w:val="single" w:sz="4" w:space="0" w:color="FDE68A"/>
+            </w:tcBorders>
+            <w:tcMar>
+              <w:top w:w="16" w:type="dxa"/>
+              <w:bottom w:w="16" w:type="dxa"/>
+              <w:left w:w="60" w:type="dxa"/>
+              <w:right w:w="60" w:type="dxa"/>
+            </w:tcMar>
+          </w:tcPr>
+          <w:p>
+            <w:pPr>
+              <w:spacing w:before="0" w:after="10"/>
+            </w:pPr>
+            <w:r>
+              <w:rPr>
+                <w:b/>
+                <w:color w:val="0F172A"/>
                 <w:sz w:val="17"/>
               </w:rPr>
-              <w:t>Hybrid jigsaw fitting and solitaire card stacking game with custom UI shaders and zero runtime asset overhead.</w:t>
+              <w:t>Architecture &amp; AI Systems</w:t>
+            </w:r>
+          </w:p>
+          <w:p>
+            <w:pPr>
+              <w:spacing w:before="0" w:after="0" w:line="240" w:lineRule="auto"/>
+            </w:pPr>
+            <w:r>
+              <w:rPr>
+                <w:color w:val="334155"/>
+                <w:sz w:val="16"/>
+              </w:rPr>
+              <w:t>Deterministic FSMs • MVP / ScriptableObjects • Zero-GC Object Pooling • Stockfish / A* / Backtracking</w:t>
+            </w:r>
+          </w:p>
+        </w:tc>
+        <w:tc>
+          <w:tcPr>
+            <w:tcW w:w="3676" w:type="dxa"/>
+            <w:shd w:fill="F8FAFC"/>
+            <w:tcBorders>
+              <w:top w:val="single" w:sz="12" w:space="0" w:color="475569"/>
+              <w:left w:val="single" w:sz="4" w:space="0" w:color="CBD5E1"/>
+              <w:bottom w:val="single" w:sz="4" w:space="0" w:color="CBD5E1"/>
+              <w:right w:val="single" w:sz="4" w:space="0" w:color="CBD5E1"/>
+            </w:tcBorders>
+            <w:tcMar>
+              <w:top w:w="16" w:type="dxa"/>
+              <w:bottom w:w="16" w:type="dxa"/>
+              <w:left w:w="60" w:type="dxa"/>
+              <w:right w:w="60" w:type="dxa"/>
+            </w:tcMar>
+          </w:tcPr>
+          <w:p>
+            <w:pPr>
+              <w:spacing w:before="0" w:after="10"/>
+            </w:pPr>
+            <w:r>
+              <w:rPr>
+                <w:b/>
+                <w:color w:val="0F172A"/>
+                <w:sz w:val="17"/>
+              </w:rPr>
+              <w:t>LiveOps, SDKs &amp; Tooling</w:t>
+            </w:r>
+          </w:p>
+          <w:p>
+            <w:pPr>
+              <w:spacing w:before="0" w:after="0" w:line="240" w:lineRule="auto"/>
+            </w:pPr>
+            <w:r>
+              <w:rPr>
+                <w:color w:val="334155"/>
+                <w:sz w:val="16"/>
+              </w:rPr>
+              <w:t>Google / Apple IAP • Ads Mediation • Firebase • Custom EditorWindows • Git / GitLab</w:t>
             </w:r>
           </w:p>
         </w:tc>
@@ -1251,7 +1463,7 @@
     </w:tbl>
     <w:p>
       <w:pPr>
-        <w:spacing w:before="50" w:after="20"/>
+        <w:spacing w:before="60" w:after="30"/>
         <w:pBdr>
           <w:bottom w:val="single" w:sz="6" w:space="1" w:color="CBD5E1"/>
         </w:pBdr>
@@ -1260,515 +1472,165 @@
         <w:rPr>
           <w:b/>
           <w:color w:val="0F172A"/>
-          <w:sz w:val="20"/>
+          <w:sz w:val="19"/>
         </w:rPr>
-        <w:t>CORE ARCHITECTURAL SYSTEMS BUILT (NDA-COMPLIANT BLUEPRINTS)</w:t>
+        <w:t>EDUCATION</w:t>
       </w:r>
     </w:p>
-    <w:p>
-      <w:pPr>
-        <w:pStyle w:val="ListBullet"/>
-        <w:spacing w:before="0" w:after="20"/>
-      </w:pPr>
-      <w:r>
-        <w:rPr>
-          <w:b/>
-          <w:color w:val="0F172A"/>
-          <w:sz w:val="20"/>
-        </w:rPr>
-        <w:t xml:space="preserve">Procedural Jigsaw Board Renderer (Core Gameplay Logic): </w:t>
-      </w:r>
-      <w:r>
-        <w:rPr>
-          <w:color w:val="334155"/>
-          <w:sz w:val="20"/>
-        </w:rPr>
-        <w:t>Engineered a standalone NxN jigsaw piece generator where 9 mathematical tab/blank shape signatures cover any arbitrary grid size without per-N art assets. Includes baked per-piece UV quads, tab overhang masks, and responsive phone vs. tablet viewport scaling.</w:t>
-      </w:r>
-    </w:p>
-    <w:p>
-      <w:pPr>
-        <w:pStyle w:val="ListBullet"/>
-        <w:spacing w:before="0" w:after="20"/>
-      </w:pPr>
-      <w:r>
-        <w:rPr>
-          <w:b/>
-          <w:color w:val="0F172A"/>
-          <w:sz w:val="20"/>
-        </w:rPr>
-        <w:t xml:space="preserve">Native Multi-Tier Image Pipeline (Platform Services · Android &amp; iOS): </w:t>
-      </w:r>
-      <w:r>
-        <w:rPr>
-          <w:color w:val="334155"/>
-          <w:sz w:val="20"/>
-        </w:rPr>
-        <w:t>Built a unified C# surface over native Android &amp; iOS bridges that fetches, resizes, and caches remote images with bounded on-disk eviction, download queue de-duplication, resolution tiers (256/512/1024), and an auto-resuming offline connectivity monitor.</w:t>
-      </w:r>
-    </w:p>
-    <w:p>
-      <w:pPr>
-        <w:pStyle w:val="ListBullet"/>
-        <w:spacing w:before="0" w:after="20"/>
-      </w:pPr>
-      <w:r>
-        <w:rPr>
-          <w:b/>
-          <w:color w:val="0F172A"/>
-          <w:sz w:val="20"/>
-        </w:rPr>
-        <w:t xml:space="preserve">Non-Blocking Level Sync (Platform Services · Background OTA): </w:t>
-      </w:r>
-      <w:r>
-        <w:rPr>
-          <w:color w:val="334155"/>
-          <w:sz w:val="20"/>
-        </w:rPr>
-        <w:t>Implemented a background manifest hash-diffing content synchronizer that downloads new level packs over-the-air without hitching frame budget or blocking startup, safely staging files to apply on next cold boot.</w:t>
-      </w:r>
-    </w:p>
-    <w:p>
-      <w:pPr>
-        <w:pStyle w:val="ListBullet"/>
-        <w:spacing w:before="0" w:after="20"/>
-      </w:pPr>
-      <w:r>
-        <w:rPr>
-          <w:b/>
-          <w:color w:val="0F172A"/>
-          <w:sz w:val="20"/>
-        </w:rPr>
-        <w:t xml:space="preserve">Zero-Cost Offline Leaderboard &amp; Bot Simulation (LiveOps &amp; Telemetry): </w:t>
-      </w:r>
-      <w:r>
-        <w:rPr>
-          <w:color w:val="334155"/>
-          <w:sz w:val="20"/>
-        </w:rPr>
-        <w:t>Simulated live competitive seasons and ranking tiers entirely on-device with zero server costs, featuring a bot population generator, user-centered windowed rank calculation, season resets, and idempotent reward claim verification.</w:t>
-      </w:r>
-    </w:p>
-    <w:p>
-      <w:pPr>
-        <w:pStyle w:val="ListBullet"/>
-        <w:spacing w:before="0" w:after="20"/>
-      </w:pPr>
-      <w:r>
-        <w:rPr>
-          <w:b/>
-          <w:color w:val="0F172A"/>
-          <w:sz w:val="20"/>
-        </w:rPr>
-        <w:t xml:space="preserve">Argos Offline Localization Tool (Editor Tooling · IPC): </w:t>
-      </w:r>
-      <w:r>
-        <w:rPr>
-          <w:color w:val="334155"/>
-          <w:sz w:val="20"/>
-        </w:rPr>
-        <w:t>Designed a Unity Editor utility crossing the OS process boundary using JSON over stdin/stdout to invoke an offline Python machine translation engine (argostranslate), updating Unity Localization tables automatically without external API costs.</w:t>
-      </w:r>
-    </w:p>
-    <w:p>
-      <w:pPr>
-        <w:spacing w:before="50" w:after="20"/>
-        <w:pBdr>
-          <w:bottom w:val="single" w:sz="6" w:space="1" w:color="CBD5E1"/>
-        </w:pBdr>
-      </w:pPr>
-      <w:r>
-        <w:rPr>
-          <w:b/>
-          <w:color w:val="0F172A"/>
-          <w:sz w:val="20"/>
-        </w:rPr>
-        <w:t>FEATURED GAMEPLAY REPOSITORIES &amp; R&amp;D LAB (GITLAB / SOURCE ARCHITECTURE)</w:t>
-      </w:r>
-    </w:p>
-    <w:p>
-      <w:pPr>
-        <w:pStyle w:val="ListBullet"/>
-        <w:spacing w:before="0" w:after="10"/>
-      </w:pPr>
-      <w:r>
-        <w:rPr>
-          <w:b/>
-          <w:color w:val="0F172A"/>
-          <w:sz w:val="20"/>
-        </w:rPr>
-        <w:t xml:space="preserve">Bullet Chess Engine (Stockfish AI &amp; Netcode): </w:t>
-      </w:r>
-      <w:hyperlink r:id="rId20">
-        <w:r>
-          <w:rPr>
-            <w:rFonts w:ascii="Calibri" w:hAnsi="Calibri"/>
-            <w:color w:val="1D4ED8"/>
-            <w:u w:val="single"/>
-            <w:b/>
-            <w:sz w:val="17"/>
-          </w:rPr>
-          <w:t>[GitLab ↗]</w:t>
-        </w:r>
-      </w:hyperlink>
-      <w:r>
-        <w:t xml:space="preserve">  —  </w:t>
-      </w:r>
-      <w:r>
-        <w:rPr>
-          <w:color w:val="334155"/>
-          <w:sz w:val="20"/>
-        </w:rPr>
-        <w:t>Fast-paced multiplayer chess engine integrated with Stockfish API for real-time move evaluation, client-side board validation, low-latency clock synchronization, and dynamic tournament brackets.</w:t>
-      </w:r>
-    </w:p>
-    <w:p>
-      <w:pPr>
-        <w:pStyle w:val="ListBullet"/>
-        <w:spacing w:before="0" w:after="10"/>
-      </w:pPr>
-      <w:r>
-        <w:rPr>
-          <w:b/>
-          <w:color w:val="0F172A"/>
-          <w:sz w:val="20"/>
-        </w:rPr>
-        <w:t xml:space="preserve">Arrow Strike (Spatial Maze Escape &amp; Graph Logic): </w:t>
-      </w:r>
-      <w:hyperlink r:id="rId18">
-        <w:r>
-          <w:rPr>
-            <w:rFonts w:ascii="Calibri" w:hAnsi="Calibri"/>
-            <w:color w:val="1D4ED8"/>
-            <w:u w:val="single"/>
-            <w:b/>
-            <w:sz w:val="17"/>
-          </w:rPr>
-          <w:t>[GitLab ↗]</w:t>
-        </w:r>
-      </w:hyperlink>
-      <w:r>
-        <w:t xml:space="preserve">  —  </w:t>
-      </w:r>
-      <w:r>
-        <w:rPr>
-          <w:color w:val="334155"/>
-          <w:sz w:val="20"/>
-        </w:rPr>
-        <w:t>Procedural infinite level puzzle engine implementing spatial graph search algorithms, directional arrow collision resolution, and zero-allocation runtime grid manipulation.</w:t>
-      </w:r>
-    </w:p>
-    <w:p>
-      <w:pPr>
-        <w:pStyle w:val="ListBullet"/>
-        <w:spacing w:before="0" w:after="10"/>
-      </w:pPr>
-      <w:r>
-        <w:rPr>
-          <w:b/>
-          <w:color w:val="0F172A"/>
-          <w:sz w:val="20"/>
-        </w:rPr>
-        <w:t xml:space="preserve">This Is Blast (Stack-Based Matching Queue Engine): </w:t>
-      </w:r>
-      <w:hyperlink r:id="rId17">
-        <w:r>
-          <w:rPr>
-            <w:rFonts w:ascii="Calibri" w:hAnsi="Calibri"/>
-            <w:color w:val="1D4ED8"/>
-            <w:u w:val="single"/>
-            <w:b/>
-            <w:sz w:val="17"/>
-          </w:rPr>
-          <w:t>[GitLab ↗]</w:t>
-        </w:r>
-      </w:hyperlink>
-      <w:r>
-        <w:t xml:space="preserve">  —  </w:t>
-      </w:r>
-      <w:r>
-        <w:rPr>
-          <w:color w:val="334155"/>
-          <w:sz w:val="20"/>
-        </w:rPr>
-        <w:t>Stack-based inventory matching mechanics with custom FIFO/LIFO queue data structures, cascading block jam resolution, and animated unit property clearing.</w:t>
-      </w:r>
-    </w:p>
-    <w:p>
-      <w:pPr>
-        <w:pStyle w:val="ListBullet"/>
-        <w:spacing w:before="0" w:after="10"/>
-      </w:pPr>
-      <w:r>
-        <w:rPr>
-          <w:b/>
-          <w:color w:val="0F172A"/>
-          <w:sz w:val="20"/>
-        </w:rPr>
-        <w:t xml:space="preserve">Tycoon RTS &amp; Autonomous Agent Dispatch: </w:t>
-      </w:r>
-      <w:hyperlink r:id="rId21">
-        <w:r>
-          <w:rPr>
-            <w:rFonts w:ascii="Calibri" w:hAnsi="Calibri"/>
-            <w:color w:val="1D4ED8"/>
-            <w:u w:val="single"/>
-            <w:b/>
-            <w:sz w:val="17"/>
-          </w:rPr>
-          <w:t>[GitLab ↗]</w:t>
-        </w:r>
-      </w:hyperlink>
-      <w:r>
-        <w:t xml:space="preserve">  —  </w:t>
-      </w:r>
-      <w:r>
-        <w:rPr>
-          <w:color w:val="334155"/>
-          <w:sz w:val="20"/>
-        </w:rPr>
-        <w:t>3D isometric grid placement simulation featuring deterministic economic loops, resource harvesting cycles, and autonomous AI worker agent state machines.</w:t>
-      </w:r>
-    </w:p>
-    <w:p>
-      <w:pPr>
-        <w:spacing w:before="50" w:after="20"/>
-        <w:pBdr>
-          <w:bottom w:val="single" w:sz="6" w:space="1" w:color="CBD5E1"/>
-        </w:pBdr>
-      </w:pPr>
-      <w:r>
-        <w:rPr>
-          <w:b/>
-          <w:color w:val="0F172A"/>
-          <w:sz w:val="20"/>
-        </w:rPr>
-        <w:t>PRODUCTION ENGINEERING &amp; PERFORMANCE STANDARDS</w:t>
-      </w:r>
-    </w:p>
-    <w:p>
-      <w:pPr>
-        <w:pStyle w:val="ListBullet"/>
-        <w:spacing w:before="0" w:after="10"/>
-      </w:pPr>
-      <w:r>
-        <w:rPr>
-          <w:b/>
-          <w:color w:val="0F172A"/>
-          <w:sz w:val="20"/>
-        </w:rPr>
-        <w:t xml:space="preserve">Zero-Allocation Runtime &amp; GC Elimination: </w:t>
-      </w:r>
-      <w:r>
-        <w:rPr>
-          <w:color w:val="334155"/>
-          <w:sz w:val="20"/>
-        </w:rPr>
-        <w:t>Enforce zero per-frame managed heap allocations in core game loops (Update/FixedUpdate), utilizing custom generic object pooling, non-allocating LINQ alternatives, and value-type struct caches to eliminate garbage collection hitching.</w:t>
-      </w:r>
-    </w:p>
-    <w:p>
-      <w:pPr>
-        <w:pStyle w:val="ListBullet"/>
-        <w:spacing w:before="0" w:after="10"/>
-      </w:pPr>
-      <w:r>
-        <w:rPr>
-          <w:b/>
-          <w:color w:val="0F172A"/>
-          <w:sz w:val="20"/>
-        </w:rPr>
-        <w:t xml:space="preserve">60 FPS Mobile Performance Budgeting: </w:t>
-      </w:r>
-      <w:r>
-        <w:rPr>
-          <w:color w:val="334155"/>
-          <w:sz w:val="20"/>
-        </w:rPr>
-        <w:t>Conduct profiling-driven development using Unity Profiler, Memory Profiler, and RenderDoc; enforce strict mobile budgets via SRP Batcher, GPU instancing, texture atlasing (ASTC compression), and dynamic draw call culling.</w:t>
-      </w:r>
-    </w:p>
-    <w:p>
-      <w:pPr>
-        <w:pStyle w:val="ListBullet"/>
-        <w:spacing w:before="0" w:after="10"/>
-      </w:pPr>
-      <w:r>
-        <w:rPr>
-          <w:b/>
-          <w:color w:val="0F172A"/>
-          <w:sz w:val="20"/>
-        </w:rPr>
-        <w:t xml:space="preserve">Data-Driven Architecture &amp; Decoupled State: </w:t>
-      </w:r>
-      <w:r>
-        <w:rPr>
-          <w:color w:val="334155"/>
-          <w:sz w:val="20"/>
-        </w:rPr>
-        <w:t>Architect modular gameplay subsystems with ScriptableObjects for configuration and game events, implementing Model-View-Presenter (MVP) patterns and lightweight JSON serialization for seamless offline state recovery.</w:t>
-      </w:r>
-    </w:p>
-    <w:p>
-      <w:pPr>
-        <w:pStyle w:val="ListBullet"/>
-        <w:spacing w:before="0" w:after="10"/>
-      </w:pPr>
-      <w:r>
-        <w:rPr>
-          <w:b/>
-          <w:color w:val="0F172A"/>
-          <w:sz w:val="20"/>
-        </w:rPr>
-        <w:t xml:space="preserve">AI-Augmented Development Pipeline: </w:t>
-      </w:r>
-      <w:r>
-        <w:rPr>
-          <w:color w:val="334155"/>
-          <w:sz w:val="20"/>
-        </w:rPr>
-        <w:t>Leverage state-of-the-art AI tooling (Claude 3.5/3.7, ChatGPT, OpenAI Codex) to accelerate architectural reviews, verify complex mathematical puzzles, prototype HLSL shaders, and automate Unity Editor utilities.</w:t>
-      </w:r>
-    </w:p>
-    <w:p>
-      <w:pPr>
-        <w:spacing w:before="50" w:after="20"/>
-        <w:pBdr>
-          <w:bottom w:val="single" w:sz="6" w:space="1" w:color="CBD5E1"/>
-        </w:pBdr>
-      </w:pPr>
-      <w:r>
-        <w:rPr>
-          <w:b/>
-          <w:color w:val="0F172A"/>
-          <w:sz w:val="20"/>
-        </w:rPr>
-        <w:t>TECHNICAL SKILLS &amp; TALENT TREE</w:t>
-      </w:r>
-    </w:p>
-    <w:p>
-      <w:pPr>
-        <w:spacing w:before="0" w:after="10"/>
-      </w:pPr>
-      <w:r>
-        <w:rPr>
-          <w:b/>
-          <w:color w:val="0F172A"/>
-          <w:sz w:val="20"/>
-        </w:rPr>
-        <w:t xml:space="preserve">• Engines &amp; Languages: </w:t>
-      </w:r>
-      <w:r>
-        <w:rPr>
-          <w:color w:val="334155"/>
-          <w:sz w:val="20"/>
-        </w:rPr>
-        <w:t>Unity3D (2020 – 2023 / Unity 6), C#, Python, HLSL ShaderLab</w:t>
-      </w:r>
-    </w:p>
-    <w:p>
-      <w:pPr>
-        <w:spacing w:before="0" w:after="10"/>
-      </w:pPr>
-      <w:r>
-        <w:rPr>
-          <w:b/>
-          <w:color w:val="0F172A"/>
-          <w:sz w:val="20"/>
-        </w:rPr>
-        <w:t xml:space="preserve">• Networking &amp; Netcode: </w:t>
-      </w:r>
-      <w:r>
-        <w:rPr>
-          <w:color w:val="334155"/>
-          <w:sz w:val="20"/>
-        </w:rPr>
-        <w:t>Real-Time Multiplayer Netcode, Client-Side Prediction, Deterministic State Sync, REST APIs, JSON</w:t>
-      </w:r>
-    </w:p>
-    <w:p>
-      <w:pPr>
-        <w:spacing w:before="0" w:after="10"/>
-      </w:pPr>
-      <w:r>
-        <w:rPr>
-          <w:b/>
-          <w:color w:val="0F172A"/>
-          <w:sz w:val="20"/>
-        </w:rPr>
-        <w:t xml:space="preserve">• AI &amp; Algorithmics: </w:t>
-      </w:r>
-      <w:r>
-        <w:rPr>
-          <w:color w:val="334155"/>
-          <w:sz w:val="20"/>
-        </w:rPr>
-        <w:t>Stockfish API, Unity ML-Agents, A* Pathfinding, Procedural Map &amp; Mesh Generation</w:t>
-      </w:r>
-    </w:p>
-    <w:p>
-      <w:pPr>
-        <w:spacing w:before="0" w:after="10"/>
-      </w:pPr>
-      <w:r>
-        <w:rPr>
-          <w:b/>
-          <w:color w:val="0F172A"/>
-          <w:sz w:val="20"/>
-        </w:rPr>
-        <w:t xml:space="preserve">• Monetization &amp; LiveOps: </w:t>
-      </w:r>
-      <w:r>
-        <w:rPr>
-          <w:color w:val="334155"/>
-          <w:sz w:val="20"/>
-        </w:rPr>
-        <w:t>Unity In-App Purchase (IAP for Apple/Google), Local JSON Caching, Ads Mediation SDKs</w:t>
-      </w:r>
-    </w:p>
-    <w:p>
-      <w:pPr>
-        <w:spacing w:before="0" w:after="10"/>
-      </w:pPr>
-      <w:r>
-        <w:rPr>
-          <w:b/>
-          <w:color w:val="0F172A"/>
-          <w:sz w:val="20"/>
-        </w:rPr>
-        <w:t xml:space="preserve">• Art &amp; Workflow Tools: </w:t>
-      </w:r>
-      <w:r>
-        <w:rPr>
-          <w:color w:val="334155"/>
-          <w:sz w:val="20"/>
-        </w:rPr>
-        <w:t>Blender (3D Modeling, UV Unwrapping, Retopology, LODs), Figma, Android Studio</w:t>
-      </w:r>
-    </w:p>
-    <w:p>
-      <w:pPr>
-        <w:spacing w:before="0" w:after="10"/>
-      </w:pPr>
-      <w:r>
-        <w:rPr>
-          <w:b/>
-          <w:color w:val="0F172A"/>
-          <w:sz w:val="20"/>
-        </w:rPr>
-        <w:t xml:space="preserve">• DevOps &amp; Testing: </w:t>
-      </w:r>
-      <w:r>
-        <w:rPr>
-          <w:color w:val="334155"/>
-          <w:sz w:val="20"/>
-        </w:rPr>
-        <w:t>Git, GitLab, Unity Test Framework, Android Device Profiler, ADB</w:t>
-      </w:r>
-    </w:p>
+    <w:tbl>
+      <w:tblPr>
+        <w:tblW w:type="auto" w:w="0"/>
+        <w:jc w:val="center"/>
+        <w:tblLayout w:type="fixed"/>
+        <w:tblLook w:firstColumn="1" w:firstRow="1" w:lastColumn="0" w:lastRow="0" w:noHBand="0" w:noVBand="1" w:val="04A0"/>
+      </w:tblPr>
+      <w:tblGrid>
+        <w:gridCol w:w="5514"/>
+        <w:gridCol w:w="5514"/>
+      </w:tblGrid>
+      <w:tr>
+        <w:trPr>
+          <w:cantSplit/>
+        </w:trPr>
+        <w:tc>
+          <w:tcPr>
+            <w:tcW w:w="5514" w:type="dxa"/>
+            <w:shd w:fill="F8FAFC"/>
+            <w:tcBorders>
+              <w:top w:val="single" w:sz="12" w:space="0" w:color="2563EB"/>
+              <w:left w:val="single" w:sz="4" w:space="0" w:color="BFDBFE"/>
+              <w:bottom w:val="single" w:sz="4" w:space="0" w:color="BFDBFE"/>
+              <w:right w:val="single" w:sz="4" w:space="0" w:color="BFDBFE"/>
+            </w:tcBorders>
+            <w:tcMar>
+              <w:top w:w="14" w:type="dxa"/>
+              <w:bottom w:w="14" w:type="dxa"/>
+              <w:left w:w="60" w:type="dxa"/>
+              <w:right w:w="60" w:type="dxa"/>
+            </w:tcMar>
+          </w:tcPr>
+          <w:p>
+            <w:pPr>
+              <w:tabs>
+                <w:tab w:pos="5256" w:val="right"/>
+              </w:tabs>
+              <w:spacing w:before="0" w:after="10"/>
+            </w:pPr>
+            <w:r>
+              <w:rPr>
+                <w:b/>
+                <w:color w:val="0F172A"/>
+                <w:sz w:val="17"/>
+              </w:rPr>
+              <w:t>Master of Computer Application (MCA)</w:t>
+            </w:r>
+            <w:r>
+              <w:rPr>
+                <w:b/>
+                <w:color w:val="1D4ED8"/>
+                <w:sz w:val="16"/>
+              </w:rPr>
+              <w:tab/>
+              <w:t>CGPA: 7.52</w:t>
+            </w:r>
+          </w:p>
+          <w:p>
+            <w:pPr>
+              <w:tabs>
+                <w:tab w:pos="5256" w:val="right"/>
+              </w:tabs>
+              <w:spacing w:before="0" w:after="0"/>
+            </w:pPr>
+            <w:r>
+              <w:rPr>
+                <w:color w:val="334155"/>
+                <w:sz w:val="16"/>
+              </w:rPr>
+              <w:t>Government Autonomous Engineering College, Aurangabad, MH</w:t>
+            </w:r>
+            <w:r>
+              <w:rPr>
+                <w:b/>
+                <w:color w:val="64748B"/>
+                <w:sz w:val="16"/>
+              </w:rPr>
+              <w:tab/>
+              <w:t>Dec 2021 – Jan 2023</w:t>
+            </w:r>
+          </w:p>
+        </w:tc>
+        <w:tc>
+          <w:tcPr>
+            <w:tcW w:w="5514" w:type="dxa"/>
+            <w:shd w:fill="F8FAFC"/>
+            <w:tcBorders>
+              <w:top w:val="single" w:sz="12" w:space="0" w:color="059669"/>
+              <w:left w:val="single" w:sz="4" w:space="0" w:color="A7F3D0"/>
+              <w:bottom w:val="single" w:sz="4" w:space="0" w:color="A7F3D0"/>
+              <w:right w:val="single" w:sz="4" w:space="0" w:color="A7F3D0"/>
+            </w:tcBorders>
+            <w:tcMar>
+              <w:top w:w="14" w:type="dxa"/>
+              <w:bottom w:w="14" w:type="dxa"/>
+              <w:left w:w="60" w:type="dxa"/>
+              <w:right w:w="60" w:type="dxa"/>
+            </w:tcMar>
+          </w:tcPr>
+          <w:p>
+            <w:pPr>
+              <w:tabs>
+                <w:tab w:pos="5256" w:val="right"/>
+              </w:tabs>
+              <w:spacing w:before="0" w:after="10"/>
+            </w:pPr>
+            <w:r>
+              <w:rPr>
+                <w:b/>
+                <w:color w:val="0F172A"/>
+                <w:sz w:val="17"/>
+              </w:rPr>
+              <w:t>Bachelor of Computer Science (B.Sc. CS)</w:t>
+            </w:r>
+            <w:r>
+              <w:rPr>
+                <w:b/>
+                <w:color w:val="059669"/>
+                <w:sz w:val="16"/>
+              </w:rPr>
+              <w:tab/>
+              <w:t>CGPA: 7.50</w:t>
+            </w:r>
+          </w:p>
+          <w:p>
+            <w:pPr>
+              <w:tabs>
+                <w:tab w:pos="5256" w:val="right"/>
+              </w:tabs>
+              <w:spacing w:before="0" w:after="0"/>
+            </w:pPr>
+            <w:r>
+              <w:rPr>
+                <w:color w:val="334155"/>
+                <w:sz w:val="16"/>
+              </w:rPr>
+              <w:t>Vivekanand Arts and Science College, Aurangabad, MH</w:t>
+            </w:r>
+            <w:r>
+              <w:rPr>
+                <w:b/>
+                <w:color w:val="64748B"/>
+                <w:sz w:val="16"/>
+              </w:rPr>
+              <w:tab/>
+              <w:t>Apr 2018 – Oct 2021</w:t>
+            </w:r>
+          </w:p>
+        </w:tc>
+      </w:tr>
+    </w:tbl>
     <w:sectPr>
       <w:pgSz w:w="12240" w:h="15840"/>
-      <w:pgMar w:top="432" w:right="648" w:bottom="432" w:left="648" w:header="720" w:footer="720" w:gutter="0"/>
+      <w:pgMar w:top="346" w:right="605" w:bottom="346" w:left="605" w:header="720" w:footer="720" w:gutter="0"/>
       <w:cols w:space="720"/>
       <w:docGrid w:linePitch="360"/>
     </w:sectPr>
@@ -2142,7 +2004,7 @@
     <w:rPr>
       <w:rFonts w:ascii="Calibri" w:hAnsi="Calibri"/>
       <w:color w:val="0F172A"/>
-      <w:sz w:val="20"/>
+      <w:sz w:val="19"/>
     </w:rPr>
   </w:style>
   <w:style w:type="paragraph" w:styleId="Header">

</xml_diff>

<commit_message>
Publish interactive HTML resume (resume.html / header_previews_widget.html) and updated 2-page DOCX & PDF resumes
</commit_message>
<xml_diff>
--- a/assets/resume/Arpit_Jaiswal_Game_Dev_Resume.docx
+++ b/assets/resume/Arpit_Jaiswal_Game_Dev_Resume.docx
@@ -4,21 +4,36 @@
   <w:body>
     <w:p>
       <w:pPr>
-        <w:spacing w:before="0" w:after="10"/>
+        <w:spacing w:before="0" w:after="20"/>
+        <w:jc w:val="center"/>
       </w:pPr>
       <w:r>
         <w:rPr>
           <w:b/>
           <w:color w:val="0F172A"/>
-          <w:sz w:val="34"/>
+          <w:sz w:val="43"/>
         </w:rPr>
         <w:t>ARPIT K. JAISWAL</w:t>
+      </w:r>
+    </w:p>
+    <w:p>
+      <w:pPr>
+        <w:spacing w:before="0" w:after="50"/>
+        <w:jc w:val="center"/>
+      </w:pPr>
+      <w:r>
+        <w:rPr>
+          <w:b/>
+          <w:color w:val="0F172A"/>
+          <w:sz w:val="25"/>
+        </w:rPr>
+        <w:t>GAMEPLAY &amp; AI SYSTEMS DEVELOPER</w:t>
       </w:r>
       <w:r>
         <w:rPr>
           <w:b/>
           <w:color w:val="059669"/>
-          <w:sz w:val="19"/>
+          <w:sz w:val="23"/>
         </w:rPr>
         <w:t xml:space="preserve">   [ UNITY DEVELOPER ]</w:t>
       </w:r>
@@ -26,46 +41,21 @@
         <w:rPr>
           <w:b/>
           <w:color w:val="1D4ED8"/>
-          <w:sz w:val="19"/>
+          <w:sz w:val="23"/>
         </w:rPr>
-        <w:t xml:space="preserve">  [ 3.5+ YRS EXPERIENCE ]</w:t>
+        <w:t xml:space="preserve">   [ 3.5+ YRS EXPERIENCE ]</w:t>
       </w:r>
     </w:p>
     <w:p>
       <w:pPr>
-        <w:spacing w:before="0" w:after="20"/>
-      </w:pPr>
-      <w:r>
-        <w:rPr>
-          <w:b/>
-          <w:color w:val="1D4ED8"/>
-          <w:sz w:val="21"/>
-        </w:rPr>
-        <w:t>GAMEPLAY &amp; AI SYSTEMS DEVELOPER</w:t>
-      </w:r>
-      <w:r>
-        <w:rPr>
-          <w:b/>
-          <w:color w:val="334155"/>
-          <w:sz w:val="21"/>
-        </w:rPr>
-        <w:t xml:space="preserve">  |  SPECIALIZATION IN UNITY</w:t>
-      </w:r>
-    </w:p>
-    <w:p>
-      <w:pPr>
-        <w:spacing w:before="0" w:after="50"/>
+        <w:tabs>
+          <w:tab w:pos="11318" w:val="right"/>
+        </w:tabs>
+        <w:spacing w:before="0" w:after="70"/>
         <w:pBdr>
-          <w:bottom w:val="single" w:sz="12" w:space="2" w:color="0F172A"/>
+          <w:bottom w:val="single" w:sz="16" w:space="4" w:color="1E293B"/>
         </w:pBdr>
       </w:pPr>
-      <w:r>
-        <w:rPr>
-          <w:color w:val="334155"/>
-          <w:sz w:val="18"/>
-        </w:rPr>
-        <w:t xml:space="preserve">Phone: +91 8149135849  •  Email: arpitjaiswal071@gmail.com  •  Location: PAN India  •  </w:t>
-      </w:r>
       <w:hyperlink r:id="rId9">
         <w:r>
           <w:rPr>
@@ -73,18 +63,18 @@
             <w:color w:val="1D4ED8"/>
             <w:u w:val="single"/>
             <w:b/>
-            <w:sz w:val="18"/>
-            <w:szCs w:val="18"/>
+            <w:sz w:val="22"/>
+            <w:szCs w:val="22"/>
           </w:rPr>
-          <w:t xml:space="preserve">Portfolio</w:t>
+          <w:t>+91 8149135849</w:t>
         </w:r>
       </w:hyperlink>
       <w:r>
         <w:rPr>
           <w:color w:val="94A3B8"/>
-          <w:sz w:val="18"/>
+          <w:sz w:val="22"/>
         </w:rPr>
-        <w:t xml:space="preserve">  |  </w:t>
+        <w:t xml:space="preserve">   •   </w:t>
       </w:r>
       <w:hyperlink r:id="rId10">
         <w:r>
@@ -93,18 +83,17 @@
             <w:color w:val="1D4ED8"/>
             <w:u w:val="single"/>
             <w:b/>
-            <w:sz w:val="18"/>
-            <w:szCs w:val="18"/>
+            <w:sz w:val="22"/>
+            <w:szCs w:val="22"/>
           </w:rPr>
-          <w:t xml:space="preserve">LinkedIn</w:t>
+          <w:t>arpitjaiswal071@gmail.com</w:t>
         </w:r>
       </w:hyperlink>
       <w:r>
         <w:rPr>
-          <w:color w:val="94A3B8"/>
-          <w:sz w:val="18"/>
+          <w:sz w:val="22"/>
         </w:rPr>
-        <w:t xml:space="preserve">  |  </w:t>
+        <w:tab/>
       </w:r>
       <w:hyperlink r:id="rId11">
         <w:r>
@@ -113,151 +102,103 @@
             <w:color w:val="1D4ED8"/>
             <w:u w:val="single"/>
             <w:b/>
-            <w:sz w:val="18"/>
-            <w:szCs w:val="18"/>
+            <w:sz w:val="22"/>
+            <w:szCs w:val="22"/>
           </w:rPr>
-          <w:t xml:space="preserve">GitLab</w:t>
+          <w:t>Portfolio ↗</w:t>
         </w:r>
       </w:hyperlink>
       <w:r>
         <w:rPr>
           <w:color w:val="94A3B8"/>
-          <w:sz w:val="18"/>
+          <w:sz w:val="22"/>
         </w:rPr>
-        <w:t xml:space="preserve">  |  </w:t>
+        <w:t xml:space="preserve">   |   </w:t>
       </w:r>
       <w:hyperlink r:id="rId12">
         <w:r>
           <w:rPr>
             <w:rFonts w:ascii="Calibri" w:hAnsi="Calibri"/>
-            <w:color w:val="047857"/>
+            <w:color w:val="1D4ED8"/>
             <w:u w:val="single"/>
             <w:b/>
-            <w:sz w:val="18"/>
-            <w:szCs w:val="18"/>
+            <w:sz w:val="22"/>
+            <w:szCs w:val="22"/>
           </w:rPr>
-          <w:t xml:space="preserve">Unity Playable Demo</w:t>
+          <w:t>LinkedIn ↗</w:t>
+        </w:r>
+      </w:hyperlink>
+      <w:r>
+        <w:rPr>
+          <w:color w:val="94A3B8"/>
+          <w:sz w:val="22"/>
+        </w:rPr>
+        <w:t xml:space="preserve">   |   </w:t>
+      </w:r>
+      <w:hyperlink r:id="rId13">
+        <w:r>
+          <w:rPr>
+            <w:rFonts w:ascii="Calibri" w:hAnsi="Calibri"/>
+            <w:color w:val="1D4ED8"/>
+            <w:u w:val="single"/>
+            <w:b/>
+            <w:sz w:val="22"/>
+            <w:szCs w:val="22"/>
+          </w:rPr>
+          <w:t>GitHub ↗</w:t>
+        </w:r>
+      </w:hyperlink>
+      <w:r>
+        <w:rPr>
+          <w:color w:val="94A3B8"/>
+          <w:sz w:val="22"/>
+        </w:rPr>
+        <w:t xml:space="preserve">   |   </w:t>
+      </w:r>
+      <w:hyperlink r:id="rId14">
+        <w:r>
+          <w:rPr>
+            <w:rFonts w:ascii="Calibri" w:hAnsi="Calibri"/>
+            <w:color w:val="1D4ED8"/>
+            <w:u w:val="single"/>
+            <w:b/>
+            <w:sz w:val="22"/>
+            <w:szCs w:val="22"/>
+          </w:rPr>
+          <w:t>GitLab ↗</w:t>
         </w:r>
       </w:hyperlink>
     </w:p>
     <w:p>
       <w:pPr>
-        <w:spacing w:before="50" w:after="30"/>
+        <w:keepNext/>
+        <w:tabs>
+          <w:tab w:pos="11318" w:val="right"/>
+        </w:tabs>
+        <w:spacing w:before="80" w:after="60"/>
         <w:pBdr>
-          <w:bottom w:val="single" w:sz="6" w:space="1" w:color="CBD5E1"/>
+          <w:left w:val="single" w:sz="24" w:space="6" w:color="2563EB"/>
+          <w:bottom w:val="single" w:sz="6" w:space="2" w:color="CBD5E1"/>
         </w:pBdr>
       </w:pPr>
       <w:r>
         <w:rPr>
+          <w:rFonts w:ascii="Calibri" w:hAnsi="Calibri"/>
           <w:b/>
           <w:color w:val="0F172A"/>
-          <w:sz w:val="19"/>
+          <w:sz w:val="24"/>
         </w:rPr>
         <w:t>EXECUTIVE PROFILE</w:t>
       </w:r>
-    </w:p>
-    <w:p>
-      <w:pPr>
-        <w:pStyle w:val="ListBullet"/>
-        <w:spacing w:before="0" w:after="20" w:line="245" w:lineRule="auto"/>
-        <w:ind w:left="259" w:hanging="202"/>
-      </w:pPr>
       <w:r>
         <w:rPr>
-          <w:b/>
-          <w:color w:val="0F172A"/>
-          <w:sz w:val="18"/>
+          <w:rFonts w:ascii="Calibri" w:hAnsi="Calibri"/>
+          <w:b w:val="0"/>
+          <w:color w:val="64748B"/>
+          <w:sz w:val="21"/>
         </w:rPr>
-        <w:t xml:space="preserve">Core Identity &amp; Experience: </w:t>
-      </w:r>
-      <w:r>
-        <w:rPr>
-          <w:color w:val="334155"/>
-          <w:sz w:val="18"/>
-        </w:rPr>
-        <w:t>Gameplay &amp; Systems Engineer with 3.5+ years of professional studio experience developing high-performance mobile titles in Unity (C#), with 3 live commercial games published on Google Play Store.</w:t>
-      </w:r>
-    </w:p>
-    <w:p>
-      <w:pPr>
-        <w:pStyle w:val="ListBullet"/>
-        <w:spacing w:before="0" w:after="20" w:line="245" w:lineRule="auto"/>
-        <w:ind w:left="259" w:hanging="202"/>
-      </w:pPr>
-      <w:r>
-        <w:rPr>
-          <w:b/>
-          <w:color w:val="0F172A"/>
-          <w:sz w:val="18"/>
-        </w:rPr>
-        <w:t xml:space="preserve">Engineered Subsystems: </w:t>
-      </w:r>
-      <w:r>
-        <w:rPr>
-          <w:color w:val="334155"/>
-          <w:sz w:val="18"/>
-        </w:rPr>
-        <w:t>Production specialist across modular game subsystems—including procedural puzzle generators, native Android/iOS bridge pipelines, deterministic logic solvers, and non-blocking OTA level sync maintaining stable 60 FPS.</w:t>
-      </w:r>
-    </w:p>
-    <w:p>
-      <w:pPr>
-        <w:pStyle w:val="ListBullet"/>
-        <w:spacing w:before="0" w:after="20" w:line="245" w:lineRule="auto"/>
-        <w:ind w:left="259" w:hanging="202"/>
-      </w:pPr>
-      <w:r>
-        <w:rPr>
-          <w:b/>
-          <w:color w:val="0F172A"/>
-          <w:sz w:val="18"/>
-        </w:rPr>
-        <w:t xml:space="preserve">AI-Augmented Engineering (Claude &amp; ChatGPT/Codex): </w:t>
-      </w:r>
-      <w:r>
-        <w:rPr>
-          <w:color w:val="334155"/>
-          <w:sz w:val="18"/>
-        </w:rPr>
-        <w:t>Advanced workflow proficiency utilizing Claude 3.5/3.7, ChatGPT, and OpenAI Codex for accelerated systems architecture, algorithmic verification, rapid shader prototyping, and automated editor tooling.</w:t>
-      </w:r>
-    </w:p>
-    <w:p>
-      <w:pPr>
-        <w:pStyle w:val="ListBullet"/>
-        <w:spacing w:before="0" w:after="20" w:line="245" w:lineRule="auto"/>
-        <w:ind w:left="259" w:hanging="202"/>
-      </w:pPr>
-      <w:r>
-        <w:rPr>
-          <w:b/>
-          <w:color w:val="0F172A"/>
-          <w:sz w:val="18"/>
-        </w:rPr>
-        <w:t xml:space="preserve">Forward Vision &amp; Growth: </w:t>
-      </w:r>
-      <w:r>
-        <w:rPr>
-          <w:color w:val="334155"/>
-          <w:sz w:val="18"/>
-        </w:rPr>
-        <w:t>Committed to architecting scalable, data-driven game loops, mastering next-gen multiplayer frameworks, and driving technical gameplay excellence in collaborative game studios.</w:t>
-      </w:r>
-    </w:p>
-    <w:p>
-      <w:pPr>
-        <w:spacing w:before="60" w:after="40"/>
-        <w:pBdr>
-          <w:bottom w:val="single" w:sz="6" w:space="1" w:color="CBD5E1"/>
-        </w:pBdr>
-      </w:pPr>
-      <w:r>
-        <w:rPr>
-          <w:b/>
-          <w:color w:val="0F172A"/>
-          <w:sz w:val="19"/>
-        </w:rPr>
-        <w:t>PRODUCTION TRACK RECORD (KPIS)</w:t>
+        <w:tab/>
+        <w:t>Core Specializations &amp; Studio Focus</w:t>
       </w:r>
     </w:p>
     <w:tbl>
@@ -268,8 +209,7 @@
         <w:tblLook w:firstColumn="1" w:firstRow="1" w:lastColumn="0" w:lastRow="0" w:noHBand="0" w:noVBand="1" w:val="04A0"/>
       </w:tblPr>
       <w:tblGrid>
-        <w:gridCol w:w="6768"/>
-        <w:gridCol w:w="4262"/>
+        <w:gridCol w:w="11318"/>
       </w:tblGrid>
       <w:tr>
         <w:trPr>
@@ -277,50 +217,209 @@
         </w:trPr>
         <w:tc>
           <w:tcPr>
-            <w:tcW w:w="6768" w:type="dxa"/>
+            <w:tcW w:w="11318" w:type="dxa"/>
+            <w:shd w:fill="F8FAFC"/>
+            <w:tcBorders>
+              <w:top w:val="single" w:sz="14" w:space="0" w:color="2563EB"/>
+              <w:left w:val="single" w:sz="6" w:space="0" w:color="93C5FD"/>
+              <w:bottom w:val="single" w:sz="6" w:space="0" w:color="93C5FD"/>
+              <w:right w:val="single" w:sz="6" w:space="0" w:color="93C5FD"/>
+            </w:tcBorders>
             <w:tcMar>
-              <w:top w:w="22" w:type="dxa"/>
-              <w:bottom w:w="22" w:type="dxa"/>
-              <w:left w:w="70" w:type="dxa"/>
-              <w:right w:w="70" w:type="dxa"/>
+              <w:top w:w="52" w:type="dxa"/>
+              <w:bottom w:w="52" w:type="dxa"/>
+              <w:left w:w="90" w:type="dxa"/>
+              <w:right w:w="90" w:type="dxa"/>
+            </w:tcMar>
+          </w:tcPr>
+          <w:p>
+            <w:pPr>
+              <w:spacing w:before="0" w:after="48" w:line="259" w:lineRule="auto"/>
+              <w:ind w:left="230" w:hanging="202"/>
+            </w:pPr>
+            <w:r>
+              <w:rPr>
+                <w:b/>
+                <w:color w:val="2563EB"/>
+                <w:sz w:val="22"/>
+              </w:rPr>
+              <w:t xml:space="preserve">•  </w:t>
+            </w:r>
+            <w:r>
+              <w:rPr>
+                <w:b/>
+                <w:color w:val="0F172A"/>
+                <w:sz w:val="22"/>
+              </w:rPr>
+              <w:t xml:space="preserve">Production &amp; Multiplayer Systems (Unity C#): </w:t>
+            </w:r>
+            <w:r>
+              <w:rPr>
+                <w:color w:val="334155"/>
+                <w:sz w:val="22"/>
+              </w:rPr>
+              <w:t>Gameplay &amp; Systems Engineer with 3.5+ years shipping 3 commercial Google Play titles and real-time multiplayer games using Photon (PUN 2), Stockfish AI, and deterministic FSMs.</w:t>
+            </w:r>
+          </w:p>
+          <w:p>
+            <w:pPr>
+              <w:spacing w:before="0" w:after="48" w:line="259" w:lineRule="auto"/>
+              <w:ind w:left="230" w:hanging="202"/>
+            </w:pPr>
+            <w:r>
+              <w:rPr>
+                <w:b/>
+                <w:color w:val="2563EB"/>
+                <w:sz w:val="22"/>
+              </w:rPr>
+              <w:t xml:space="preserve">•  </w:t>
+            </w:r>
+            <w:r>
+              <w:rPr>
+                <w:b/>
+                <w:color w:val="0F172A"/>
+                <w:sz w:val="22"/>
+              </w:rPr>
+              <w:t xml:space="preserve">Architecture, Native Bridges &amp; 60 FPS Optimization: </w:t>
+            </w:r>
+            <w:r>
+              <w:rPr>
+                <w:color w:val="334155"/>
+                <w:sz w:val="22"/>
+              </w:rPr>
+              <w:t>Specialist in procedural N×N mesh/puzzle generation, native Android (JNI) / iOS (Obj-C) bridges, non-blocking OTA content delivery, and Zero-GC object pooling locked at 60 FPS.</w:t>
+            </w:r>
+          </w:p>
+          <w:p>
+            <w:pPr>
+              <w:spacing w:before="0" w:after="0" w:line="259" w:lineRule="auto"/>
+              <w:ind w:left="230" w:hanging="202"/>
+            </w:pPr>
+            <w:r>
+              <w:rPr>
+                <w:b/>
+                <w:color w:val="2563EB"/>
+                <w:sz w:val="22"/>
+              </w:rPr>
+              <w:t xml:space="preserve">•  </w:t>
+            </w:r>
+            <w:r>
+              <w:rPr>
+                <w:b/>
+                <w:color w:val="0F172A"/>
+                <w:sz w:val="22"/>
+              </w:rPr>
+              <w:t xml:space="preserve">AI-Augmented Tooling &amp; LiveOps Velocity: </w:t>
+            </w:r>
+            <w:r>
+              <w:rPr>
+                <w:color w:val="334155"/>
+                <w:sz w:val="22"/>
+              </w:rPr>
+              <w:t>Leverages Claude, ChatGPT/Codex, and custom Unity EditorWindows to accelerate URP/HLSL shader prototyping, offline localization pipelines, and Google/Apple IAP monetization.</w:t>
+            </w:r>
+          </w:p>
+        </w:tc>
+      </w:tr>
+    </w:tbl>
+    <w:p>
+      <w:pPr>
+        <w:keepNext/>
+        <w:tabs>
+          <w:tab w:pos="11318" w:val="right"/>
+        </w:tabs>
+        <w:spacing w:before="90" w:after="40"/>
+        <w:pBdr>
+          <w:left w:val="single" w:sz="24" w:space="6" w:color="059669"/>
+          <w:bottom w:val="single" w:sz="6" w:space="2" w:color="CBD5E1"/>
+        </w:pBdr>
+      </w:pPr>
+      <w:r>
+        <w:rPr>
+          <w:rFonts w:ascii="Calibri" w:hAnsi="Calibri"/>
+          <w:b/>
+          <w:color w:val="0F172A"/>
+          <w:sz w:val="24"/>
+        </w:rPr>
+        <w:t>PRODUCTION TRACK RECORD (KPIS)</w:t>
+      </w:r>
+      <w:r>
+        <w:rPr>
+          <w:rFonts w:ascii="Calibri" w:hAnsi="Calibri"/>
+          <w:b w:val="0"/>
+          <w:color w:val="64748B"/>
+          <w:sz w:val="21"/>
+        </w:rPr>
+        <w:tab/>
+        <w:t>Quick 6-Second Recruiter Highlights</w:t>
+      </w:r>
+    </w:p>
+    <w:tbl>
+      <w:tblPr>
+        <w:tblW w:type="auto" w:w="0"/>
+        <w:jc w:val="center"/>
+        <w:tblLayout w:type="fixed"/>
+        <w:tblLook w:firstColumn="1" w:firstRow="1" w:lastColumn="0" w:lastRow="0" w:noHBand="0" w:noVBand="1" w:val="04A0"/>
+        <w:tblCellSpacing w:w="45" w:type="dxa"/>
+      </w:tblPr>
+      <w:tblGrid>
+        <w:gridCol w:w="6950"/>
+        <w:gridCol w:w="4270"/>
+      </w:tblGrid>
+      <w:tr>
+        <w:trPr>
+          <w:cantSplit/>
+        </w:trPr>
+        <w:tc>
+          <w:tcPr>
+            <w:tcW w:w="6950" w:type="dxa"/>
+            <w:tcMar>
+              <w:top w:w="46" w:type="dxa"/>
+              <w:bottom w:w="46" w:type="dxa"/>
+              <w:left w:w="85" w:type="dxa"/>
+              <w:right w:w="85" w:type="dxa"/>
             </w:tcMar>
             <w:shd w:fill="F8FAFC"/>
             <w:tcBorders>
-              <w:top w:val="single" w:sz="14" w:space="0" w:color="334155"/>
-              <w:left w:val="single" w:sz="4" w:space="0" w:color="CBD5E1"/>
-              <w:bottom w:val="single" w:sz="4" w:space="0" w:color="CBD5E1"/>
-              <w:right w:val="single" w:sz="4" w:space="0" w:color="CBD5E1"/>
+              <w:top w:val="single" w:sz="16" w:space="0" w:color="475569"/>
+              <w:left w:val="single" w:sz="6" w:space="0" w:color="94A3B8"/>
+              <w:bottom w:val="single" w:sz="6" w:space="0" w:color="94A3B8"/>
+              <w:right w:val="single" w:sz="6" w:space="0" w:color="94A3B8"/>
             </w:tcBorders>
           </w:tcPr>
           <w:p>
             <w:pPr>
-              <w:spacing w:before="0" w:after="20"/>
+              <w:tabs>
+                <w:tab w:pos="6696" w:val="right"/>
+              </w:tabs>
+              <w:spacing w:before="0" w:after="36"/>
             </w:pPr>
             <w:r>
               <w:rPr>
                 <w:b/>
                 <w:color w:val="0F172A"/>
-                <w:sz w:val="20"/>
+                <w:sz w:val="25"/>
               </w:rPr>
-              <w:t xml:space="preserve">3.5+ Years  </w:t>
+              <w:t>3.5+ Years</w:t>
             </w:r>
             <w:r>
               <w:rPr>
                 <w:b/>
                 <w:color w:val="64748B"/>
-                <w:sz w:val="17"/>
+                <w:sz w:val="20"/>
               </w:rPr>
+              <w:tab/>
               <w:t>STUDIO EXPERIENCE</w:t>
             </w:r>
           </w:p>
           <w:p>
             <w:pPr>
-              <w:spacing w:before="0" w:after="10"/>
+              <w:spacing w:before="0" w:after="30" w:line="252" w:lineRule="auto"/>
             </w:pPr>
             <w:r>
               <w:rPr>
                 <w:b/>
-                <w:sz w:val="17"/>
+                <w:sz w:val="21"/>
               </w:rPr>
               <w:t xml:space="preserve">• </w:t>
             </w:r>
@@ -328,27 +427,27 @@
               <w:rPr>
                 <w:b/>
                 <w:color w:val="0F172A"/>
-                <w:sz w:val="17"/>
+                <w:sz w:val="21"/>
               </w:rPr>
               <w:t>Vasundhara Game Studio, Surat (2yr)</w:t>
             </w:r>
             <w:r>
               <w:rPr>
                 <w:b/>
-                <w:color w:val="1D4ED8"/>
-                <w:sz w:val="17"/>
+                <w:color w:val="334155"/>
+                <w:sz w:val="20"/>
               </w:rPr>
-              <w:t xml:space="preserve"> (Dec 2024 – Jan 2025 &amp;&amp; Dec 2025 – Current)</w:t>
+              <w:t xml:space="preserve">  •  Dec 2024 – Jan 2025 &amp; Dec 2025 – Present</w:t>
             </w:r>
           </w:p>
           <w:p>
             <w:pPr>
-              <w:spacing w:before="0" w:after="10"/>
+              <w:spacing w:before="0" w:after="30" w:line="252" w:lineRule="auto"/>
             </w:pPr>
             <w:r>
               <w:rPr>
                 <w:b/>
-                <w:sz w:val="17"/>
+                <w:sz w:val="21"/>
               </w:rPr>
               <w:t xml:space="preserve">• </w:t>
             </w:r>
@@ -356,27 +455,27 @@
               <w:rPr>
                 <w:b/>
                 <w:color w:val="0F172A"/>
-                <w:sz w:val="17"/>
+                <w:sz w:val="21"/>
               </w:rPr>
               <w:t>StudioKrew, Delhi (3m)</w:t>
             </w:r>
             <w:r>
               <w:rPr>
                 <w:b w:val="0"/>
-                <w:color w:val="64748B"/>
-                <w:sz w:val="17"/>
+                <w:color w:val="334155"/>
+                <w:sz w:val="20"/>
               </w:rPr>
-              <w:t xml:space="preserve"> (Mar 2024 – May 2024)</w:t>
+              <w:t xml:space="preserve">  •  Mar 2024 – May 2024</w:t>
             </w:r>
           </w:p>
           <w:p>
             <w:pPr>
-              <w:spacing w:before="0" w:after="10"/>
+              <w:spacing w:before="0" w:after="0" w:line="252" w:lineRule="auto"/>
             </w:pPr>
             <w:r>
               <w:rPr>
                 <w:b/>
-                <w:sz w:val="17"/>
+                <w:sz w:val="21"/>
               </w:rPr>
               <w:t xml:space="preserve">• </w:t>
             </w:r>
@@ -384,154 +483,158 @@
               <w:rPr>
                 <w:b/>
                 <w:color w:val="0F172A"/>
-                <w:sz w:val="17"/>
+                <w:sz w:val="21"/>
               </w:rPr>
               <w:t>Appzia, Pune (1yr)</w:t>
             </w:r>
             <w:r>
               <w:rPr>
                 <w:b w:val="0"/>
-                <w:color w:val="64748B"/>
-                <w:sz w:val="17"/>
+                <w:color w:val="334155"/>
+                <w:sz w:val="20"/>
               </w:rPr>
-              <w:t xml:space="preserve"> (June 2024 – July 2025)</w:t>
+              <w:t xml:space="preserve">  •  June 2024 – July 2025</w:t>
             </w:r>
           </w:p>
         </w:tc>
         <w:tc>
           <w:tcPr>
-            <w:tcW w:w="4262" w:type="dxa"/>
+            <w:tcW w:w="4270" w:type="dxa"/>
             <w:tcMar>
-              <w:top w:w="22" w:type="dxa"/>
-              <w:bottom w:w="22" w:type="dxa"/>
-              <w:left w:w="70" w:type="dxa"/>
-              <w:right w:w="70" w:type="dxa"/>
+              <w:top w:w="46" w:type="dxa"/>
+              <w:bottom w:w="46" w:type="dxa"/>
+              <w:left w:w="85" w:type="dxa"/>
+              <w:right w:w="85" w:type="dxa"/>
             </w:tcMar>
-            <w:shd w:fill="EFF6FF"/>
+            <w:shd w:fill="F8FAFC"/>
             <w:tcBorders>
-              <w:top w:val="single" w:sz="14" w:space="0" w:color="2563EB"/>
-              <w:left w:val="single" w:sz="4" w:space="0" w:color="BFDBFE"/>
-              <w:bottom w:val="single" w:sz="4" w:space="0" w:color="BFDBFE"/>
-              <w:right w:val="single" w:sz="4" w:space="0" w:color="BFDBFE"/>
+              <w:top w:val="single" w:sz="16" w:space="0" w:color="2563EB"/>
+              <w:left w:val="single" w:sz="6" w:space="0" w:color="60A5FA"/>
+              <w:bottom w:val="single" w:sz="6" w:space="0" w:color="60A5FA"/>
+              <w:right w:val="single" w:sz="6" w:space="0" w:color="60A5FA"/>
             </w:tcBorders>
           </w:tcPr>
           <w:p>
             <w:pPr>
-              <w:spacing w:before="0" w:after="20"/>
+              <w:tabs>
+                <w:tab w:pos="4032" w:val="right"/>
+              </w:tabs>
+              <w:spacing w:before="0" w:after="36"/>
             </w:pPr>
             <w:r>
               <w:rPr>
                 <w:b/>
-                <w:color w:val="1D4ED8"/>
-                <w:sz w:val="20"/>
+                <w:color w:val="0F172A"/>
+                <w:sz w:val="25"/>
               </w:rPr>
-              <w:t xml:space="preserve">3 Shipped Titles  </w:t>
+              <w:t>3 Shipped Titles</w:t>
             </w:r>
             <w:r>
               <w:rPr>
                 <w:b/>
-                <w:color w:val="3B82F6"/>
-                <w:sz w:val="17"/>
+                <w:color w:val="64748B"/>
+                <w:sz w:val="20"/>
               </w:rPr>
-              <w:t>GOOGLE PLAY COMMERCIAL</w:t>
+              <w:tab/>
+              <w:t>GOOGLE PLAY</w:t>
             </w:r>
           </w:p>
           <w:p>
             <w:pPr>
-              <w:spacing w:before="0" w:after="10"/>
+              <w:spacing w:before="0" w:after="30" w:line="252" w:lineRule="auto"/>
             </w:pPr>
             <w:r>
               <w:rPr>
                 <w:b/>
-                <w:sz w:val="17"/>
+                <w:sz w:val="21"/>
               </w:rPr>
               <w:t xml:space="preserve">• </w:t>
             </w:r>
             <w:r>
               <w:rPr>
                 <w:b/>
-                <w:color w:val="1E3A8A"/>
-                <w:sz w:val="17"/>
+                <w:color w:val="0F172A"/>
+                <w:sz w:val="21"/>
               </w:rPr>
-              <w:t xml:space="preserve">Calm Jigsaw  </w:t>
+              <w:t xml:space="preserve">Calm Jigsaw   </w:t>
             </w:r>
-            <w:hyperlink r:id="rId13">
+            <w:hyperlink r:id="rId15">
               <w:r>
                 <w:rPr>
                   <w:rFonts w:ascii="Calibri" w:hAnsi="Calibri"/>
-                  <w:color w:val="1D4ED8"/>
+                  <w:color w:val="2563EB"/>
                   <w:u w:val="single"/>
                   <w:b/>
-                  <w:sz w:val="17"/>
-                  <w:szCs w:val="17"/>
+                  <w:sz w:val="21"/>
+                  <w:szCs w:val="21"/>
                 </w:rPr>
-                <w:t xml:space="preserve">[Store ↗]</w:t>
+                <w:t>[Store ↗]</w:t>
               </w:r>
             </w:hyperlink>
           </w:p>
           <w:p>
             <w:pPr>
-              <w:spacing w:before="0" w:after="10"/>
+              <w:spacing w:before="0" w:after="30" w:line="252" w:lineRule="auto"/>
             </w:pPr>
             <w:r>
               <w:rPr>
                 <w:b/>
-                <w:sz w:val="17"/>
+                <w:sz w:val="21"/>
               </w:rPr>
               <w:t xml:space="preserve">• </w:t>
             </w:r>
             <w:r>
               <w:rPr>
                 <w:b/>
-                <w:color w:val="1E3A8A"/>
-                <w:sz w:val="17"/>
+                <w:color w:val="0F172A"/>
+                <w:sz w:val="21"/>
               </w:rPr>
-              <w:t xml:space="preserve">MeowSweeper  </w:t>
+              <w:t xml:space="preserve">MeowSweeper   </w:t>
             </w:r>
-            <w:hyperlink r:id="rId14">
+            <w:hyperlink r:id="rId16">
               <w:r>
                 <w:rPr>
                   <w:rFonts w:ascii="Calibri" w:hAnsi="Calibri"/>
-                  <w:color w:val="1D4ED8"/>
+                  <w:color w:val="2563EB"/>
                   <w:u w:val="single"/>
                   <w:b/>
-                  <w:sz w:val="17"/>
-                  <w:szCs w:val="17"/>
+                  <w:sz w:val="21"/>
+                  <w:szCs w:val="21"/>
                 </w:rPr>
-                <w:t xml:space="preserve">[Store ↗]</w:t>
+                <w:t>[Store ↗]</w:t>
               </w:r>
             </w:hyperlink>
           </w:p>
           <w:p>
             <w:pPr>
-              <w:spacing w:before="0" w:after="10"/>
+              <w:spacing w:before="0" w:after="0" w:line="252" w:lineRule="auto"/>
             </w:pPr>
             <w:r>
               <w:rPr>
                 <w:b/>
-                <w:sz w:val="17"/>
+                <w:sz w:val="21"/>
               </w:rPr>
               <w:t xml:space="preserve">• </w:t>
             </w:r>
             <w:r>
               <w:rPr>
                 <w:b/>
-                <w:color w:val="1E3A8A"/>
-                <w:sz w:val="17"/>
+                <w:color w:val="0F172A"/>
+                <w:sz w:val="21"/>
               </w:rPr>
-              <w:t xml:space="preserve">Calm Solitaire  </w:t>
+              <w:t xml:space="preserve">Calm Solitaire   </w:t>
             </w:r>
-            <w:hyperlink r:id="rId15">
+            <w:hyperlink r:id="rId17">
               <w:r>
                 <w:rPr>
                   <w:rFonts w:ascii="Calibri" w:hAnsi="Calibri"/>
-                  <w:color w:val="1D4ED8"/>
+                  <w:color w:val="2563EB"/>
                   <w:u w:val="single"/>
                   <w:b/>
-                  <w:sz w:val="17"/>
-                  <w:szCs w:val="17"/>
+                  <w:sz w:val="21"/>
+                  <w:szCs w:val="21"/>
                 </w:rPr>
-                <w:t xml:space="preserve">[Store ↗]</w:t>
+                <w:t>[Store ↗]</w:t>
               </w:r>
             </w:hyperlink>
           </w:p>
@@ -543,63 +646,63 @@
         </w:trPr>
         <w:tc>
           <w:tcPr>
-            <w:tcW w:w="11030" w:type="dxa"/>
             <w:gridSpan w:val="2"/>
+            <w:tcW w:w="11220" w:type="dxa"/>
             <w:tcMar>
-              <w:top w:w="20" w:type="dxa"/>
-              <w:bottom w:w="20" w:type="dxa"/>
-              <w:left w:w="70" w:type="dxa"/>
-              <w:right w:w="70" w:type="dxa"/>
+              <w:top w:w="46" w:type="dxa"/>
+              <w:bottom w:w="46" w:type="dxa"/>
+              <w:left w:w="85" w:type="dxa"/>
+              <w:right w:w="85" w:type="dxa"/>
             </w:tcMar>
-            <w:shd w:fill="F0FDF4"/>
+            <w:shd w:fill="F8FAFC"/>
             <w:tcBorders>
-              <w:top w:val="single" w:sz="14" w:space="0" w:color="059669"/>
-              <w:left w:val="single" w:sz="4" w:space="0" w:color="A7F3D0"/>
-              <w:bottom w:val="single" w:sz="4" w:space="0" w:color="A7F3D0"/>
-              <w:right w:val="single" w:sz="4" w:space="0" w:color="A7F3D0"/>
+              <w:top w:val="single" w:sz="16" w:space="0" w:color="059669"/>
+              <w:left w:val="single" w:sz="6" w:space="0" w:color="34D399"/>
+              <w:bottom w:val="single" w:sz="6" w:space="0" w:color="34D399"/>
+              <w:right w:val="single" w:sz="6" w:space="0" w:color="34D399"/>
             </w:tcBorders>
           </w:tcPr>
           <w:p>
             <w:pPr>
-              <w:spacing w:before="0" w:after="20"/>
+              <w:spacing w:before="0" w:after="36"/>
             </w:pPr>
             <w:r>
               <w:rPr>
                 <w:b/>
-                <w:color w:val="065F46"/>
-                <w:sz w:val="19"/>
+                <w:color w:val="0F172A"/>
+                <w:sz w:val="25"/>
               </w:rPr>
-              <w:t xml:space="preserve">Engineered Subsystems   </w:t>
+              <w:t xml:space="preserve">Engineered Subsystems    </w:t>
             </w:r>
-            <w:hyperlink r:id="rId12">
+            <w:hyperlink r:id="rId11">
               <w:r>
                 <w:rPr>
                   <w:rFonts w:ascii="Calibri" w:hAnsi="Calibri"/>
-                  <w:color w:val="047857"/>
+                  <w:color w:val="059669"/>
                   <w:u w:val="single"/>
                   <w:b/>
-                  <w:sz w:val="17"/>
-                  <w:szCs w:val="17"/>
+                  <w:sz w:val="22"/>
+                  <w:szCs w:val="22"/>
                 </w:rPr>
-                <w:t xml:space="preserve">[Unity Playable Demo ↗]</w:t>
+                <w:t>[Unity Playable Demo ↗]</w:t>
               </w:r>
             </w:hyperlink>
           </w:p>
           <w:p>
             <w:pPr>
               <w:tabs>
-                <w:tab w:pos="2088" w:val="left"/>
-                <w:tab w:pos="4435" w:val="left"/>
-                <w:tab w:pos="6653" w:val="left"/>
-                <w:tab w:pos="8640" w:val="left"/>
+                <w:tab w:pos="2189" w:val="left"/>
+                <w:tab w:pos="4550" w:val="left"/>
+                <w:tab w:pos="6883" w:val="left"/>
+                <w:tab w:pos="8957" w:val="left"/>
               </w:tabs>
-              <w:spacing w:before="0" w:after="10"/>
+              <w:spacing w:before="0" w:after="30" w:line="252" w:lineRule="auto"/>
             </w:pPr>
             <w:r>
               <w:rPr>
                 <w:b/>
-                <w:color w:val="064E3B"/>
-                <w:sz w:val="17"/>
+                <w:color w:val="1E293B"/>
+                <w:sz w:val="21"/>
               </w:rPr>
               <w:t>• Procedural Jigsaw</w:t>
               <w:tab/>
@@ -615,18 +718,18 @@
           <w:p>
             <w:pPr>
               <w:tabs>
-                <w:tab w:pos="2088" w:val="left"/>
-                <w:tab w:pos="4435" w:val="left"/>
-                <w:tab w:pos="6653" w:val="left"/>
-                <w:tab w:pos="8640" w:val="left"/>
+                <w:tab w:pos="2189" w:val="left"/>
+                <w:tab w:pos="4550" w:val="left"/>
+                <w:tab w:pos="6883" w:val="left"/>
+                <w:tab w:pos="8957" w:val="left"/>
               </w:tabs>
-              <w:spacing w:before="0" w:after="0"/>
+              <w:spacing w:before="0" w:after="0" w:line="252" w:lineRule="auto"/>
             </w:pPr>
             <w:r>
               <w:rPr>
                 <w:b/>
-                <w:color w:val="064E3B"/>
-                <w:sz w:val="17"/>
+                <w:color w:val="1E293B"/>
+                <w:sz w:val="21"/>
               </w:rPr>
               <w:t>• Offline Leaderboard</w:t>
               <w:tab/>
@@ -647,88 +750,373 @@
         </w:trPr>
         <w:tc>
           <w:tcPr>
-            <w:tcW w:w="11030" w:type="dxa"/>
             <w:gridSpan w:val="2"/>
+            <w:tcW w:w="11220" w:type="dxa"/>
             <w:tcMar>
-              <w:top w:w="20" w:type="dxa"/>
-              <w:bottom w:w="20" w:type="dxa"/>
-              <w:left w:w="70" w:type="dxa"/>
-              <w:right w:w="70" w:type="dxa"/>
+              <w:top w:w="46" w:type="dxa"/>
+              <w:bottom w:w="46" w:type="dxa"/>
+              <w:left w:w="85" w:type="dxa"/>
+              <w:right w:w="85" w:type="dxa"/>
             </w:tcMar>
-            <w:shd w:fill="FAF5FF"/>
+            <w:shd w:fill="F8FAFC"/>
             <w:tcBorders>
-              <w:top w:val="single" w:sz="14" w:space="0" w:color="9333EA"/>
-              <w:left w:val="single" w:sz="4" w:space="0" w:color="E9D5FF"/>
-              <w:bottom w:val="single" w:sz="4" w:space="0" w:color="E9D5FF"/>
-              <w:right w:val="single" w:sz="4" w:space="0" w:color="E9D5FF"/>
+              <w:top w:val="single" w:sz="16" w:space="0" w:color="9333EA"/>
+              <w:left w:val="single" w:sz="6" w:space="0" w:color="C084FC"/>
+              <w:bottom w:val="single" w:sz="6" w:space="0" w:color="C084FC"/>
+              <w:right w:val="single" w:sz="6" w:space="0" w:color="C084FC"/>
             </w:tcBorders>
           </w:tcPr>
           <w:p>
             <w:pPr>
-              <w:spacing w:before="0" w:after="20"/>
+              <w:spacing w:before="0" w:after="36"/>
             </w:pPr>
             <w:r>
               <w:rPr>
                 <w:b/>
-                <w:color w:val="6B21A8"/>
-                <w:sz w:val="19"/>
+                <w:color w:val="0F172A"/>
+                <w:sz w:val="25"/>
               </w:rPr>
-              <w:t xml:space="preserve">Novice Prototypes   </w:t>
+              <w:t xml:space="preserve">Early-Career Prototypes    </w:t>
             </w:r>
-            <w:hyperlink r:id="rId16">
+            <w:hyperlink r:id="rId18">
+              <w:r>
+                <w:rPr>
+                  <w:rFonts w:ascii="Calibri" w:hAnsi="Calibri"/>
+                  <w:color w:val="9333EA"/>
+                  <w:u w:val="single"/>
+                  <w:b/>
+                  <w:sz w:val="22"/>
+                  <w:szCs w:val="22"/>
+                </w:rPr>
+                <w:t>[GitLab Repo ↗]</w:t>
+              </w:r>
+            </w:hyperlink>
+            <w:r>
+              <w:rPr>
+                <w:sz w:val="22"/>
+              </w:rPr>
+              <w:t xml:space="preserve">    </w:t>
+            </w:r>
+            <w:hyperlink r:id="rId19">
+              <w:r>
+                <w:rPr>
+                  <w:rFonts w:ascii="Calibri" w:hAnsi="Calibri"/>
+                  <w:color w:val="9333EA"/>
+                  <w:u w:val="single"/>
+                  <w:b/>
+                  <w:sz w:val="22"/>
+                  <w:szCs w:val="22"/>
+                </w:rPr>
+                <w:t>[Demos ↗]</w:t>
+              </w:r>
+            </w:hyperlink>
+          </w:p>
+          <w:p>
+            <w:pPr>
+              <w:spacing w:before="0" w:after="0" w:line="252" w:lineRule="auto"/>
+            </w:pPr>
+            <w:hyperlink r:id="rId20">
               <w:r>
                 <w:rPr>
                   <w:rFonts w:ascii="Calibri" w:hAnsi="Calibri"/>
                   <w:color w:val="7E22CE"/>
                   <w:u w:val="single"/>
                   <w:b/>
-                  <w:sz w:val="17"/>
-                  <w:szCs w:val="17"/>
+                  <w:sz w:val="21"/>
+                  <w:szCs w:val="21"/>
                 </w:rPr>
-                <w:t xml:space="preserve">[GitHub Repo ↗]</w:t>
+                <w:t>This Is Blast</w:t>
+              </w:r>
+              <w:r>
+                <w:rPr>
+                  <w:rFonts w:ascii="Calibri" w:hAnsi="Calibri"/>
+                  <w:sz w:val="19"/>
+                </w:rPr>
+                <w:t xml:space="preserve"> </w:t>
+              </w:r>
+              <w:r>
+                <w:drawing>
+                  <wp:inline xmlns:a="http://schemas.openxmlformats.org/drawingml/2006/main" xmlns:pic="http://schemas.openxmlformats.org/drawingml/2006/picture">
+                    <wp:extent cx="111760" cy="111760"/>
+                    <wp:docPr id="1" name="Picture 1"/>
+                    <wp:cNvGraphicFramePr>
+                      <a:graphicFrameLocks noChangeAspect="1"/>
+                    </wp:cNvGraphicFramePr>
+                    <a:graphic>
+                      <a:graphicData uri="http://schemas.openxmlformats.org/drawingml/2006/picture">
+                        <pic:pic>
+                          <pic:nvPicPr>
+                            <pic:cNvPr id="0" name="github_icon.png"/>
+                            <pic:cNvPicPr/>
+                          </pic:nvPicPr>
+                          <pic:blipFill>
+                            <a:blip r:embed="rId21"/>
+                            <a:stretch>
+                              <a:fillRect/>
+                            </a:stretch>
+                          </pic:blipFill>
+                          <pic:spPr>
+                            <a:xfrm>
+                              <a:off x="0" y="0"/>
+                              <a:ext cx="111760" cy="111760"/>
+                            </a:xfrm>
+                            <a:prstGeom prst="rect"/>
+                          </pic:spPr>
+                        </pic:pic>
+                      </a:graphicData>
+                    </a:graphic>
+                  </wp:inline>
+                </w:drawing>
               </w:r>
             </w:hyperlink>
             <w:r>
               <w:rPr>
-                <w:sz w:val="17"/>
+                <w:color w:val="94A3B8"/>
+                <w:sz w:val="21"/>
               </w:rPr>
-              <w:t xml:space="preserve">   </w:t>
+              <w:t xml:space="preserve">   •   </w:t>
             </w:r>
-            <w:hyperlink r:id="rId17">
+            <w:hyperlink r:id="rId22">
               <w:r>
                 <w:rPr>
                   <w:rFonts w:ascii="Calibri" w:hAnsi="Calibri"/>
                   <w:color w:val="7E22CE"/>
                   <w:u w:val="single"/>
                   <w:b/>
-                  <w:sz w:val="17"/>
-                  <w:szCs w:val="17"/>
+                  <w:sz w:val="21"/>
+                  <w:szCs w:val="21"/>
                 </w:rPr>
-                <w:t xml:space="preserve">[Demos ↗]</w:t>
+                <w:t>Arrow Strike</w:t>
               </w:r>
-            </w:hyperlink>
-          </w:p>
-          <w:p>
-            <w:pPr>
-              <w:spacing w:before="0" w:after="0"/>
-            </w:pPr>
-            <w:hyperlink r:id="rId18">
               <w:r>
                 <w:rPr>
                   <w:rFonts w:ascii="Calibri" w:hAnsi="Calibri"/>
-                  <w:color w:val="6B21A8"/>
-                  <w:u w:val="single"/>
-                  <w:b/>
-                  <w:sz w:val="17"/>
-                  <w:szCs w:val="17"/>
+                  <w:sz w:val="19"/>
                 </w:rPr>
-                <w:t xml:space="preserve">This Is Blast ↗</w:t>
+                <w:t xml:space="preserve"> </w:t>
+              </w:r>
+              <w:r>
+                <w:drawing>
+                  <wp:inline xmlns:a="http://schemas.openxmlformats.org/drawingml/2006/main" xmlns:pic="http://schemas.openxmlformats.org/drawingml/2006/picture">
+                    <wp:extent cx="111760" cy="111760"/>
+                    <wp:docPr id="2" name="Picture 2"/>
+                    <wp:cNvGraphicFramePr>
+                      <a:graphicFrameLocks noChangeAspect="1"/>
+                    </wp:cNvGraphicFramePr>
+                    <a:graphic>
+                      <a:graphicData uri="http://schemas.openxmlformats.org/drawingml/2006/picture">
+                        <pic:pic>
+                          <pic:nvPicPr>
+                            <pic:cNvPr id="0" name="github_icon.png"/>
+                            <pic:cNvPicPr/>
+                          </pic:nvPicPr>
+                          <pic:blipFill>
+                            <a:blip r:embed="rId21"/>
+                            <a:stretch>
+                              <a:fillRect/>
+                            </a:stretch>
+                          </pic:blipFill>
+                          <pic:spPr>
+                            <a:xfrm>
+                              <a:off x="0" y="0"/>
+                              <a:ext cx="111760" cy="111760"/>
+                            </a:xfrm>
+                            <a:prstGeom prst="rect"/>
+                          </pic:spPr>
+                        </pic:pic>
+                      </a:graphicData>
+                    </a:graphic>
+                  </wp:inline>
+                </w:drawing>
               </w:r>
             </w:hyperlink>
             <w:r>
               <w:rPr>
-                <w:color w:val="9333EA"/>
-                <w:sz w:val="17"/>
+                <w:color w:val="94A3B8"/>
+                <w:sz w:val="21"/>
+              </w:rPr>
+              <w:t xml:space="preserve">   •   </w:t>
+            </w:r>
+            <w:hyperlink r:id="rId23">
+              <w:r>
+                <w:rPr>
+                  <w:rFonts w:ascii="Calibri" w:hAnsi="Calibri"/>
+                  <w:color w:val="7E22CE"/>
+                  <w:u w:val="single"/>
+                  <w:b/>
+                  <w:sz w:val="21"/>
+                  <w:szCs w:val="21"/>
+                </w:rPr>
+                <w:t>Tank Battle</w:t>
+              </w:r>
+              <w:r>
+                <w:rPr>
+                  <w:rFonts w:ascii="Calibri" w:hAnsi="Calibri"/>
+                  <w:sz w:val="19"/>
+                </w:rPr>
+                <w:t xml:space="preserve"> </w:t>
+              </w:r>
+              <w:r>
+                <w:drawing>
+                  <wp:inline xmlns:a="http://schemas.openxmlformats.org/drawingml/2006/main" xmlns:pic="http://schemas.openxmlformats.org/drawingml/2006/picture">
+                    <wp:extent cx="111760" cy="111760"/>
+                    <wp:docPr id="3" name="Picture 3"/>
+                    <wp:cNvGraphicFramePr>
+                      <a:graphicFrameLocks noChangeAspect="1"/>
+                    </wp:cNvGraphicFramePr>
+                    <a:graphic>
+                      <a:graphicData uri="http://schemas.openxmlformats.org/drawingml/2006/picture">
+                        <pic:pic>
+                          <pic:nvPicPr>
+                            <pic:cNvPr id="0" name="github_icon.png"/>
+                            <pic:cNvPicPr/>
+                          </pic:nvPicPr>
+                          <pic:blipFill>
+                            <a:blip r:embed="rId21"/>
+                            <a:stretch>
+                              <a:fillRect/>
+                            </a:stretch>
+                          </pic:blipFill>
+                          <pic:spPr>
+                            <a:xfrm>
+                              <a:off x="0" y="0"/>
+                              <a:ext cx="111760" cy="111760"/>
+                            </a:xfrm>
+                            <a:prstGeom prst="rect"/>
+                          </pic:spPr>
+                        </pic:pic>
+                      </a:graphicData>
+                    </a:graphic>
+                  </wp:inline>
+                </w:drawing>
+              </w:r>
+            </w:hyperlink>
+            <w:r>
+              <w:rPr>
+                <w:color w:val="94A3B8"/>
+                <w:sz w:val="21"/>
+              </w:rPr>
+              <w:t xml:space="preserve">   •   </w:t>
+            </w:r>
+            <w:hyperlink r:id="rId24">
+              <w:r>
+                <w:rPr>
+                  <w:rFonts w:ascii="Calibri" w:hAnsi="Calibri"/>
+                  <w:color w:val="7E22CE"/>
+                  <w:u w:val="single"/>
+                  <w:b/>
+                  <w:sz w:val="21"/>
+                  <w:szCs w:val="21"/>
+                </w:rPr>
+                <w:t>Bullet Chess</w:t>
+              </w:r>
+              <w:r>
+                <w:rPr>
+                  <w:rFonts w:ascii="Calibri" w:hAnsi="Calibri"/>
+                  <w:sz w:val="19"/>
+                </w:rPr>
+                <w:t xml:space="preserve"> </w:t>
+              </w:r>
+              <w:r>
+                <w:drawing>
+                  <wp:inline xmlns:a="http://schemas.openxmlformats.org/drawingml/2006/main" xmlns:pic="http://schemas.openxmlformats.org/drawingml/2006/picture">
+                    <wp:extent cx="111760" cy="111760"/>
+                    <wp:docPr id="4" name="Picture 4"/>
+                    <wp:cNvGraphicFramePr>
+                      <a:graphicFrameLocks noChangeAspect="1"/>
+                    </wp:cNvGraphicFramePr>
+                    <a:graphic>
+                      <a:graphicData uri="http://schemas.openxmlformats.org/drawingml/2006/picture">
+                        <pic:pic>
+                          <pic:nvPicPr>
+                            <pic:cNvPr id="0" name="github_icon.png"/>
+                            <pic:cNvPicPr/>
+                          </pic:nvPicPr>
+                          <pic:blipFill>
+                            <a:blip r:embed="rId21"/>
+                            <a:stretch>
+                              <a:fillRect/>
+                            </a:stretch>
+                          </pic:blipFill>
+                          <pic:spPr>
+                            <a:xfrm>
+                              <a:off x="0" y="0"/>
+                              <a:ext cx="111760" cy="111760"/>
+                            </a:xfrm>
+                            <a:prstGeom prst="rect"/>
+                          </pic:spPr>
+                        </pic:pic>
+                      </a:graphicData>
+                    </a:graphic>
+                  </wp:inline>
+                </w:drawing>
+              </w:r>
+            </w:hyperlink>
+            <w:r>
+              <w:rPr>
+                <w:color w:val="94A3B8"/>
+                <w:sz w:val="21"/>
+              </w:rPr>
+              <w:t xml:space="preserve">   •   </w:t>
+            </w:r>
+            <w:hyperlink r:id="rId25">
+              <w:r>
+                <w:rPr>
+                  <w:rFonts w:ascii="Calibri" w:hAnsi="Calibri"/>
+                  <w:color w:val="7E22CE"/>
+                  <w:u w:val="single"/>
+                  <w:b/>
+                  <w:sz w:val="21"/>
+                  <w:szCs w:val="21"/>
+                </w:rPr>
+                <w:t>Tycoon RTS</w:t>
+              </w:r>
+              <w:r>
+                <w:rPr>
+                  <w:rFonts w:ascii="Calibri" w:hAnsi="Calibri"/>
+                  <w:sz w:val="19"/>
+                </w:rPr>
+                <w:t xml:space="preserve"> </w:t>
+              </w:r>
+              <w:r>
+                <w:drawing>
+                  <wp:inline xmlns:a="http://schemas.openxmlformats.org/drawingml/2006/main" xmlns:pic="http://schemas.openxmlformats.org/drawingml/2006/picture">
+                    <wp:extent cx="111760" cy="111760"/>
+                    <wp:docPr id="5" name="Picture 5"/>
+                    <wp:cNvGraphicFramePr>
+                      <a:graphicFrameLocks noChangeAspect="1"/>
+                    </wp:cNvGraphicFramePr>
+                    <a:graphic>
+                      <a:graphicData uri="http://schemas.openxmlformats.org/drawingml/2006/picture">
+                        <pic:pic>
+                          <pic:nvPicPr>
+                            <pic:cNvPr id="0" name="github_icon.png"/>
+                            <pic:cNvPicPr/>
+                          </pic:nvPicPr>
+                          <pic:blipFill>
+                            <a:blip r:embed="rId21"/>
+                            <a:stretch>
+                              <a:fillRect/>
+                            </a:stretch>
+                          </pic:blipFill>
+                          <pic:spPr>
+                            <a:xfrm>
+                              <a:off x="0" y="0"/>
+                              <a:ext cx="111760" cy="111760"/>
+                            </a:xfrm>
+                            <a:prstGeom prst="rect"/>
+                          </pic:spPr>
+                        </pic:pic>
+                      </a:graphicData>
+                    </a:graphic>
+                  </wp:inline>
+                </w:drawing>
+              </w:r>
+            </w:hyperlink>
+            <w:r>
+              <w:rPr>
+                <w:color w:val="94A3B8"/>
+                <w:sz w:val="21"/>
               </w:rPr>
               <w:t xml:space="preserve">   •   </w:t>
             </w:r>
@@ -736,93 +1124,54 @@
               <w:r>
                 <w:rPr>
                   <w:rFonts w:ascii="Calibri" w:hAnsi="Calibri"/>
-                  <w:color w:val="6B21A8"/>
+                  <w:color w:val="7E22CE"/>
                   <w:u w:val="single"/>
                   <w:b/>
-                  <w:sz w:val="17"/>
-                  <w:szCs w:val="17"/>
+                  <w:sz w:val="21"/>
+                  <w:szCs w:val="21"/>
                 </w:rPr>
-                <w:t xml:space="preserve">Arrow Strike ↗</w:t>
+                <w:t>Trivologist</w:t>
               </w:r>
-            </w:hyperlink>
-            <w:r>
-              <w:rPr>
-                <w:color w:val="9333EA"/>
-                <w:sz w:val="17"/>
-              </w:rPr>
-              <w:t xml:space="preserve">   •   </w:t>
-            </w:r>
-            <w:hyperlink r:id="rId20">
               <w:r>
                 <w:rPr>
                   <w:rFonts w:ascii="Calibri" w:hAnsi="Calibri"/>
-                  <w:color w:val="6B21A8"/>
-                  <w:u w:val="single"/>
-                  <w:b/>
-                  <w:sz w:val="17"/>
-                  <w:szCs w:val="17"/>
+                  <w:sz w:val="19"/>
                 </w:rPr>
-                <w:t xml:space="preserve">Tank Battle 3D ↗</w:t>
+                <w:t xml:space="preserve"> </w:t>
               </w:r>
-            </w:hyperlink>
-            <w:r>
-              <w:rPr>
-                <w:color w:val="9333EA"/>
-                <w:sz w:val="17"/>
-              </w:rPr>
-              <w:t xml:space="preserve">   •   </w:t>
-            </w:r>
-            <w:hyperlink r:id="rId21">
               <w:r>
-                <w:rPr>
-                  <w:rFonts w:ascii="Calibri" w:hAnsi="Calibri"/>
-                  <w:color w:val="6B21A8"/>
-                  <w:u w:val="single"/>
-                  <w:b/>
-                  <w:sz w:val="17"/>
-                  <w:szCs w:val="17"/>
-                </w:rPr>
-                <w:t xml:space="preserve">Bullet Chess ↗</w:t>
-              </w:r>
-            </w:hyperlink>
-            <w:r>
-              <w:rPr>
-                <w:color w:val="9333EA"/>
-                <w:sz w:val="17"/>
-              </w:rPr>
-              <w:t xml:space="preserve">   •   </w:t>
-            </w:r>
-            <w:hyperlink r:id="rId22">
-              <w:r>
-                <w:rPr>
-                  <w:rFonts w:ascii="Calibri" w:hAnsi="Calibri"/>
-                  <w:color w:val="6B21A8"/>
-                  <w:u w:val="single"/>
-                  <w:b/>
-                  <w:sz w:val="17"/>
-                  <w:szCs w:val="17"/>
-                </w:rPr>
-                <w:t xml:space="preserve">Tycoon RTS ↗</w:t>
-              </w:r>
-            </w:hyperlink>
-            <w:r>
-              <w:rPr>
-                <w:color w:val="9333EA"/>
-                <w:sz w:val="17"/>
-              </w:rPr>
-              <w:t xml:space="preserve">   •   </w:t>
-            </w:r>
-            <w:hyperlink r:id="rId17">
-              <w:r>
-                <w:rPr>
-                  <w:rFonts w:ascii="Calibri" w:hAnsi="Calibri"/>
-                  <w:color w:val="6B21A8"/>
-                  <w:u w:val="single"/>
-                  <w:b/>
-                  <w:sz w:val="17"/>
-                  <w:szCs w:val="17"/>
-                </w:rPr>
-                <w:t xml:space="preserve">Trivologist ↗</w:t>
+                <w:drawing>
+                  <wp:inline xmlns:a="http://schemas.openxmlformats.org/drawingml/2006/main" xmlns:pic="http://schemas.openxmlformats.org/drawingml/2006/picture">
+                    <wp:extent cx="111760" cy="111760"/>
+                    <wp:docPr id="6" name="Picture 6"/>
+                    <wp:cNvGraphicFramePr>
+                      <a:graphicFrameLocks noChangeAspect="1"/>
+                    </wp:cNvGraphicFramePr>
+                    <a:graphic>
+                      <a:graphicData uri="http://schemas.openxmlformats.org/drawingml/2006/picture">
+                        <pic:pic>
+                          <pic:nvPicPr>
+                            <pic:cNvPr id="0" name="github_icon.png"/>
+                            <pic:cNvPicPr/>
+                          </pic:nvPicPr>
+                          <pic:blipFill>
+                            <a:blip r:embed="rId21"/>
+                            <a:stretch>
+                              <a:fillRect/>
+                            </a:stretch>
+                          </pic:blipFill>
+                          <pic:spPr>
+                            <a:xfrm>
+                              <a:off x="0" y="0"/>
+                              <a:ext cx="111760" cy="111760"/>
+                            </a:xfrm>
+                            <a:prstGeom prst="rect"/>
+                          </pic:spPr>
+                        </pic:pic>
+                      </a:graphicData>
+                    </a:graphic>
+                  </wp:inline>
+                </w:drawing>
               </w:r>
             </w:hyperlink>
           </w:p>
@@ -831,353 +1180,34 @@
     </w:tbl>
     <w:p>
       <w:pPr>
-        <w:spacing w:before="70" w:after="30"/>
+        <w:keepNext/>
+        <w:tabs>
+          <w:tab w:pos="11318" w:val="right"/>
+        </w:tabs>
+        <w:spacing w:before="90" w:after="50"/>
         <w:pBdr>
-          <w:bottom w:val="single" w:sz="6" w:space="1" w:color="CBD5E1"/>
+          <w:left w:val="single" w:sz="24" w:space="6" w:color="4F46E5"/>
+          <w:bottom w:val="single" w:sz="6" w:space="2" w:color="CBD5E1"/>
         </w:pBdr>
       </w:pPr>
       <w:r>
         <w:rPr>
+          <w:rFonts w:ascii="Calibri" w:hAnsi="Calibri"/>
           <w:b/>
           <w:color w:val="0F172A"/>
-          <w:sz w:val="19"/>
+          <w:sz w:val="24"/>
         </w:rPr>
         <w:t>PROFESSIONAL STUDIO EXPERIENCE</w:t>
       </w:r>
-    </w:p>
-    <w:p>
-      <w:pPr>
-        <w:tabs>
-          <w:tab w:pos="11030" w:val="right"/>
-        </w:tabs>
-        <w:spacing w:before="50" w:after="10"/>
-      </w:pPr>
       <w:r>
         <w:rPr>
-          <w:b/>
-          <w:color w:val="0F172A"/>
-          <w:sz w:val="20"/>
-        </w:rPr>
-        <w:t>Vasundhara Game Studio</w:t>
-      </w:r>
-      <w:r>
-        <w:rPr>
-          <w:b/>
-          <w:color w:val="334155"/>
-          <w:sz w:val="18"/>
-        </w:rPr>
-        <w:t xml:space="preserve">  |  AI Product Developer (Specialization in Unity)</w:t>
-      </w:r>
-      <w:r>
-        <w:rPr>
-          <w:b/>
-          <w:color w:val="1D4ED8"/>
-          <w:sz w:val="17"/>
+          <w:rFonts w:ascii="Calibri" w:hAnsi="Calibri"/>
+          <w:b w:val="0"/>
+          <w:color w:val="64748B"/>
+          <w:sz w:val="21"/>
         </w:rPr>
         <w:tab/>
-        <w:t>Surat, GJ  •  Dec 2024 – Jan 2025 &amp;&amp; Dec 2025 – Current</w:t>
-      </w:r>
-    </w:p>
-    <w:p>
-      <w:pPr>
-        <w:pStyle w:val="ListBullet"/>
-        <w:spacing w:before="0" w:after="16" w:line="245" w:lineRule="auto"/>
-        <w:ind w:left="259" w:hanging="202"/>
-      </w:pPr>
-      <w:r>
-        <w:rPr>
-          <w:b/>
-          <w:color w:val="0F172A"/>
-          <w:sz w:val="18"/>
-        </w:rPr>
-        <w:t xml:space="preserve">Procedural Jigsaw Engine (Calm Jigsaw): </w:t>
-      </w:r>
-      <w:r>
-        <w:rPr>
-          <w:color w:val="334155"/>
-          <w:sz w:val="18"/>
-        </w:rPr>
-        <w:t>Architected algorithmic N×N puzzle generator using 9 mathematical shape signatures, eliminating static art dependencies with dynamic UV quad generation.</w:t>
-      </w:r>
-    </w:p>
-    <w:p>
-      <w:pPr>
-        <w:pStyle w:val="ListBullet"/>
-        <w:spacing w:before="0" w:after="16" w:line="245" w:lineRule="auto"/>
-        <w:ind w:left="259" w:hanging="202"/>
-      </w:pPr>
-      <w:r>
-        <w:rPr>
-          <w:b/>
-          <w:color w:val="0F172A"/>
-          <w:sz w:val="18"/>
-        </w:rPr>
-        <w:t xml:space="preserve">Native Image Bridge &amp; OTA Sync: </w:t>
-      </w:r>
-      <w:r>
-        <w:rPr>
-          <w:color w:val="334155"/>
-          <w:sz w:val="18"/>
-        </w:rPr>
-        <w:t>Engineered C# bridge over native Android/iOS APIs for remote image caching, 3-tier downsampling, and non-blocking OTA manifest level delivery.</w:t>
-      </w:r>
-    </w:p>
-    <w:p>
-      <w:pPr>
-        <w:pStyle w:val="ListBullet"/>
-        <w:spacing w:before="0" w:after="16" w:line="245" w:lineRule="auto"/>
-        <w:ind w:left="259" w:hanging="202"/>
-      </w:pPr>
-      <w:r>
-        <w:rPr>
-          <w:b/>
-          <w:color w:val="0F172A"/>
-          <w:sz w:val="18"/>
-        </w:rPr>
-        <w:t xml:space="preserve">Deterministic Logic (MeowSweeper): </w:t>
-      </w:r>
-      <w:r>
-        <w:rPr>
-          <w:color w:val="334155"/>
-          <w:sz w:val="18"/>
-        </w:rPr>
-        <w:t>Implemented backtracking Sudoku solver state machine, interactive cat mechanics, and persistent powerup transaction wallet.</w:t>
-      </w:r>
-    </w:p>
-    <w:p>
-      <w:pPr>
-        <w:pStyle w:val="ListBullet"/>
-        <w:spacing w:before="0" w:after="16" w:line="245" w:lineRule="auto"/>
-        <w:ind w:left="259" w:hanging="202"/>
-      </w:pPr>
-      <w:r>
-        <w:rPr>
-          <w:b/>
-          <w:color w:val="0F172A"/>
-          <w:sz w:val="18"/>
-        </w:rPr>
-        <w:t xml:space="preserve">Zero-Cost Offline Leaderboard: </w:t>
-      </w:r>
-      <w:r>
-        <w:rPr>
-          <w:color w:val="334155"/>
-          <w:sz w:val="18"/>
-        </w:rPr>
-        <w:t>Engineered on-device simulated competitive seasons with bot population generation, dynamic rank tiers, and idempotent reward verification with zero backend costs.</w:t>
-      </w:r>
-    </w:p>
-    <w:p>
-      <w:pPr>
-        <w:pStyle w:val="ListBullet"/>
-        <w:spacing w:before="0" w:after="16" w:line="245" w:lineRule="auto"/>
-        <w:ind w:left="259" w:hanging="202"/>
-      </w:pPr>
-      <w:r>
-        <w:rPr>
-          <w:b/>
-          <w:color w:val="0F172A"/>
-          <w:sz w:val="18"/>
-        </w:rPr>
-        <w:t xml:space="preserve">Additional Systems &amp; Tooling: </w:t>
-      </w:r>
-      <w:r>
-        <w:rPr>
-          <w:color w:val="334155"/>
-          <w:sz w:val="18"/>
-        </w:rPr>
-        <w:t>Developed hybrid mechanics (Calm Solitaire), Apple/Google IAP transaction state, and automated Argos IPC tool for offline multi-language localization.</w:t>
-      </w:r>
-    </w:p>
-    <w:p>
-      <w:pPr>
-        <w:tabs>
-          <w:tab w:pos="11030" w:val="right"/>
-        </w:tabs>
-        <w:spacing w:before="50" w:after="10"/>
-      </w:pPr>
-      <w:r>
-        <w:rPr>
-          <w:b/>
-          <w:color w:val="0F172A"/>
-          <w:sz w:val="20"/>
-        </w:rPr>
-        <w:t>Appzia</w:t>
-      </w:r>
-      <w:r>
-        <w:rPr>
-          <w:b/>
-          <w:color w:val="334155"/>
-          <w:sz w:val="18"/>
-        </w:rPr>
-        <w:t xml:space="preserve">  |  Unity3D Systems &amp; Gameplay Developer</w:t>
-      </w:r>
-      <w:r>
-        <w:rPr>
-          <w:b w:val="0"/>
-          <w:color w:val="64748B"/>
-          <w:sz w:val="17"/>
-        </w:rPr>
-        <w:tab/>
-        <w:t>Pune, India  •  June 2024 – July 2025</w:t>
-      </w:r>
-    </w:p>
-    <w:p>
-      <w:pPr>
-        <w:pStyle w:val="ListBullet"/>
-        <w:spacing w:before="0" w:after="16" w:line="245" w:lineRule="auto"/>
-        <w:ind w:left="259" w:hanging="202"/>
-      </w:pPr>
-      <w:r>
-        <w:rPr>
-          <w:b/>
-          <w:color w:val="0F172A"/>
-          <w:sz w:val="18"/>
-        </w:rPr>
-        <w:t xml:space="preserve">Stockfish AI &amp; Real-Time Chess (Bullet Chess): </w:t>
-      </w:r>
-      <w:r>
-        <w:rPr>
-          <w:color w:val="334155"/>
-          <w:sz w:val="18"/>
-        </w:rPr>
-        <w:t>Architected fast-paced multiplayer chess engine integrated with Stockfish API for live move evaluation, client-side board validation, low-latency clock synchronization, and dynamic tournament brackets.</w:t>
-      </w:r>
-    </w:p>
-    <w:p>
-      <w:pPr>
-        <w:pStyle w:val="ListBullet"/>
-        <w:spacing w:before="0" w:after="16" w:line="245" w:lineRule="auto"/>
-        <w:ind w:left="259" w:hanging="202"/>
-      </w:pPr>
-      <w:r>
-        <w:rPr>
-          <w:b/>
-          <w:color w:val="0F172A"/>
-          <w:sz w:val="18"/>
-        </w:rPr>
-        <w:t xml:space="preserve">Arcade Simulation &amp; Economy Systems (Pinnacle): </w:t>
-      </w:r>
-      <w:r>
-        <w:rPr>
-          <w:color w:val="334155"/>
-          <w:sz w:val="18"/>
-        </w:rPr>
-        <w:t>Led development of Pinnacle gaming simulation replicating physical machines, implementing deterministic state machines, secure Apple/Google In-App Purchases (IAP), and memory pooling locked at 60 FPS.</w:t>
-      </w:r>
-    </w:p>
-    <w:p>
-      <w:pPr>
-        <w:tabs>
-          <w:tab w:pos="11030" w:val="right"/>
-        </w:tabs>
-        <w:spacing w:before="50" w:after="10"/>
-      </w:pPr>
-      <w:r>
-        <w:rPr>
-          <w:b/>
-          <w:color w:val="0F172A"/>
-          <w:sz w:val="20"/>
-        </w:rPr>
-        <w:t>StudioKrew</w:t>
-      </w:r>
-      <w:r>
-        <w:rPr>
-          <w:b/>
-          <w:color w:val="334155"/>
-          <w:sz w:val="18"/>
-        </w:rPr>
-        <w:t xml:space="preserve">  |  Unity Game Developer (Remote)</w:t>
-      </w:r>
-      <w:r>
-        <w:rPr>
-          <w:b w:val="0"/>
-          <w:color w:val="64748B"/>
-          <w:sz w:val="17"/>
-        </w:rPr>
-        <w:tab/>
-        <w:t>Delhi, India (Remote)  •  March 2024 – May 2024</w:t>
-      </w:r>
-    </w:p>
-    <w:p>
-      <w:pPr>
-        <w:pStyle w:val="ListBullet"/>
-        <w:spacing w:before="0" w:after="16" w:line="245" w:lineRule="auto"/>
-        <w:ind w:left="259" w:hanging="202"/>
-      </w:pPr>
-      <w:r>
-        <w:rPr>
-          <w:b/>
-          <w:color w:val="0F172A"/>
-          <w:sz w:val="18"/>
-        </w:rPr>
-        <w:t xml:space="preserve">Solo Card Game Architecture (FreeCell &amp; Solitaire): </w:t>
-      </w:r>
-      <w:r>
-        <w:rPr>
-          <w:color w:val="334155"/>
-          <w:sz w:val="18"/>
-        </w:rPr>
-        <w:t>Delivered complete end-to-end development independently, architecting deterministic card stack rules, memento-based undo/redo state history, and responsive touch controls.</w:t>
-      </w:r>
-    </w:p>
-    <w:p>
-      <w:pPr>
-        <w:pStyle w:val="ListBullet"/>
-        <w:spacing w:before="0" w:after="16" w:line="245" w:lineRule="auto"/>
-        <w:ind w:left="259" w:hanging="202"/>
-      </w:pPr>
-      <w:r>
-        <w:rPr>
-          <w:b/>
-          <w:color w:val="0F172A"/>
-          <w:sz w:val="18"/>
-        </w:rPr>
-        <w:t xml:space="preserve">Dice Physics &amp; Scoring State Machine (Yahtzee): </w:t>
-      </w:r>
-      <w:r>
-        <w:rPr>
-          <w:color w:val="334155"/>
-          <w:sz w:val="18"/>
-        </w:rPr>
-        <w:t>Engineered probabilistic dice-rolling physics, category score validation state machines, and turn-based round flow with fluid particle animations.</w:t>
-      </w:r>
-    </w:p>
-    <w:p>
-      <w:pPr>
-        <w:pStyle w:val="ListBullet"/>
-        <w:spacing w:before="0" w:after="16" w:line="245" w:lineRule="auto"/>
-        <w:ind w:left="259" w:hanging="202"/>
-      </w:pPr>
-      <w:r>
-        <w:rPr>
-          <w:b/>
-          <w:color w:val="0F172A"/>
-          <w:sz w:val="18"/>
-        </w:rPr>
-        <w:t xml:space="preserve">Grid Puzzle Engine &amp; Serialization (BrokenTiles): </w:t>
-      </w:r>
-      <w:r>
-        <w:rPr>
-          <w:color w:val="334155"/>
-          <w:sz w:val="18"/>
-        </w:rPr>
-        <w:t>Developed reactive grid-matching algorithms with cascading tile clearing, implementing lightweight JSON save serialization for instant session recovery.</w:t>
-      </w:r>
-    </w:p>
-    <w:p>
-      <w:pPr>
-        <w:spacing w:before="70" w:after="40"/>
-        <w:pBdr>
-          <w:bottom w:val="single" w:sz="6" w:space="1" w:color="CBD5E1"/>
-        </w:pBdr>
-      </w:pPr>
-      <w:r>
-        <w:rPr>
-          <w:b/>
-          <w:color w:val="0F172A"/>
-          <w:sz w:val="19"/>
-        </w:rPr>
-        <w:t>TECHNICAL SKILLS &amp; ENGINE STACK</w:t>
+        <w:t>Commercial Production Roles &amp; Systems</w:t>
       </w:r>
     </w:p>
     <w:tbl>
@@ -1188,9 +1218,7 @@
         <w:tblLook w:firstColumn="1" w:firstRow="1" w:lastColumn="0" w:lastRow="0" w:noHBand="0" w:noVBand="1" w:val="04A0"/>
       </w:tblPr>
       <w:tblGrid>
-        <w:gridCol w:w="3676"/>
-        <w:gridCol w:w="3676"/>
-        <w:gridCol w:w="3676"/>
+        <w:gridCol w:w="11318"/>
       </w:tblGrid>
       <w:tr>
         <w:trPr>
@@ -1198,130 +1226,771 @@
         </w:trPr>
         <w:tc>
           <w:tcPr>
-            <w:tcW w:w="3676" w:type="dxa"/>
+            <w:tcW w:w="11318" w:type="dxa"/>
             <w:shd w:fill="F8FAFC"/>
             <w:tcBorders>
-              <w:top w:val="single" w:sz="12" w:space="0" w:color="2563EB"/>
-              <w:left w:val="single" w:sz="4" w:space="0" w:color="BFDBFE"/>
-              <w:bottom w:val="single" w:sz="4" w:space="0" w:color="BFDBFE"/>
-              <w:right w:val="single" w:sz="4" w:space="0" w:color="BFDBFE"/>
+              <w:top w:val="single" w:sz="16" w:space="0" w:color="2563EB"/>
+              <w:left w:val="single" w:sz="6" w:space="0" w:color="60A5FA"/>
+              <w:bottom w:val="single" w:sz="6" w:space="0" w:color="60A5FA"/>
+              <w:right w:val="single" w:sz="6" w:space="0" w:color="60A5FA"/>
             </w:tcBorders>
             <w:tcMar>
-              <w:top w:w="16" w:type="dxa"/>
-              <w:bottom w:w="16" w:type="dxa"/>
-              <w:left w:w="60" w:type="dxa"/>
-              <w:right w:w="60" w:type="dxa"/>
+              <w:top w:w="46" w:type="dxa"/>
+              <w:bottom w:w="46" w:type="dxa"/>
+              <w:left w:w="90" w:type="dxa"/>
+              <w:right w:w="90" w:type="dxa"/>
             </w:tcMar>
           </w:tcPr>
           <w:p>
             <w:pPr>
-              <w:spacing w:before="0" w:after="10"/>
+              <w:tabs>
+                <w:tab w:pos="10872" w:val="right"/>
+              </w:tabs>
+              <w:spacing w:before="0" w:after="20"/>
             </w:pPr>
             <w:r>
               <w:rPr>
                 <w:b/>
                 <w:color w:val="0F172A"/>
-                <w:sz w:val="17"/>
+                <w:sz w:val="26"/>
+              </w:rPr>
+              <w:t>Vasundhara Game Studio</w:t>
+            </w:r>
+            <w:r>
+              <w:rPr>
+                <w:color w:val="94A3B8"/>
+                <w:sz w:val="24"/>
+              </w:rPr>
+              <w:t xml:space="preserve">   |   </w:t>
+            </w:r>
+            <w:r>
+              <w:rPr>
+                <w:b/>
+                <w:color w:val="334155"/>
+                <w:sz w:val="24"/>
+              </w:rPr>
+              <w:t>AI Product Developer — Unity Systems &amp; Gameplay</w:t>
+            </w:r>
+            <w:r>
+              <w:rPr>
+                <w:b/>
+                <w:color w:val="059669"/>
+                <w:sz w:val="21"/>
+              </w:rPr>
+              <w:tab/>
+              <w:t>[ CURRENT ]</w:t>
+            </w:r>
+          </w:p>
+          <w:p>
+            <w:pPr>
+              <w:spacing w:before="0" w:after="50"/>
+              <w:pBdr>
+                <w:bottom w:val="single" w:sz="4" w:space="2" w:color="CBD5E1"/>
+              </w:pBdr>
+            </w:pPr>
+            <w:r>
+              <w:rPr>
+                <w:color w:val="64748B"/>
+                <w:sz w:val="21"/>
+              </w:rPr>
+              <w:t xml:space="preserve">Surat, GJ   •   </w:t>
+            </w:r>
+            <w:r>
+              <w:rPr>
+                <w:b/>
+                <w:color w:val="0F172A"/>
+                <w:sz w:val="21"/>
+              </w:rPr>
+              <w:t>Dec 2024 – Jan 2025 &amp; Dec 2025 – Present</w:t>
+            </w:r>
+          </w:p>
+          <w:p>
+            <w:pPr>
+              <w:spacing w:before="0" w:after="32" w:line="252" w:lineRule="auto"/>
+              <w:ind w:left="230" w:hanging="202"/>
+            </w:pPr>
+            <w:r>
+              <w:rPr>
+                <w:b/>
+                <w:color w:val="2563EB"/>
+                <w:sz w:val="22"/>
+              </w:rPr>
+              <w:t xml:space="preserve">•  </w:t>
+            </w:r>
+            <w:r>
+              <w:rPr>
+                <w:b/>
+                <w:color w:val="0F172A"/>
+                <w:sz w:val="22"/>
+              </w:rPr>
+              <w:t xml:space="preserve">Procedural Jigsaw &amp; Shader Mask (Calm Jigsaw): </w:t>
+            </w:r>
+            <w:r>
+              <w:rPr>
+                <w:color w:val="334155"/>
+                <w:sz w:val="22"/>
+              </w:rPr>
+              <w:t>Architected N×N Bezier puzzle generator using 9 mathematical edge signatures, dynamic UV quad mesh generation, and custom URP/HLSL shader masking with zero pre-sliced art.</w:t>
+            </w:r>
+          </w:p>
+          <w:p>
+            <w:pPr>
+              <w:spacing w:before="0" w:after="32" w:line="252" w:lineRule="auto"/>
+              <w:ind w:left="230" w:hanging="202"/>
+            </w:pPr>
+            <w:r>
+              <w:rPr>
+                <w:b/>
+                <w:color w:val="2563EB"/>
+                <w:sz w:val="22"/>
+              </w:rPr>
+              <w:t xml:space="preserve">•  </w:t>
+            </w:r>
+            <w:r>
+              <w:rPr>
+                <w:b/>
+                <w:color w:val="0F172A"/>
+                <w:sz w:val="22"/>
+              </w:rPr>
+              <w:t xml:space="preserve">Native Image Bridge &amp; OTA Sync: </w:t>
+            </w:r>
+            <w:r>
+              <w:rPr>
+                <w:color w:val="334155"/>
+                <w:sz w:val="22"/>
+              </w:rPr>
+              <w:t>Engineered C# bridge over native Android (JNI) / iOS (Obj-C) APIs for 3-tier RAM LRU and disk caching, texture downsampling, and non-blocking OTA manifest level delivery.</w:t>
+            </w:r>
+          </w:p>
+          <w:p>
+            <w:pPr>
+              <w:spacing w:before="0" w:after="32" w:line="252" w:lineRule="auto"/>
+              <w:ind w:left="230" w:hanging="202"/>
+            </w:pPr>
+            <w:r>
+              <w:rPr>
+                <w:b/>
+                <w:color w:val="2563EB"/>
+                <w:sz w:val="22"/>
+              </w:rPr>
+              <w:t xml:space="preserve">•  </w:t>
+            </w:r>
+            <w:r>
+              <w:rPr>
+                <w:b/>
+                <w:color w:val="0F172A"/>
+                <w:sz w:val="22"/>
+              </w:rPr>
+              <w:t xml:space="preserve">Hybrid Logic &amp; Hint-Cascade Solver (MeowSweeper): </w:t>
+            </w:r>
+            <w:r>
+              <w:rPr>
+                <w:color w:val="334155"/>
+                <w:sz w:val="22"/>
+              </w:rPr>
+              <w:t>Built hybrid Sudoku/Minesweeper/Star-Battle puzzle engine with backtracking hint-cascade solver FSM, discrete multi-touch locks, and persistent IAP powerup wallet.</w:t>
+            </w:r>
+          </w:p>
+          <w:p>
+            <w:pPr>
+              <w:spacing w:before="0" w:after="32" w:line="252" w:lineRule="auto"/>
+              <w:ind w:left="230" w:hanging="202"/>
+            </w:pPr>
+            <w:r>
+              <w:rPr>
+                <w:b/>
+                <w:color w:val="2563EB"/>
+                <w:sz w:val="22"/>
+              </w:rPr>
+              <w:t xml:space="preserve">•  </w:t>
+            </w:r>
+            <w:r>
+              <w:rPr>
+                <w:b/>
+                <w:color w:val="0F172A"/>
+                <w:sz w:val="22"/>
+              </w:rPr>
+              <w:t xml:space="preserve">Card Seam Merging &amp; Arrow Mechanics (Calm Solitaire &amp; Arrow): </w:t>
+            </w:r>
+            <w:r>
+              <w:rPr>
+                <w:color w:val="334155"/>
+                <w:sz w:val="22"/>
+              </w:rPr>
+              <w:t>Engineered rectangular card-grid 0px seam merging, displacement swapping, procedural flame noise shaders, and outside-in peeling arrow escape mechanics.</w:t>
+            </w:r>
+          </w:p>
+          <w:p>
+            <w:pPr>
+              <w:spacing w:before="0" w:after="0" w:line="252" w:lineRule="auto"/>
+              <w:ind w:left="230" w:hanging="202"/>
+            </w:pPr>
+            <w:r>
+              <w:rPr>
+                <w:b/>
+                <w:color w:val="2563EB"/>
+                <w:sz w:val="22"/>
+              </w:rPr>
+              <w:t xml:space="preserve">•  </w:t>
+            </w:r>
+            <w:r>
+              <w:rPr>
+                <w:b/>
+                <w:color w:val="0F172A"/>
+                <w:sz w:val="22"/>
+              </w:rPr>
+              <w:t xml:space="preserve">Offline Leaderboard, IAP &amp; Editor Tooling: </w:t>
+            </w:r>
+            <w:r>
+              <w:rPr>
+                <w:color w:val="334155"/>
+                <w:sz w:val="22"/>
+              </w:rPr>
+              <w:t>Built zero-server bot-paced seasonal leaderboards with anti-rollback clamping, Google/Apple IAP state machines, Asset Organizer EditorWindow, and Argos IPC localization.</w:t>
+            </w:r>
+          </w:p>
+        </w:tc>
+      </w:tr>
+    </w:tbl>
+    <w:p>
+      <w:pPr>
+        <w:keepNext/>
+        <w:tabs>
+          <w:tab w:pos="11318" w:val="right"/>
+        </w:tabs>
+        <w:spacing w:before="0" w:after="110"/>
+        <w:pageBreakBefore/>
+        <w:pBdr>
+          <w:left w:val="single" w:sz="24" w:space="6" w:color="4F46E5"/>
+          <w:bottom w:val="single" w:sz="6" w:space="2" w:color="CBD5E1"/>
+        </w:pBdr>
+      </w:pPr>
+      <w:r>
+        <w:rPr>
+          <w:rFonts w:ascii="Calibri" w:hAnsi="Calibri"/>
+          <w:b/>
+          <w:color w:val="0F172A"/>
+          <w:sz w:val="24"/>
+        </w:rPr>
+        <w:t>PROFESSIONAL STUDIO EXPERIENCE (CONTINUED)</w:t>
+      </w:r>
+      <w:r>
+        <w:rPr>
+          <w:rFonts w:ascii="Calibri" w:hAnsi="Calibri"/>
+          <w:b w:val="0"/>
+          <w:color w:val="64748B"/>
+          <w:sz w:val="21"/>
+        </w:rPr>
+        <w:tab/>
+        <w:t>Multiplayer, AI &amp; Standalone Game Architecture</w:t>
+      </w:r>
+    </w:p>
+    <w:tbl>
+      <w:tblPr>
+        <w:tblW w:type="auto" w:w="0"/>
+        <w:jc w:val="center"/>
+        <w:tblLayout w:type="fixed"/>
+        <w:tblLook w:firstColumn="1" w:firstRow="1" w:lastColumn="0" w:lastRow="0" w:noHBand="0" w:noVBand="1" w:val="04A0"/>
+      </w:tblPr>
+      <w:tblGrid>
+        <w:gridCol w:w="11318"/>
+      </w:tblGrid>
+      <w:tr>
+        <w:trPr>
+          <w:cantSplit/>
+        </w:trPr>
+        <w:tc>
+          <w:tcPr>
+            <w:tcW w:w="11318" w:type="dxa"/>
+            <w:shd w:fill="F8FAFC"/>
+            <w:tcBorders>
+              <w:top w:val="single" w:sz="16" w:space="0" w:color="4F46E5"/>
+              <w:left w:val="single" w:sz="6" w:space="0" w:color="818CF8"/>
+              <w:bottom w:val="single" w:sz="6" w:space="0" w:color="818CF8"/>
+              <w:right w:val="single" w:sz="6" w:space="0" w:color="818CF8"/>
+            </w:tcBorders>
+            <w:tcMar>
+              <w:top w:w="85" w:type="dxa"/>
+              <w:bottom w:w="85" w:type="dxa"/>
+              <w:left w:w="90" w:type="dxa"/>
+              <w:right w:w="90" w:type="dxa"/>
+            </w:tcMar>
+          </w:tcPr>
+          <w:p>
+            <w:pPr>
+              <w:tabs>
+                <w:tab w:pos="10872" w:val="right"/>
+              </w:tabs>
+              <w:spacing w:before="0" w:after="90"/>
+              <w:pBdr>
+                <w:bottom w:val="single" w:sz="4" w:space="4" w:color="CBD5E1"/>
+              </w:pBdr>
+            </w:pPr>
+            <w:r>
+              <w:rPr>
+                <w:b/>
+                <w:color w:val="0F172A"/>
+                <w:sz w:val="26"/>
+              </w:rPr>
+              <w:t>Appzia</w:t>
+            </w:r>
+            <w:r>
+              <w:rPr>
+                <w:color w:val="94A3B8"/>
+                <w:sz w:val="24"/>
+              </w:rPr>
+              <w:t xml:space="preserve">   |   </w:t>
+            </w:r>
+            <w:r>
+              <w:rPr>
+                <w:b/>
+                <w:color w:val="334155"/>
+                <w:sz w:val="24"/>
+              </w:rPr>
+              <w:t>Unity3D Systems &amp; Gameplay Developer</w:t>
+            </w:r>
+            <w:r>
+              <w:rPr>
+                <w:b/>
+                <w:color w:val="475569"/>
+                <w:sz w:val="21"/>
+              </w:rPr>
+              <w:tab/>
+              <w:t>Pune, India  •  June 2024 – July 2025</w:t>
+            </w:r>
+          </w:p>
+          <w:p>
+            <w:pPr>
+              <w:spacing w:before="0" w:after="90" w:line="283" w:lineRule="auto"/>
+              <w:ind w:left="230" w:hanging="202"/>
+            </w:pPr>
+            <w:r>
+              <w:rPr>
+                <w:b/>
+                <w:color w:val="2563EB"/>
+                <w:sz w:val="22"/>
+              </w:rPr>
+              <w:t xml:space="preserve">•  </w:t>
+            </w:r>
+            <w:r>
+              <w:rPr>
+                <w:b/>
+                <w:color w:val="0F172A"/>
+                <w:sz w:val="22"/>
+              </w:rPr>
+              <w:t xml:space="preserve">Stockfish AI &amp; Real-Time Chess (Bullet Chess): </w:t>
+            </w:r>
+            <w:r>
+              <w:rPr>
+                <w:color w:val="334155"/>
+                <w:sz w:val="22"/>
+              </w:rPr>
+              <w:t>Architected multiplayer chess engine using Photon (PUN 2) and Stockfish API for live move evaluation, client-side board validation, clock sync, and tournament brackets.</w:t>
+            </w:r>
+          </w:p>
+          <w:p>
+            <w:pPr>
+              <w:spacing w:before="0" w:after="0" w:line="283" w:lineRule="auto"/>
+              <w:ind w:left="230" w:hanging="202"/>
+            </w:pPr>
+            <w:r>
+              <w:rPr>
+                <w:b/>
+                <w:color w:val="2563EB"/>
+                <w:sz w:val="22"/>
+              </w:rPr>
+              <w:t xml:space="preserve">•  </w:t>
+            </w:r>
+            <w:r>
+              <w:rPr>
+                <w:b/>
+                <w:color w:val="0F172A"/>
+                <w:sz w:val="22"/>
+              </w:rPr>
+              <w:t xml:space="preserve">Arcade Simulation &amp; Economy Systems (Pinnacle): </w:t>
+            </w:r>
+            <w:r>
+              <w:rPr>
+                <w:color w:val="334155"/>
+                <w:sz w:val="22"/>
+              </w:rPr>
+              <w:t>Led development of Pinnacle arcade simulation replicating physical machines, implementing deterministic FSMs, secure Apple/Google IAP, and Zero-GC object pooling at 60 FPS.</w:t>
+            </w:r>
+          </w:p>
+        </w:tc>
+      </w:tr>
+    </w:tbl>
+    <w:p>
+      <w:pPr>
+        <w:spacing w:before="0" w:after="140"/>
+      </w:pPr>
+      <w:r>
+        <w:rPr>
+          <w:sz w:val="2"/>
+        </w:rPr>
+      </w:r>
+    </w:p>
+    <w:tbl>
+      <w:tblPr>
+        <w:tblW w:type="auto" w:w="0"/>
+        <w:jc w:val="center"/>
+        <w:tblLayout w:type="fixed"/>
+        <w:tblLook w:firstColumn="1" w:firstRow="1" w:lastColumn="0" w:lastRow="0" w:noHBand="0" w:noVBand="1" w:val="04A0"/>
+      </w:tblPr>
+      <w:tblGrid>
+        <w:gridCol w:w="11318"/>
+      </w:tblGrid>
+      <w:tr>
+        <w:trPr>
+          <w:cantSplit/>
+        </w:trPr>
+        <w:tc>
+          <w:tcPr>
+            <w:tcW w:w="11318" w:type="dxa"/>
+            <w:shd w:fill="F8FAFC"/>
+            <w:tcBorders>
+              <w:top w:val="single" w:sz="16" w:space="0" w:color="D97706"/>
+              <w:left w:val="single" w:sz="6" w:space="0" w:color="FBBF24"/>
+              <w:bottom w:val="single" w:sz="6" w:space="0" w:color="FBBF24"/>
+              <w:right w:val="single" w:sz="6" w:space="0" w:color="FBBF24"/>
+            </w:tcBorders>
+            <w:tcMar>
+              <w:top w:w="85" w:type="dxa"/>
+              <w:bottom w:w="85" w:type="dxa"/>
+              <w:left w:w="90" w:type="dxa"/>
+              <w:right w:w="90" w:type="dxa"/>
+            </w:tcMar>
+          </w:tcPr>
+          <w:p>
+            <w:pPr>
+              <w:tabs>
+                <w:tab w:pos="10872" w:val="right"/>
+              </w:tabs>
+              <w:spacing w:before="0" w:after="90"/>
+              <w:pBdr>
+                <w:bottom w:val="single" w:sz="4" w:space="4" w:color="CBD5E1"/>
+              </w:pBdr>
+            </w:pPr>
+            <w:r>
+              <w:rPr>
+                <w:b/>
+                <w:color w:val="0F172A"/>
+                <w:sz w:val="26"/>
+              </w:rPr>
+              <w:t>StudioKrew</w:t>
+            </w:r>
+            <w:r>
+              <w:rPr>
+                <w:color w:val="94A3B8"/>
+                <w:sz w:val="24"/>
+              </w:rPr>
+              <w:t xml:space="preserve">   |   </w:t>
+            </w:r>
+            <w:r>
+              <w:rPr>
+                <w:b/>
+                <w:color w:val="334155"/>
+                <w:sz w:val="24"/>
+              </w:rPr>
+              <w:t>Unity Game Developer (Remote)</w:t>
+            </w:r>
+            <w:r>
+              <w:rPr>
+                <w:b/>
+                <w:color w:val="475569"/>
+                <w:sz w:val="21"/>
+              </w:rPr>
+              <w:tab/>
+              <w:t>Delhi, India (Remote)  •  March 2024 – May 2024</w:t>
+            </w:r>
+          </w:p>
+          <w:p>
+            <w:pPr>
+              <w:spacing w:before="0" w:after="90" w:line="283" w:lineRule="auto"/>
+              <w:ind w:left="230" w:hanging="202"/>
+            </w:pPr>
+            <w:r>
+              <w:rPr>
+                <w:b/>
+                <w:color w:val="2563EB"/>
+                <w:sz w:val="22"/>
+              </w:rPr>
+              <w:t xml:space="preserve">•  </w:t>
+            </w:r>
+            <w:r>
+              <w:rPr>
+                <w:b/>
+                <w:color w:val="0F172A"/>
+                <w:sz w:val="22"/>
+              </w:rPr>
+              <w:t xml:space="preserve">Solo Card Game Architecture (FreeCell &amp; Solitaire): </w:t>
+            </w:r>
+            <w:r>
+              <w:rPr>
+                <w:color w:val="334155"/>
+                <w:sz w:val="22"/>
+              </w:rPr>
+              <w:t>Delivered complete end-to-end development independently, architecting deterministic card stack rules, memento-based undo/redo state history, and responsive touch controls.</w:t>
+            </w:r>
+          </w:p>
+          <w:p>
+            <w:pPr>
+              <w:spacing w:before="0" w:after="90" w:line="283" w:lineRule="auto"/>
+              <w:ind w:left="230" w:hanging="202"/>
+            </w:pPr>
+            <w:r>
+              <w:rPr>
+                <w:b/>
+                <w:color w:val="2563EB"/>
+                <w:sz w:val="22"/>
+              </w:rPr>
+              <w:t xml:space="preserve">•  </w:t>
+            </w:r>
+            <w:r>
+              <w:rPr>
+                <w:b/>
+                <w:color w:val="0F172A"/>
+                <w:sz w:val="22"/>
+              </w:rPr>
+              <w:t xml:space="preserve">Dice Physics &amp; Scoring State Machine (Yahtzee): </w:t>
+            </w:r>
+            <w:r>
+              <w:rPr>
+                <w:color w:val="334155"/>
+                <w:sz w:val="22"/>
+              </w:rPr>
+              <w:t>Engineered probabilistic dice-rolling physics, category score validation state machines, and turn-based round flow with fluid particle animations.</w:t>
+            </w:r>
+          </w:p>
+          <w:p>
+            <w:pPr>
+              <w:spacing w:before="0" w:after="0" w:line="283" w:lineRule="auto"/>
+              <w:ind w:left="230" w:hanging="202"/>
+            </w:pPr>
+            <w:r>
+              <w:rPr>
+                <w:b/>
+                <w:color w:val="2563EB"/>
+                <w:sz w:val="22"/>
+              </w:rPr>
+              <w:t xml:space="preserve">•  </w:t>
+            </w:r>
+            <w:r>
+              <w:rPr>
+                <w:b/>
+                <w:color w:val="0F172A"/>
+                <w:sz w:val="22"/>
+              </w:rPr>
+              <w:t xml:space="preserve">Grid Puzzle Engine &amp; Serialization (BrokenTiles): </w:t>
+            </w:r>
+            <w:r>
+              <w:rPr>
+                <w:color w:val="334155"/>
+                <w:sz w:val="22"/>
+              </w:rPr>
+              <w:t>Developed reactive grid-matching algorithms with cascading tile clearing, implementing lightweight JSON save serialization for instant session recovery.</w:t>
+            </w:r>
+          </w:p>
+        </w:tc>
+      </w:tr>
+    </w:tbl>
+    <w:p>
+      <w:pPr>
+        <w:spacing w:before="0" w:after="100"/>
+      </w:pPr>
+      <w:r>
+        <w:rPr>
+          <w:sz w:val="2"/>
+        </w:rPr>
+      </w:r>
+    </w:p>
+    <w:p>
+      <w:pPr>
+        <w:keepNext/>
+        <w:tabs>
+          <w:tab w:pos="11318" w:val="right"/>
+        </w:tabs>
+        <w:spacing w:before="200" w:after="110"/>
+        <w:pBdr>
+          <w:left w:val="single" w:sz="24" w:space="6" w:color="9333EA"/>
+          <w:bottom w:val="single" w:sz="6" w:space="2" w:color="CBD5E1"/>
+        </w:pBdr>
+      </w:pPr>
+      <w:r>
+        <w:rPr>
+          <w:rFonts w:ascii="Calibri" w:hAnsi="Calibri"/>
+          <w:b/>
+          <w:color w:val="0F172A"/>
+          <w:sz w:val="24"/>
+        </w:rPr>
+        <w:t>TECHNICAL SKILLS &amp; ENGINE STACK</w:t>
+      </w:r>
+      <w:r>
+        <w:rPr>
+          <w:rFonts w:ascii="Calibri" w:hAnsi="Calibri"/>
+          <w:b w:val="0"/>
+          <w:color w:val="64748B"/>
+          <w:sz w:val="21"/>
+        </w:rPr>
+        <w:tab/>
+        <w:t>Production Engineering &amp; Tooling Matrix</w:t>
+      </w:r>
+    </w:p>
+    <w:tbl>
+      <w:tblPr>
+        <w:tblW w:type="auto" w:w="0"/>
+        <w:jc w:val="center"/>
+        <w:tblLayout w:type="fixed"/>
+        <w:tblLook w:firstColumn="1" w:firstRow="1" w:lastColumn="0" w:lastRow="0" w:noHBand="0" w:noVBand="1" w:val="04A0"/>
+        <w:tblCellSpacing w:w="70" w:type="dxa"/>
+      </w:tblPr>
+      <w:tblGrid>
+        <w:gridCol w:w="3680"/>
+        <w:gridCol w:w="3680"/>
+        <w:gridCol w:w="3680"/>
+      </w:tblGrid>
+      <w:tr>
+        <w:trPr>
+          <w:cantSplit/>
+        </w:trPr>
+        <w:tc>
+          <w:tcPr>
+            <w:tcW w:w="3680" w:type="dxa"/>
+            <w:shd w:fill="F8FAFC"/>
+            <w:tcBorders>
+              <w:top w:val="single" w:sz="16" w:space="0" w:color="2563EB"/>
+              <w:left w:val="single" w:sz="6" w:space="0" w:color="60A5FA"/>
+              <w:bottom w:val="single" w:sz="6" w:space="0" w:color="60A5FA"/>
+              <w:right w:val="single" w:sz="6" w:space="0" w:color="60A5FA"/>
+            </w:tcBorders>
+            <w:tcMar>
+              <w:top w:w="85" w:type="dxa"/>
+              <w:bottom w:w="85" w:type="dxa"/>
+              <w:left w:w="95" w:type="dxa"/>
+              <w:right w:w="95" w:type="dxa"/>
+            </w:tcMar>
+          </w:tcPr>
+          <w:p>
+            <w:pPr>
+              <w:spacing w:before="0" w:after="90"/>
+              <w:pBdr>
+                <w:bottom w:val="single" w:sz="4" w:space="3" w:color="CBD5E1"/>
+              </w:pBdr>
+            </w:pPr>
+            <w:r>
+              <w:rPr>
+                <w:b/>
+                <w:color w:val="0F172A"/>
+                <w:sz w:val="23"/>
               </w:rPr>
               <w:t>Core Engine &amp; Languages</w:t>
             </w:r>
           </w:p>
           <w:p>
             <w:pPr>
-              <w:spacing w:before="0" w:after="0" w:line="240" w:lineRule="auto"/>
+              <w:spacing w:before="40" w:after="0" w:line="293" w:lineRule="auto"/>
             </w:pPr>
             <w:r>
               <w:rPr>
+                <w:b/>
                 <w:color w:val="334155"/>
-                <w:sz w:val="16"/>
+                <w:sz w:val="21"/>
               </w:rPr>
-              <w:t>Unity 3D (2020–2023 LTS / Unity 6) • C# (.NET) • HLSL / ShaderLab • Python</w:t>
+              <w:t>Unity 3D (2020–2023 LTS / Unity 6)  •  C# (.NET)  •  HLSL / ShaderLab  •  Python</w:t>
             </w:r>
           </w:p>
         </w:tc>
         <w:tc>
           <w:tcPr>
-            <w:tcW w:w="3676" w:type="dxa"/>
+            <w:tcW w:w="3680" w:type="dxa"/>
             <w:shd w:fill="F8FAFC"/>
             <w:tcBorders>
-              <w:top w:val="single" w:sz="12" w:space="0" w:color="059669"/>
-              <w:left w:val="single" w:sz="4" w:space="0" w:color="A7F3D0"/>
-              <w:bottom w:val="single" w:sz="4" w:space="0" w:color="A7F3D0"/>
-              <w:right w:val="single" w:sz="4" w:space="0" w:color="A7F3D0"/>
+              <w:top w:val="single" w:sz="16" w:space="0" w:color="059669"/>
+              <w:left w:val="single" w:sz="6" w:space="0" w:color="34D399"/>
+              <w:bottom w:val="single" w:sz="6" w:space="0" w:color="34D399"/>
+              <w:right w:val="single" w:sz="6" w:space="0" w:color="34D399"/>
             </w:tcBorders>
             <w:tcMar>
-              <w:top w:w="16" w:type="dxa"/>
-              <w:bottom w:w="16" w:type="dxa"/>
-              <w:left w:w="60" w:type="dxa"/>
-              <w:right w:w="60" w:type="dxa"/>
+              <w:top w:w="85" w:type="dxa"/>
+              <w:bottom w:w="85" w:type="dxa"/>
+              <w:left w:w="95" w:type="dxa"/>
+              <w:right w:w="95" w:type="dxa"/>
             </w:tcMar>
           </w:tcPr>
           <w:p>
             <w:pPr>
-              <w:spacing w:before="0" w:after="10"/>
+              <w:spacing w:before="0" w:after="90"/>
+              <w:pBdr>
+                <w:bottom w:val="single" w:sz="4" w:space="3" w:color="CBD5E1"/>
+              </w:pBdr>
             </w:pPr>
             <w:r>
               <w:rPr>
                 <w:b/>
                 <w:color w:val="0F172A"/>
-                <w:sz w:val="17"/>
+                <w:sz w:val="23"/>
               </w:rPr>
               <w:t>Rendering &amp; Optimization</w:t>
             </w:r>
           </w:p>
           <w:p>
             <w:pPr>
-              <w:spacing w:before="0" w:after="0" w:line="240" w:lineRule="auto"/>
+              <w:spacing w:before="40" w:after="0" w:line="293" w:lineRule="auto"/>
             </w:pPr>
             <w:r>
               <w:rPr>
+                <w:b/>
                 <w:color w:val="334155"/>
-                <w:sz w:val="16"/>
+                <w:sz w:val="21"/>
               </w:rPr>
-              <w:t>URP • SRP Batcher • GPU Instancing • ASTC Compression • Custom UI Shaders</w:t>
+              <w:t>URP  •  SRP Batcher  •  GPU Instancing  •  ASTC Compression  •  Custom UI Shaders</w:t>
             </w:r>
           </w:p>
         </w:tc>
         <w:tc>
           <w:tcPr>
-            <w:tcW w:w="3676" w:type="dxa"/>
+            <w:tcW w:w="3680" w:type="dxa"/>
             <w:shd w:fill="F8FAFC"/>
             <w:tcBorders>
-              <w:top w:val="single" w:sz="12" w:space="0" w:color="9333EA"/>
-              <w:left w:val="single" w:sz="4" w:space="0" w:color="E9D5FF"/>
-              <w:bottom w:val="single" w:sz="4" w:space="0" w:color="E9D5FF"/>
-              <w:right w:val="single" w:sz="4" w:space="0" w:color="E9D5FF"/>
+              <w:top w:val="single" w:sz="16" w:space="0" w:color="9333EA"/>
+              <w:left w:val="single" w:sz="6" w:space="0" w:color="C084FC"/>
+              <w:bottom w:val="single" w:sz="6" w:space="0" w:color="C084FC"/>
+              <w:right w:val="single" w:sz="6" w:space="0" w:color="C084FC"/>
             </w:tcBorders>
             <w:tcMar>
-              <w:top w:w="16" w:type="dxa"/>
-              <w:bottom w:w="16" w:type="dxa"/>
-              <w:left w:w="60" w:type="dxa"/>
-              <w:right w:w="60" w:type="dxa"/>
+              <w:top w:w="85" w:type="dxa"/>
+              <w:bottom w:w="85" w:type="dxa"/>
+              <w:left w:w="95" w:type="dxa"/>
+              <w:right w:w="95" w:type="dxa"/>
             </w:tcMar>
           </w:tcPr>
           <w:p>
             <w:pPr>
-              <w:spacing w:before="0" w:after="10"/>
+              <w:spacing w:before="0" w:after="90"/>
+              <w:pBdr>
+                <w:bottom w:val="single" w:sz="4" w:space="3" w:color="CBD5E1"/>
+              </w:pBdr>
             </w:pPr>
             <w:r>
               <w:rPr>
                 <w:b/>
                 <w:color w:val="0F172A"/>
-                <w:sz w:val="17"/>
+                <w:sz w:val="23"/>
               </w:rPr>
               <w:t>Profiling &amp; Debugging</w:t>
             </w:r>
           </w:p>
           <w:p>
             <w:pPr>
-              <w:spacing w:before="0" w:after="0" w:line="240" w:lineRule="auto"/>
+              <w:spacing w:before="40" w:after="0" w:line="293" w:lineRule="auto"/>
             </w:pPr>
             <w:r>
               <w:rPr>
+                <w:b/>
                 <w:color w:val="334155"/>
-                <w:sz w:val="16"/>
+                <w:sz w:val="21"/>
               </w:rPr>
-              <w:t>Unity Profiler • Memory Profiler • Frame Debugger • RenderDoc • Android Logcat / ADB</w:t>
+              <w:t>Unity Profiler  •  Memory Profiler  •  Frame Debugger  •  RenderDoc  •  Android Logcat / ADB</w:t>
             </w:r>
           </w:p>
         </w:tc>
@@ -1332,130 +2001,142 @@
         </w:trPr>
         <w:tc>
           <w:tcPr>
-            <w:tcW w:w="3676" w:type="dxa"/>
+            <w:tcW w:w="3680" w:type="dxa"/>
             <w:shd w:fill="F8FAFC"/>
             <w:tcBorders>
-              <w:top w:val="single" w:sz="12" w:space="0" w:color="4F46E5"/>
-              <w:left w:val="single" w:sz="4" w:space="0" w:color="C7D2FE"/>
-              <w:bottom w:val="single" w:sz="4" w:space="0" w:color="C7D2FE"/>
-              <w:right w:val="single" w:sz="4" w:space="0" w:color="C7D2FE"/>
+              <w:top w:val="single" w:sz="16" w:space="0" w:color="4F46E5"/>
+              <w:left w:val="single" w:sz="6" w:space="0" w:color="818CF8"/>
+              <w:bottom w:val="single" w:sz="6" w:space="0" w:color="818CF8"/>
+              <w:right w:val="single" w:sz="6" w:space="0" w:color="818CF8"/>
             </w:tcBorders>
             <w:tcMar>
-              <w:top w:w="16" w:type="dxa"/>
-              <w:bottom w:w="16" w:type="dxa"/>
-              <w:left w:w="60" w:type="dxa"/>
-              <w:right w:w="60" w:type="dxa"/>
+              <w:top w:w="85" w:type="dxa"/>
+              <w:bottom w:w="85" w:type="dxa"/>
+              <w:left w:w="95" w:type="dxa"/>
+              <w:right w:w="95" w:type="dxa"/>
             </w:tcMar>
           </w:tcPr>
           <w:p>
             <w:pPr>
-              <w:spacing w:before="0" w:after="10"/>
+              <w:spacing w:before="0" w:after="90"/>
+              <w:pBdr>
+                <w:bottom w:val="single" w:sz="4" w:space="3" w:color="CBD5E1"/>
+              </w:pBdr>
             </w:pPr>
             <w:r>
               <w:rPr>
                 <w:b/>
                 <w:color w:val="0F172A"/>
-                <w:sz w:val="17"/>
+                <w:sz w:val="23"/>
               </w:rPr>
               <w:t>Platform &amp; Native Bridges</w:t>
             </w:r>
           </w:p>
           <w:p>
             <w:pPr>
-              <w:spacing w:before="0" w:after="0" w:line="240" w:lineRule="auto"/>
+              <w:spacing w:before="40" w:after="0" w:line="293" w:lineRule="auto"/>
             </w:pPr>
             <w:r>
               <w:rPr>
+                <w:b/>
                 <w:color w:val="334155"/>
-                <w:sz w:val="16"/>
+                <w:sz w:val="21"/>
               </w:rPr>
-              <w:t>Android (JNI / Java) • iOS (Obj-C Bridge) • WebGL (WASM) • OTA Manifest Sync</w:t>
+              <w:t>Android (JNI / Java)  •  iOS (Obj-C Bridge)  •  WebGL (WASM)  •  OTA Manifest Sync</w:t>
             </w:r>
           </w:p>
         </w:tc>
         <w:tc>
           <w:tcPr>
-            <w:tcW w:w="3676" w:type="dxa"/>
+            <w:tcW w:w="3680" w:type="dxa"/>
             <w:shd w:fill="F8FAFC"/>
             <w:tcBorders>
-              <w:top w:val="single" w:sz="12" w:space="0" w:color="D97706"/>
-              <w:left w:val="single" w:sz="4" w:space="0" w:color="FDE68A"/>
-              <w:bottom w:val="single" w:sz="4" w:space="0" w:color="FDE68A"/>
-              <w:right w:val="single" w:sz="4" w:space="0" w:color="FDE68A"/>
+              <w:top w:val="single" w:sz="16" w:space="0" w:color="D97706"/>
+              <w:left w:val="single" w:sz="6" w:space="0" w:color="FBBF24"/>
+              <w:bottom w:val="single" w:sz="6" w:space="0" w:color="FBBF24"/>
+              <w:right w:val="single" w:sz="6" w:space="0" w:color="FBBF24"/>
             </w:tcBorders>
             <w:tcMar>
-              <w:top w:w="16" w:type="dxa"/>
-              <w:bottom w:w="16" w:type="dxa"/>
-              <w:left w:w="60" w:type="dxa"/>
-              <w:right w:w="60" w:type="dxa"/>
+              <w:top w:w="85" w:type="dxa"/>
+              <w:bottom w:w="85" w:type="dxa"/>
+              <w:left w:w="95" w:type="dxa"/>
+              <w:right w:w="95" w:type="dxa"/>
             </w:tcMar>
           </w:tcPr>
           <w:p>
             <w:pPr>
-              <w:spacing w:before="0" w:after="10"/>
+              <w:spacing w:before="0" w:after="90"/>
+              <w:pBdr>
+                <w:bottom w:val="single" w:sz="4" w:space="3" w:color="CBD5E1"/>
+              </w:pBdr>
             </w:pPr>
             <w:r>
               <w:rPr>
                 <w:b/>
                 <w:color w:val="0F172A"/>
-                <w:sz w:val="17"/>
+                <w:sz w:val="23"/>
               </w:rPr>
               <w:t>Architecture &amp; AI Systems</w:t>
             </w:r>
           </w:p>
           <w:p>
             <w:pPr>
-              <w:spacing w:before="0" w:after="0" w:line="240" w:lineRule="auto"/>
+              <w:spacing w:before="40" w:after="0" w:line="293" w:lineRule="auto"/>
             </w:pPr>
             <w:r>
               <w:rPr>
+                <w:b/>
                 <w:color w:val="334155"/>
-                <w:sz w:val="16"/>
+                <w:sz w:val="21"/>
               </w:rPr>
-              <w:t>Deterministic FSMs • MVP / ScriptableObjects • Zero-GC Object Pooling • Stockfish / A* / Backtracking</w:t>
+              <w:t>Deterministic FSMs  •  MVP / ScriptableObjects  •  Zero-GC Object Pooling  •  Stockfish / A* / Backtracking</w:t>
             </w:r>
           </w:p>
         </w:tc>
         <w:tc>
           <w:tcPr>
-            <w:tcW w:w="3676" w:type="dxa"/>
+            <w:tcW w:w="3680" w:type="dxa"/>
             <w:shd w:fill="F8FAFC"/>
             <w:tcBorders>
-              <w:top w:val="single" w:sz="12" w:space="0" w:color="475569"/>
-              <w:left w:val="single" w:sz="4" w:space="0" w:color="CBD5E1"/>
-              <w:bottom w:val="single" w:sz="4" w:space="0" w:color="CBD5E1"/>
-              <w:right w:val="single" w:sz="4" w:space="0" w:color="CBD5E1"/>
+              <w:top w:val="single" w:sz="16" w:space="0" w:color="475569"/>
+              <w:left w:val="single" w:sz="6" w:space="0" w:color="94A3B8"/>
+              <w:bottom w:val="single" w:sz="6" w:space="0" w:color="94A3B8"/>
+              <w:right w:val="single" w:sz="6" w:space="0" w:color="94A3B8"/>
             </w:tcBorders>
             <w:tcMar>
-              <w:top w:w="16" w:type="dxa"/>
-              <w:bottom w:w="16" w:type="dxa"/>
-              <w:left w:w="60" w:type="dxa"/>
-              <w:right w:w="60" w:type="dxa"/>
+              <w:top w:w="85" w:type="dxa"/>
+              <w:bottom w:w="85" w:type="dxa"/>
+              <w:left w:w="95" w:type="dxa"/>
+              <w:right w:w="95" w:type="dxa"/>
             </w:tcMar>
           </w:tcPr>
           <w:p>
             <w:pPr>
-              <w:spacing w:before="0" w:after="10"/>
+              <w:spacing w:before="0" w:after="90"/>
+              <w:pBdr>
+                <w:bottom w:val="single" w:sz="4" w:space="3" w:color="CBD5E1"/>
+              </w:pBdr>
             </w:pPr>
             <w:r>
               <w:rPr>
                 <w:b/>
                 <w:color w:val="0F172A"/>
-                <w:sz w:val="17"/>
+                <w:sz w:val="23"/>
               </w:rPr>
               <w:t>LiveOps, SDKs &amp; Tooling</w:t>
             </w:r>
           </w:p>
           <w:p>
             <w:pPr>
-              <w:spacing w:before="0" w:after="0" w:line="240" w:lineRule="auto"/>
+              <w:spacing w:before="40" w:after="0" w:line="293" w:lineRule="auto"/>
             </w:pPr>
             <w:r>
               <w:rPr>
+                <w:b/>
                 <w:color w:val="334155"/>
-                <w:sz w:val="16"/>
+                <w:sz w:val="21"/>
               </w:rPr>
-              <w:t>Google / Apple IAP • Ads Mediation • Firebase • Custom EditorWindows • Git / GitLab</w:t>
+              <w:t>Google / Apple IAP  •  Ads Mediation  •  Firebase  •  Custom EditorWindows  •  Git / GitLab</w:t>
             </w:r>
           </w:p>
         </w:tc>
@@ -1463,18 +2144,34 @@
     </w:tbl>
     <w:p>
       <w:pPr>
-        <w:spacing w:before="60" w:after="30"/>
+        <w:keepNext/>
+        <w:tabs>
+          <w:tab w:pos="11318" w:val="right"/>
+        </w:tabs>
+        <w:spacing w:before="210" w:after="110"/>
         <w:pBdr>
-          <w:bottom w:val="single" w:sz="6" w:space="1" w:color="CBD5E1"/>
+          <w:left w:val="single" w:sz="24" w:space="6" w:color="D97706"/>
+          <w:bottom w:val="single" w:sz="6" w:space="2" w:color="CBD5E1"/>
         </w:pBdr>
       </w:pPr>
       <w:r>
         <w:rPr>
+          <w:rFonts w:ascii="Calibri" w:hAnsi="Calibri"/>
           <w:b/>
           <w:color w:val="0F172A"/>
-          <w:sz w:val="19"/>
+          <w:sz w:val="24"/>
         </w:rPr>
         <w:t>EDUCATION</w:t>
+      </w:r>
+      <w:r>
+        <w:rPr>
+          <w:rFonts w:ascii="Calibri" w:hAnsi="Calibri"/>
+          <w:b w:val="0"/>
+          <w:color w:val="64748B"/>
+          <w:sz w:val="21"/>
+        </w:rPr>
+        <w:tab/>
+        <w:t>Academic Qualifications &amp; Computer Science Foundation</w:t>
       </w:r>
     </w:p>
     <w:tbl>
@@ -1483,10 +2180,11 @@
         <w:jc w:val="center"/>
         <w:tblLayout w:type="fixed"/>
         <w:tblLook w:firstColumn="1" w:firstRow="1" w:lastColumn="0" w:lastRow="0" w:noHBand="0" w:noVBand="1" w:val="04A0"/>
+        <w:tblCellSpacing w:w="75" w:type="dxa"/>
       </w:tblPr>
       <w:tblGrid>
-        <w:gridCol w:w="5514"/>
-        <w:gridCol w:w="5514"/>
+        <w:gridCol w:w="5580"/>
+        <w:gridCol w:w="5580"/>
       </w:tblGrid>
       <w:tr>
         <w:trPr>
@@ -1494,19 +2192,19 @@
         </w:trPr>
         <w:tc>
           <w:tcPr>
-            <w:tcW w:w="5514" w:type="dxa"/>
+            <w:tcW w:w="5580" w:type="dxa"/>
             <w:shd w:fill="F8FAFC"/>
             <w:tcBorders>
-              <w:top w:val="single" w:sz="12" w:space="0" w:color="2563EB"/>
-              <w:left w:val="single" w:sz="4" w:space="0" w:color="BFDBFE"/>
-              <w:bottom w:val="single" w:sz="4" w:space="0" w:color="BFDBFE"/>
-              <w:right w:val="single" w:sz="4" w:space="0" w:color="BFDBFE"/>
+              <w:top w:val="single" w:sz="16" w:space="0" w:color="2563EB"/>
+              <w:left w:val="single" w:sz="6" w:space="0" w:color="60A5FA"/>
+              <w:bottom w:val="single" w:sz="6" w:space="0" w:color="60A5FA"/>
+              <w:right w:val="single" w:sz="6" w:space="0" w:color="60A5FA"/>
             </w:tcBorders>
             <w:tcMar>
-              <w:top w:w="14" w:type="dxa"/>
-              <w:bottom w:w="14" w:type="dxa"/>
-              <w:left w:w="60" w:type="dxa"/>
-              <w:right w:w="60" w:type="dxa"/>
+              <w:top w:w="85" w:type="dxa"/>
+              <w:bottom w:w="85" w:type="dxa"/>
+              <w:left w:w="100" w:type="dxa"/>
+              <w:right w:w="100" w:type="dxa"/>
             </w:tcMar>
           </w:tcPr>
           <w:p>
@@ -1514,24 +2212,40 @@
               <w:tabs>
                 <w:tab w:pos="5256" w:val="right"/>
               </w:tabs>
-              <w:spacing w:before="0" w:after="10"/>
+              <w:spacing w:before="0" w:after="40"/>
             </w:pPr>
             <w:r>
               <w:rPr>
                 <w:b/>
                 <w:color w:val="0F172A"/>
-                <w:sz w:val="17"/>
+                <w:sz w:val="22"/>
               </w:rPr>
               <w:t>Master of Computer Application (MCA)</w:t>
             </w:r>
             <w:r>
               <w:rPr>
                 <w:b/>
-                <w:color w:val="1D4ED8"/>
-                <w:sz w:val="16"/>
+                <w:color w:val="0F172A"/>
+                <w:sz w:val="21"/>
               </w:rPr>
               <w:tab/>
-              <w:t>CGPA: 7.52</w:t>
+              <w:t>[ CGPA: 7.52 ]</w:t>
+            </w:r>
+          </w:p>
+          <w:p>
+            <w:pPr>
+              <w:spacing w:before="0" w:after="90"/>
+              <w:pBdr>
+                <w:bottom w:val="single" w:sz="4" w:space="3" w:color="CBD5E1"/>
+              </w:pBdr>
+            </w:pPr>
+            <w:r>
+              <w:rPr>
+                <w:b/>
+                <w:color w:val="334155"/>
+                <w:sz w:val="21"/>
+              </w:rPr>
+              <w:t>Government Autonomous Engineering College</w:t>
             </w:r>
           </w:p>
           <w:p>
@@ -1539,20 +2253,20 @@
               <w:tabs>
                 <w:tab w:pos="5256" w:val="right"/>
               </w:tabs>
-              <w:spacing w:before="0" w:after="0"/>
+              <w:spacing w:before="40" w:after="0"/>
             </w:pPr>
             <w:r>
               <w:rPr>
-                <w:color w:val="334155"/>
-                <w:sz w:val="16"/>
+                <w:color w:val="64748B"/>
+                <w:sz w:val="21"/>
               </w:rPr>
-              <w:t>Government Autonomous Engineering College, Aurangabad, MH</w:t>
+              <w:t>Aurangabad, Maharashtra</w:t>
             </w:r>
             <w:r>
               <w:rPr>
                 <w:b/>
-                <w:color w:val="64748B"/>
-                <w:sz w:val="16"/>
+                <w:color w:val="0F172A"/>
+                <w:sz w:val="21"/>
               </w:rPr>
               <w:tab/>
               <w:t>Dec 2021 – Jan 2023</w:t>
@@ -1561,19 +2275,19 @@
         </w:tc>
         <w:tc>
           <w:tcPr>
-            <w:tcW w:w="5514" w:type="dxa"/>
+            <w:tcW w:w="5580" w:type="dxa"/>
             <w:shd w:fill="F8FAFC"/>
             <w:tcBorders>
-              <w:top w:val="single" w:sz="12" w:space="0" w:color="059669"/>
-              <w:left w:val="single" w:sz="4" w:space="0" w:color="A7F3D0"/>
-              <w:bottom w:val="single" w:sz="4" w:space="0" w:color="A7F3D0"/>
-              <w:right w:val="single" w:sz="4" w:space="0" w:color="A7F3D0"/>
+              <w:top w:val="single" w:sz="16" w:space="0" w:color="059669"/>
+              <w:left w:val="single" w:sz="6" w:space="0" w:color="34D399"/>
+              <w:bottom w:val="single" w:sz="6" w:space="0" w:color="34D399"/>
+              <w:right w:val="single" w:sz="6" w:space="0" w:color="34D399"/>
             </w:tcBorders>
             <w:tcMar>
-              <w:top w:w="14" w:type="dxa"/>
-              <w:bottom w:w="14" w:type="dxa"/>
-              <w:left w:w="60" w:type="dxa"/>
-              <w:right w:w="60" w:type="dxa"/>
+              <w:top w:w="85" w:type="dxa"/>
+              <w:bottom w:w="85" w:type="dxa"/>
+              <w:left w:w="100" w:type="dxa"/>
+              <w:right w:w="100" w:type="dxa"/>
             </w:tcMar>
           </w:tcPr>
           <w:p>
@@ -1581,24 +2295,40 @@
               <w:tabs>
                 <w:tab w:pos="5256" w:val="right"/>
               </w:tabs>
-              <w:spacing w:before="0" w:after="10"/>
+              <w:spacing w:before="0" w:after="40"/>
             </w:pPr>
             <w:r>
               <w:rPr>
                 <w:b/>
                 <w:color w:val="0F172A"/>
-                <w:sz w:val="17"/>
+                <w:sz w:val="22"/>
               </w:rPr>
               <w:t>Bachelor of Computer Science (B.Sc. CS)</w:t>
             </w:r>
             <w:r>
               <w:rPr>
                 <w:b/>
-                <w:color w:val="059669"/>
-                <w:sz w:val="16"/>
+                <w:color w:val="0F172A"/>
+                <w:sz w:val="21"/>
               </w:rPr>
               <w:tab/>
-              <w:t>CGPA: 7.50</w:t>
+              <w:t>[ CGPA: 7.50 ]</w:t>
+            </w:r>
+          </w:p>
+          <w:p>
+            <w:pPr>
+              <w:spacing w:before="0" w:after="90"/>
+              <w:pBdr>
+                <w:bottom w:val="single" w:sz="4" w:space="3" w:color="CBD5E1"/>
+              </w:pBdr>
+            </w:pPr>
+            <w:r>
+              <w:rPr>
+                <w:b/>
+                <w:color w:val="334155"/>
+                <w:sz w:val="21"/>
+              </w:rPr>
+              <w:t>Vivekanand Arts and Science College</w:t>
             </w:r>
           </w:p>
           <w:p>
@@ -1606,20 +2336,20 @@
               <w:tabs>
                 <w:tab w:pos="5256" w:val="right"/>
               </w:tabs>
-              <w:spacing w:before="0" w:after="0"/>
+              <w:spacing w:before="40" w:after="0"/>
             </w:pPr>
             <w:r>
               <w:rPr>
-                <w:color w:val="334155"/>
-                <w:sz w:val="16"/>
+                <w:color w:val="64748B"/>
+                <w:sz w:val="21"/>
               </w:rPr>
-              <w:t>Vivekanand Arts and Science College, Aurangabad, MH</w:t>
+              <w:t>Aurangabad, Maharashtra</w:t>
             </w:r>
             <w:r>
               <w:rPr>
                 <w:b/>
-                <w:color w:val="64748B"/>
-                <w:sz w:val="16"/>
+                <w:color w:val="0F172A"/>
+                <w:sz w:val="21"/>
               </w:rPr>
               <w:tab/>
               <w:t>Apr 2018 – Oct 2021</w:t>
@@ -1630,7 +2360,7 @@
     </w:tbl>
     <w:sectPr>
       <w:pgSz w:w="12240" w:h="15840"/>
-      <w:pgMar w:top="346" w:right="605" w:bottom="346" w:left="605" w:header="720" w:footer="720" w:gutter="0"/>
+      <w:pgMar w:top="403" w:right="461" w:bottom="403" w:left="461" w:header="720" w:footer="720" w:gutter="0"/>
       <w:cols w:space="720"/>
       <w:docGrid w:linePitch="360"/>
     </w:sectPr>
@@ -2004,7 +2734,7 @@
     <w:rPr>
       <w:rFonts w:ascii="Calibri" w:hAnsi="Calibri"/>
       <w:color w:val="0F172A"/>
-      <w:sz w:val="19"/>
+      <w:sz w:val="22"/>
     </w:rPr>
   </w:style>
   <w:style w:type="paragraph" w:styleId="Header">

</xml_diff>

<commit_message>
Increase downloaded Word (.docx) resume font sizes by +2pt across all sections
</commit_message>
<xml_diff>
--- a/assets/resume/Arpit_Jaiswal_Game_Dev_Resume.docx
+++ b/assets/resume/Arpit_Jaiswal_Game_Dev_Resume.docx
@@ -2,6 +2,20 @@
 <file path=word/document.xml><?xml version="1.0" encoding="utf-8"?>
 <w:document xmlns:wpc="http://schemas.microsoft.com/office/word/2010/wordprocessingCanvas" xmlns:mo="http://schemas.microsoft.com/office/mac/office/2008/main" xmlns:mc="http://schemas.openxmlformats.org/markup-compatibility/2006" xmlns:mv="urn:schemas-microsoft-com:mac:vml" xmlns:o="urn:schemas-microsoft-com:office:office" xmlns:r="http://schemas.openxmlformats.org/officeDocument/2006/relationships" xmlns:m="http://schemas.openxmlformats.org/officeDocument/2006/math" xmlns:v="urn:schemas-microsoft-com:vml" xmlns:wp14="http://schemas.microsoft.com/office/word/2010/wordprocessingDrawing" xmlns:wp="http://schemas.openxmlformats.org/drawingml/2006/wordprocessingDrawing" xmlns:w10="urn:schemas-microsoft-com:office:word" xmlns:w="http://schemas.openxmlformats.org/wordprocessingml/2006/main" xmlns:w14="http://schemas.microsoft.com/office/word/2010/wordml" xmlns:wpg="http://schemas.microsoft.com/office/word/2010/wordprocessingGroup" xmlns:wpi="http://schemas.microsoft.com/office/word/2010/wordprocessingInk" xmlns:wne="http://schemas.microsoft.com/office/word/2006/wordml" xmlns:wps="http://schemas.microsoft.com/office/word/2010/wordprocessingShape" mc:Ignorable="w14 wp14">
   <w:body>
+    <w:p>
+      <w:pPr>
+        <w:spacing w:before="0" w:after="10"/>
+        <w:jc w:val="center"/>
+      </w:pPr>
+      <w:r>
+        <w:rPr>
+          <w:b/>
+          <w:color w:val="0F172A"/>
+          <w:sz w:val="47"/>
+        </w:rPr>
+        <w:t>ARPIT K. JAISWAL</w:t>
+      </w:r>
+    </w:p>
     <w:p>
       <w:pPr>
         <w:spacing w:before="0" w:after="20"/>
@@ -11,21 +25,7 @@
         <w:rPr>
           <w:b/>
           <w:color w:val="0F172A"/>
-          <w:sz w:val="43"/>
-        </w:rPr>
-        <w:t>ARPIT K. JAISWAL</w:t>
-      </w:r>
-    </w:p>
-    <w:p>
-      <w:pPr>
-        <w:spacing w:before="0" w:after="50"/>
-        <w:jc w:val="center"/>
-      </w:pPr>
-      <w:r>
-        <w:rPr>
-          <w:b/>
-          <w:color w:val="0F172A"/>
-          <w:sz w:val="25"/>
+          <w:sz w:val="29"/>
         </w:rPr>
         <w:t>GAMEPLAY &amp; AI SYSTEMS DEVELOPER</w:t>
       </w:r>
@@ -33,7 +33,7 @@
         <w:rPr>
           <w:b/>
           <w:color w:val="059669"/>
-          <w:sz w:val="23"/>
+          <w:sz w:val="27"/>
         </w:rPr>
         <w:t xml:space="preserve">   [ UNITY DEVELOPER ]</w:t>
       </w:r>
@@ -41,7 +41,7 @@
         <w:rPr>
           <w:b/>
           <w:color w:val="1D4ED8"/>
-          <w:sz w:val="23"/>
+          <w:sz w:val="27"/>
         </w:rPr>
         <w:t xml:space="preserve">   [ 3.5+ YRS EXPERIENCE ]</w:t>
       </w:r>
@@ -49,11 +49,11 @@
     <w:p>
       <w:pPr>
         <w:tabs>
-          <w:tab w:pos="11318" w:val="right"/>
+          <w:tab w:pos="11722" w:val="right"/>
         </w:tabs>
-        <w:spacing w:before="0" w:after="70"/>
+        <w:spacing w:before="0" w:after="30"/>
         <w:pBdr>
-          <w:bottom w:val="single" w:sz="16" w:space="4" w:color="1E293B"/>
+          <w:bottom w:val="single" w:sz="16" w:space="2" w:color="1E293B"/>
         </w:pBdr>
       </w:pPr>
       <w:hyperlink r:id="rId9">
@@ -63,8 +63,8 @@
             <w:color w:val="1D4ED8"/>
             <w:u w:val="single"/>
             <w:b/>
-            <w:sz w:val="22"/>
-            <w:szCs w:val="22"/>
+            <w:sz w:val="26"/>
+            <w:szCs w:val="26"/>
           </w:rPr>
           <w:t>+91 8149135849</w:t>
         </w:r>
@@ -72,9 +72,9 @@
       <w:r>
         <w:rPr>
           <w:color w:val="94A3B8"/>
-          <w:sz w:val="22"/>
+          <w:sz w:val="26"/>
         </w:rPr>
-        <w:t xml:space="preserve">   •   </w:t>
+        <w:t xml:space="preserve">  •  </w:t>
       </w:r>
       <w:hyperlink r:id="rId10">
         <w:r>
@@ -83,15 +83,15 @@
             <w:color w:val="1D4ED8"/>
             <w:u w:val="single"/>
             <w:b/>
-            <w:sz w:val="22"/>
-            <w:szCs w:val="22"/>
+            <w:sz w:val="26"/>
+            <w:szCs w:val="26"/>
           </w:rPr>
           <w:t>arpitjaiswal071@gmail.com</w:t>
         </w:r>
       </w:hyperlink>
       <w:r>
         <w:rPr>
-          <w:sz w:val="22"/>
+          <w:sz w:val="26"/>
         </w:rPr>
         <w:tab/>
       </w:r>
@@ -102,8 +102,8 @@
             <w:color w:val="1D4ED8"/>
             <w:u w:val="single"/>
             <w:b/>
-            <w:sz w:val="22"/>
-            <w:szCs w:val="22"/>
+            <w:sz w:val="26"/>
+            <w:szCs w:val="26"/>
           </w:rPr>
           <w:t>Portfolio ↗</w:t>
         </w:r>
@@ -111,9 +111,9 @@
       <w:r>
         <w:rPr>
           <w:color w:val="94A3B8"/>
-          <w:sz w:val="22"/>
+          <w:sz w:val="26"/>
         </w:rPr>
-        <w:t xml:space="preserve">   |   </w:t>
+        <w:t xml:space="preserve">  |  </w:t>
       </w:r>
       <w:hyperlink r:id="rId12">
         <w:r>
@@ -122,8 +122,8 @@
             <w:color w:val="1D4ED8"/>
             <w:u w:val="single"/>
             <w:b/>
-            <w:sz w:val="22"/>
-            <w:szCs w:val="22"/>
+            <w:sz w:val="26"/>
+            <w:szCs w:val="26"/>
           </w:rPr>
           <w:t>LinkedIn ↗</w:t>
         </w:r>
@@ -131,9 +131,9 @@
       <w:r>
         <w:rPr>
           <w:color w:val="94A3B8"/>
-          <w:sz w:val="22"/>
+          <w:sz w:val="26"/>
         </w:rPr>
-        <w:t xml:space="preserve">   |   </w:t>
+        <w:t xml:space="preserve">  |  </w:t>
       </w:r>
       <w:hyperlink r:id="rId13">
         <w:r>
@@ -142,8 +142,8 @@
             <w:color w:val="1D4ED8"/>
             <w:u w:val="single"/>
             <w:b/>
-            <w:sz w:val="22"/>
-            <w:szCs w:val="22"/>
+            <w:sz w:val="26"/>
+            <w:szCs w:val="26"/>
           </w:rPr>
           <w:t>GitHub ↗</w:t>
         </w:r>
@@ -151,9 +151,9 @@
       <w:r>
         <w:rPr>
           <w:color w:val="94A3B8"/>
-          <w:sz w:val="22"/>
+          <w:sz w:val="26"/>
         </w:rPr>
-        <w:t xml:space="preserve">   |   </w:t>
+        <w:t xml:space="preserve">  |  </w:t>
       </w:r>
       <w:hyperlink r:id="rId14">
         <w:r>
@@ -162,8 +162,8 @@
             <w:color w:val="1D4ED8"/>
             <w:u w:val="single"/>
             <w:b/>
-            <w:sz w:val="22"/>
-            <w:szCs w:val="22"/>
+            <w:sz w:val="26"/>
+            <w:szCs w:val="26"/>
           </w:rPr>
           <w:t>GitLab ↗</w:t>
         </w:r>
@@ -173,12 +173,12 @@
       <w:pPr>
         <w:keepNext/>
         <w:tabs>
-          <w:tab w:pos="11318" w:val="right"/>
+          <w:tab w:pos="11722" w:val="right"/>
         </w:tabs>
-        <w:spacing w:before="80" w:after="60"/>
+        <w:spacing w:before="36" w:after="24"/>
         <w:pBdr>
           <w:left w:val="single" w:sz="24" w:space="6" w:color="2563EB"/>
-          <w:bottom w:val="single" w:sz="6" w:space="2" w:color="CBD5E1"/>
+          <w:bottom w:val="single" w:sz="6" w:space="1" w:color="CBD5E1"/>
         </w:pBdr>
       </w:pPr>
       <w:r>
@@ -186,7 +186,7 @@
           <w:rFonts w:ascii="Calibri" w:hAnsi="Calibri"/>
           <w:b/>
           <w:color w:val="0F172A"/>
-          <w:sz w:val="24"/>
+          <w:sz w:val="28"/>
         </w:rPr>
         <w:t>EXECUTIVE PROFILE</w:t>
       </w:r>
@@ -195,7 +195,7 @@
           <w:rFonts w:ascii="Calibri" w:hAnsi="Calibri"/>
           <w:b w:val="0"/>
           <w:color w:val="64748B"/>
-          <w:sz w:val="21"/>
+          <w:sz w:val="25"/>
         </w:rPr>
         <w:tab/>
         <w:t>Core Specializations &amp; Studio Focus</w:t>
@@ -209,7 +209,7 @@
         <w:tblLook w:firstColumn="1" w:firstRow="1" w:lastColumn="0" w:lastRow="0" w:noHBand="0" w:noVBand="1" w:val="04A0"/>
       </w:tblPr>
       <w:tblGrid>
-        <w:gridCol w:w="11318"/>
+        <w:gridCol w:w="11720"/>
       </w:tblGrid>
       <w:tr>
         <w:trPr>
@@ -217,7 +217,7 @@
         </w:trPr>
         <w:tc>
           <w:tcPr>
-            <w:tcW w:w="11318" w:type="dxa"/>
+            <w:tcW w:w="11720" w:type="dxa"/>
             <w:shd w:fill="F8FAFC"/>
             <w:tcBorders>
               <w:top w:val="single" w:sz="14" w:space="0" w:color="2563EB"/>
@@ -226,95 +226,95 @@
               <w:right w:val="single" w:sz="6" w:space="0" w:color="93C5FD"/>
             </w:tcBorders>
             <w:tcMar>
-              <w:top w:w="52" w:type="dxa"/>
-              <w:bottom w:w="52" w:type="dxa"/>
-              <w:left w:w="90" w:type="dxa"/>
-              <w:right w:w="90" w:type="dxa"/>
+              <w:top w:w="24" w:type="dxa"/>
+              <w:bottom w:w="24" w:type="dxa"/>
+              <w:left w:w="65" w:type="dxa"/>
+              <w:right w:w="65" w:type="dxa"/>
             </w:tcMar>
           </w:tcPr>
           <w:p>
             <w:pPr>
-              <w:spacing w:before="0" w:after="48" w:line="259" w:lineRule="auto"/>
-              <w:ind w:left="230" w:hanging="202"/>
+              <w:spacing w:before="0" w:after="20" w:line="230" w:lineRule="auto"/>
+              <w:ind w:left="202" w:hanging="173"/>
             </w:pPr>
             <w:r>
               <w:rPr>
                 <w:b/>
                 <w:color w:val="2563EB"/>
-                <w:sz w:val="22"/>
+                <w:sz w:val="26"/>
               </w:rPr>
-              <w:t xml:space="preserve">•  </w:t>
+              <w:t xml:space="preserve">• </w:t>
             </w:r>
             <w:r>
               <w:rPr>
                 <w:b/>
                 <w:color w:val="0F172A"/>
-                <w:sz w:val="22"/>
+                <w:sz w:val="26"/>
               </w:rPr>
               <w:t xml:space="preserve">Production &amp; Multiplayer Systems (Unity C#): </w:t>
             </w:r>
             <w:r>
               <w:rPr>
                 <w:color w:val="334155"/>
-                <w:sz w:val="22"/>
+                <w:sz w:val="26"/>
               </w:rPr>
-              <w:t>Gameplay &amp; Systems Engineer with 3.5+ years shipping 3 commercial Google Play titles and real-time multiplayer games using Photon (PUN 2), Stockfish AI, and deterministic FSMs.</w:t>
+              <w:t>Gameplay &amp; Systems Engineer with 3.5+ years shipping 3 Google Play titles and real-time multiplayer games using Photon (PUN 2), Stockfish AI, and deterministic FSMs.</w:t>
             </w:r>
           </w:p>
           <w:p>
             <w:pPr>
-              <w:spacing w:before="0" w:after="48" w:line="259" w:lineRule="auto"/>
-              <w:ind w:left="230" w:hanging="202"/>
+              <w:spacing w:before="0" w:after="20" w:line="230" w:lineRule="auto"/>
+              <w:ind w:left="202" w:hanging="173"/>
             </w:pPr>
             <w:r>
               <w:rPr>
                 <w:b/>
                 <w:color w:val="2563EB"/>
-                <w:sz w:val="22"/>
+                <w:sz w:val="26"/>
               </w:rPr>
-              <w:t xml:space="preserve">•  </w:t>
+              <w:t xml:space="preserve">• </w:t>
             </w:r>
             <w:r>
               <w:rPr>
                 <w:b/>
                 <w:color w:val="0F172A"/>
-                <w:sz w:val="22"/>
+                <w:sz w:val="26"/>
               </w:rPr>
-              <w:t xml:space="preserve">Architecture, Native Bridges &amp; 60 FPS Optimization: </w:t>
+              <w:t xml:space="preserve">Architecture, Native Bridges &amp; 60 FPS: </w:t>
             </w:r>
             <w:r>
               <w:rPr>
                 <w:color w:val="334155"/>
-                <w:sz w:val="22"/>
+                <w:sz w:val="26"/>
               </w:rPr>
               <w:t>Specialist in procedural N×N mesh/puzzle generation, native Android (JNI) / iOS (Obj-C) bridges, non-blocking OTA content delivery, and Zero-GC object pooling locked at 60 FPS.</w:t>
             </w:r>
           </w:p>
           <w:p>
             <w:pPr>
-              <w:spacing w:before="0" w:after="0" w:line="259" w:lineRule="auto"/>
-              <w:ind w:left="230" w:hanging="202"/>
+              <w:spacing w:before="0" w:after="0" w:line="230" w:lineRule="auto"/>
+              <w:ind w:left="202" w:hanging="173"/>
             </w:pPr>
             <w:r>
               <w:rPr>
                 <w:b/>
                 <w:color w:val="2563EB"/>
-                <w:sz w:val="22"/>
+                <w:sz w:val="26"/>
               </w:rPr>
-              <w:t xml:space="preserve">•  </w:t>
+              <w:t xml:space="preserve">• </w:t>
             </w:r>
             <w:r>
               <w:rPr>
                 <w:b/>
                 <w:color w:val="0F172A"/>
-                <w:sz w:val="22"/>
+                <w:sz w:val="26"/>
               </w:rPr>
-              <w:t xml:space="preserve">AI-Augmented Tooling &amp; LiveOps Velocity: </w:t>
+              <w:t xml:space="preserve">AI-Augmented Tooling &amp; LiveOps: </w:t>
             </w:r>
             <w:r>
               <w:rPr>
                 <w:color w:val="334155"/>
-                <w:sz w:val="22"/>
+                <w:sz w:val="26"/>
               </w:rPr>
               <w:t>Leverages Claude, ChatGPT/Codex, and custom Unity EditorWindows to accelerate URP/HLSL shader prototyping, offline localization pipelines, and Google/Apple IAP monetization.</w:t>
             </w:r>
@@ -326,12 +326,12 @@
       <w:pPr>
         <w:keepNext/>
         <w:tabs>
-          <w:tab w:pos="11318" w:val="right"/>
+          <w:tab w:pos="11722" w:val="right"/>
         </w:tabs>
-        <w:spacing w:before="90" w:after="40"/>
+        <w:spacing w:before="40" w:after="20"/>
         <w:pBdr>
           <w:left w:val="single" w:sz="24" w:space="6" w:color="059669"/>
-          <w:bottom w:val="single" w:sz="6" w:space="2" w:color="CBD5E1"/>
+          <w:bottom w:val="single" w:sz="6" w:space="1" w:color="CBD5E1"/>
         </w:pBdr>
       </w:pPr>
       <w:r>
@@ -339,7 +339,7 @@
           <w:rFonts w:ascii="Calibri" w:hAnsi="Calibri"/>
           <w:b/>
           <w:color w:val="0F172A"/>
-          <w:sz w:val="24"/>
+          <w:sz w:val="28"/>
         </w:rPr>
         <w:t>PRODUCTION TRACK RECORD (KPIS)</w:t>
       </w:r>
@@ -348,7 +348,7 @@
           <w:rFonts w:ascii="Calibri" w:hAnsi="Calibri"/>
           <w:b w:val="0"/>
           <w:color w:val="64748B"/>
-          <w:sz w:val="21"/>
+          <w:sz w:val="25"/>
         </w:rPr>
         <w:tab/>
         <w:t>Quick 6-Second Recruiter Highlights</w:t>
@@ -360,11 +360,11 @@
         <w:jc w:val="center"/>
         <w:tblLayout w:type="fixed"/>
         <w:tblLook w:firstColumn="1" w:firstRow="1" w:lastColumn="0" w:lastRow="0" w:noHBand="0" w:noVBand="1" w:val="04A0"/>
-        <w:tblCellSpacing w:w="45" w:type="dxa"/>
+        <w:tblCellSpacing w:w="34" w:type="dxa"/>
       </w:tblPr>
       <w:tblGrid>
-        <w:gridCol w:w="6950"/>
-        <w:gridCol w:w="4270"/>
+        <w:gridCol w:w="7450"/>
+        <w:gridCol w:w="4180"/>
       </w:tblGrid>
       <w:tr>
         <w:trPr>
@@ -372,12 +372,12 @@
         </w:trPr>
         <w:tc>
           <w:tcPr>
-            <w:tcW w:w="6950" w:type="dxa"/>
+            <w:tcW w:w="7450" w:type="dxa"/>
             <w:tcMar>
-              <w:top w:w="46" w:type="dxa"/>
-              <w:bottom w:w="46" w:type="dxa"/>
-              <w:left w:w="85" w:type="dxa"/>
-              <w:right w:w="85" w:type="dxa"/>
+              <w:top w:w="24" w:type="dxa"/>
+              <w:bottom w:w="24" w:type="dxa"/>
+              <w:left w:w="65" w:type="dxa"/>
+              <w:right w:w="65" w:type="dxa"/>
             </w:tcMar>
             <w:shd w:fill="F8FAFC"/>
             <w:tcBorders>
@@ -390,15 +390,15 @@
           <w:p>
             <w:pPr>
               <w:tabs>
-                <w:tab w:pos="6696" w:val="right"/>
+                <w:tab w:pos="7258" w:val="right"/>
               </w:tabs>
-              <w:spacing w:before="0" w:after="36"/>
+              <w:spacing w:before="0" w:after="16"/>
             </w:pPr>
             <w:r>
               <w:rPr>
                 <w:b/>
                 <w:color w:val="0F172A"/>
-                <w:sz w:val="25"/>
+                <w:sz w:val="29"/>
               </w:rPr>
               <w:t>3.5+ Years</w:t>
             </w:r>
@@ -406,7 +406,7 @@
               <w:rPr>
                 <w:b/>
                 <w:color w:val="64748B"/>
-                <w:sz w:val="20"/>
+                <w:sz w:val="24"/>
               </w:rPr>
               <w:tab/>
               <w:t>STUDIO EXPERIENCE</w:t>
@@ -414,12 +414,12 @@
           </w:p>
           <w:p>
             <w:pPr>
-              <w:spacing w:before="0" w:after="30" w:line="252" w:lineRule="auto"/>
+              <w:spacing w:before="0" w:after="10" w:line="230" w:lineRule="auto"/>
             </w:pPr>
             <w:r>
               <w:rPr>
                 <w:b/>
-                <w:sz w:val="21"/>
+                <w:sz w:val="25"/>
               </w:rPr>
               <w:t xml:space="preserve">• </w:t>
             </w:r>
@@ -427,7 +427,7 @@
               <w:rPr>
                 <w:b/>
                 <w:color w:val="0F172A"/>
-                <w:sz w:val="21"/>
+                <w:sz w:val="25"/>
               </w:rPr>
               <w:t>Vasundhara Game Studio, Surat (2yr)</w:t>
             </w:r>
@@ -435,19 +435,19 @@
               <w:rPr>
                 <w:b/>
                 <w:color w:val="334155"/>
-                <w:sz w:val="20"/>
+                <w:sz w:val="24"/>
               </w:rPr>
-              <w:t xml:space="preserve">  •  Dec 2024 – Jan 2025 &amp; Dec 2025 – Present</w:t>
+              <w:t xml:space="preserve"> • Dec 2024 – Jan 2025 &amp; Dec 2025 – Present</w:t>
             </w:r>
           </w:p>
           <w:p>
             <w:pPr>
-              <w:spacing w:before="0" w:after="30" w:line="252" w:lineRule="auto"/>
+              <w:spacing w:before="0" w:after="10" w:line="230" w:lineRule="auto"/>
             </w:pPr>
             <w:r>
               <w:rPr>
                 <w:b/>
-                <w:sz w:val="21"/>
+                <w:sz w:val="25"/>
               </w:rPr>
               <w:t xml:space="preserve">• </w:t>
             </w:r>
@@ -455,7 +455,7 @@
               <w:rPr>
                 <w:b/>
                 <w:color w:val="0F172A"/>
-                <w:sz w:val="21"/>
+                <w:sz w:val="25"/>
               </w:rPr>
               <w:t>StudioKrew, Delhi (3m)</w:t>
             </w:r>
@@ -463,19 +463,19 @@
               <w:rPr>
                 <w:b w:val="0"/>
                 <w:color w:val="334155"/>
-                <w:sz w:val="20"/>
+                <w:sz w:val="24"/>
               </w:rPr>
               <w:t xml:space="preserve">  •  Mar 2024 – May 2024</w:t>
             </w:r>
           </w:p>
           <w:p>
             <w:pPr>
-              <w:spacing w:before="0" w:after="0" w:line="252" w:lineRule="auto"/>
+              <w:spacing w:before="0" w:after="0" w:line="230" w:lineRule="auto"/>
             </w:pPr>
             <w:r>
               <w:rPr>
                 <w:b/>
-                <w:sz w:val="21"/>
+                <w:sz w:val="25"/>
               </w:rPr>
               <w:t xml:space="preserve">• </w:t>
             </w:r>
@@ -483,7 +483,7 @@
               <w:rPr>
                 <w:b/>
                 <w:color w:val="0F172A"/>
-                <w:sz w:val="21"/>
+                <w:sz w:val="25"/>
               </w:rPr>
               <w:t>Appzia, Pune (1yr)</w:t>
             </w:r>
@@ -491,7 +491,7 @@
               <w:rPr>
                 <w:b w:val="0"/>
                 <w:color w:val="334155"/>
-                <w:sz w:val="20"/>
+                <w:sz w:val="24"/>
               </w:rPr>
               <w:t xml:space="preserve">  •  June 2024 – July 2025</w:t>
             </w:r>
@@ -499,12 +499,12 @@
         </w:tc>
         <w:tc>
           <w:tcPr>
-            <w:tcW w:w="4270" w:type="dxa"/>
+            <w:tcW w:w="4180" w:type="dxa"/>
             <w:tcMar>
-              <w:top w:w="46" w:type="dxa"/>
-              <w:bottom w:w="46" w:type="dxa"/>
-              <w:left w:w="85" w:type="dxa"/>
-              <w:right w:w="85" w:type="dxa"/>
+              <w:top w:w="24" w:type="dxa"/>
+              <w:bottom w:w="24" w:type="dxa"/>
+              <w:left w:w="65" w:type="dxa"/>
+              <w:right w:w="65" w:type="dxa"/>
             </w:tcMar>
             <w:shd w:fill="F8FAFC"/>
             <w:tcBorders>
@@ -517,15 +517,15 @@
           <w:p>
             <w:pPr>
               <w:tabs>
-                <w:tab w:pos="4032" w:val="right"/>
+                <w:tab w:pos="4003" w:val="right"/>
               </w:tabs>
-              <w:spacing w:before="0" w:after="36"/>
+              <w:spacing w:before="0" w:after="16"/>
             </w:pPr>
             <w:r>
               <w:rPr>
                 <w:b/>
                 <w:color w:val="0F172A"/>
-                <w:sz w:val="25"/>
+                <w:sz w:val="29"/>
               </w:rPr>
               <w:t>3 Shipped Titles</w:t>
             </w:r>
@@ -533,7 +533,7 @@
               <w:rPr>
                 <w:b/>
                 <w:color w:val="64748B"/>
-                <w:sz w:val="20"/>
+                <w:sz w:val="24"/>
               </w:rPr>
               <w:tab/>
               <w:t>GOOGLE PLAY</w:t>
@@ -541,12 +541,12 @@
           </w:p>
           <w:p>
             <w:pPr>
-              <w:spacing w:before="0" w:after="30" w:line="252" w:lineRule="auto"/>
+              <w:spacing w:before="0" w:after="10" w:line="230" w:lineRule="auto"/>
             </w:pPr>
             <w:r>
               <w:rPr>
                 <w:b/>
-                <w:sz w:val="21"/>
+                <w:sz w:val="25"/>
               </w:rPr>
               <w:t xml:space="preserve">• </w:t>
             </w:r>
@@ -554,7 +554,7 @@
               <w:rPr>
                 <w:b/>
                 <w:color w:val="0F172A"/>
-                <w:sz w:val="21"/>
+                <w:sz w:val="25"/>
               </w:rPr>
               <w:t xml:space="preserve">Calm Jigsaw   </w:t>
             </w:r>
@@ -565,8 +565,8 @@
                   <w:color w:val="2563EB"/>
                   <w:u w:val="single"/>
                   <w:b/>
-                  <w:sz w:val="21"/>
-                  <w:szCs w:val="21"/>
+                  <w:sz w:val="25"/>
+                  <w:szCs w:val="25"/>
                 </w:rPr>
                 <w:t>[Store ↗]</w:t>
               </w:r>
@@ -574,12 +574,12 @@
           </w:p>
           <w:p>
             <w:pPr>
-              <w:spacing w:before="0" w:after="30" w:line="252" w:lineRule="auto"/>
+              <w:spacing w:before="0" w:after="10" w:line="230" w:lineRule="auto"/>
             </w:pPr>
             <w:r>
               <w:rPr>
                 <w:b/>
-                <w:sz w:val="21"/>
+                <w:sz w:val="25"/>
               </w:rPr>
               <w:t xml:space="preserve">• </w:t>
             </w:r>
@@ -587,7 +587,7 @@
               <w:rPr>
                 <w:b/>
                 <w:color w:val="0F172A"/>
-                <w:sz w:val="21"/>
+                <w:sz w:val="25"/>
               </w:rPr>
               <w:t xml:space="preserve">MeowSweeper   </w:t>
             </w:r>
@@ -598,8 +598,8 @@
                   <w:color w:val="2563EB"/>
                   <w:u w:val="single"/>
                   <w:b/>
-                  <w:sz w:val="21"/>
-                  <w:szCs w:val="21"/>
+                  <w:sz w:val="25"/>
+                  <w:szCs w:val="25"/>
                 </w:rPr>
                 <w:t>[Store ↗]</w:t>
               </w:r>
@@ -607,12 +607,12 @@
           </w:p>
           <w:p>
             <w:pPr>
-              <w:spacing w:before="0" w:after="0" w:line="252" w:lineRule="auto"/>
+              <w:spacing w:before="0" w:after="0" w:line="230" w:lineRule="auto"/>
             </w:pPr>
             <w:r>
               <w:rPr>
                 <w:b/>
-                <w:sz w:val="21"/>
+                <w:sz w:val="25"/>
               </w:rPr>
               <w:t xml:space="preserve">• </w:t>
             </w:r>
@@ -620,7 +620,7 @@
               <w:rPr>
                 <w:b/>
                 <w:color w:val="0F172A"/>
-                <w:sz w:val="21"/>
+                <w:sz w:val="25"/>
               </w:rPr>
               <w:t xml:space="preserve">Calm Solitaire   </w:t>
             </w:r>
@@ -631,8 +631,8 @@
                   <w:color w:val="2563EB"/>
                   <w:u w:val="single"/>
                   <w:b/>
-                  <w:sz w:val="21"/>
-                  <w:szCs w:val="21"/>
+                  <w:sz w:val="25"/>
+                  <w:szCs w:val="25"/>
                 </w:rPr>
                 <w:t>[Store ↗]</w:t>
               </w:r>
@@ -647,12 +647,12 @@
         <w:tc>
           <w:tcPr>
             <w:gridSpan w:val="2"/>
-            <w:tcW w:w="11220" w:type="dxa"/>
+            <w:tcW w:w="11630" w:type="dxa"/>
             <w:tcMar>
-              <w:top w:w="46" w:type="dxa"/>
-              <w:bottom w:w="46" w:type="dxa"/>
-              <w:left w:w="85" w:type="dxa"/>
-              <w:right w:w="85" w:type="dxa"/>
+              <w:top w:w="24" w:type="dxa"/>
+              <w:bottom w:w="24" w:type="dxa"/>
+              <w:left w:w="65" w:type="dxa"/>
+              <w:right w:w="65" w:type="dxa"/>
             </w:tcMar>
             <w:shd w:fill="F8FAFC"/>
             <w:tcBorders>
@@ -664,13 +664,13 @@
           </w:tcPr>
           <w:p>
             <w:pPr>
-              <w:spacing w:before="0" w:after="36"/>
+              <w:spacing w:before="0" w:after="16"/>
             </w:pPr>
             <w:r>
               <w:rPr>
                 <w:b/>
                 <w:color w:val="0F172A"/>
-                <w:sz w:val="25"/>
+                <w:sz w:val="29"/>
               </w:rPr>
               <w:t xml:space="preserve">Engineered Subsystems    </w:t>
             </w:r>
@@ -681,8 +681,8 @@
                   <w:color w:val="059669"/>
                   <w:u w:val="single"/>
                   <w:b/>
-                  <w:sz w:val="22"/>
-                  <w:szCs w:val="22"/>
+                  <w:sz w:val="26"/>
+                  <w:szCs w:val="26"/>
                 </w:rPr>
                 <w:t>[Unity Playable Demo ↗]</w:t>
               </w:r>
@@ -691,18 +691,18 @@
           <w:p>
             <w:pPr>
               <w:tabs>
-                <w:tab w:pos="2189" w:val="left"/>
-                <w:tab w:pos="4550" w:val="left"/>
-                <w:tab w:pos="6883" w:val="left"/>
-                <w:tab w:pos="8957" w:val="left"/>
+                <w:tab w:pos="2362" w:val="left"/>
+                <w:tab w:pos="4752" w:val="left"/>
+                <w:tab w:pos="7142" w:val="left"/>
+                <w:tab w:pos="9389" w:val="left"/>
               </w:tabs>
-              <w:spacing w:before="0" w:after="30" w:line="252" w:lineRule="auto"/>
+              <w:spacing w:before="0" w:after="10" w:line="230" w:lineRule="auto"/>
             </w:pPr>
             <w:r>
               <w:rPr>
                 <w:b/>
                 <w:color w:val="1E293B"/>
-                <w:sz w:val="21"/>
+                <w:sz w:val="25"/>
               </w:rPr>
               <w:t>• Procedural Jigsaw</w:t>
               <w:tab/>
@@ -718,18 +718,18 @@
           <w:p>
             <w:pPr>
               <w:tabs>
-                <w:tab w:pos="2189" w:val="left"/>
-                <w:tab w:pos="4550" w:val="left"/>
-                <w:tab w:pos="6883" w:val="left"/>
-                <w:tab w:pos="8957" w:val="left"/>
+                <w:tab w:pos="2362" w:val="left"/>
+                <w:tab w:pos="4752" w:val="left"/>
+                <w:tab w:pos="7142" w:val="left"/>
+                <w:tab w:pos="9389" w:val="left"/>
               </w:tabs>
-              <w:spacing w:before="0" w:after="0" w:line="252" w:lineRule="auto"/>
+              <w:spacing w:before="0" w:after="0" w:line="230" w:lineRule="auto"/>
             </w:pPr>
             <w:r>
               <w:rPr>
                 <w:b/>
                 <w:color w:val="1E293B"/>
-                <w:sz w:val="21"/>
+                <w:sz w:val="25"/>
               </w:rPr>
               <w:t>• Offline Leaderboard</w:t>
               <w:tab/>
@@ -737,7 +737,7 @@
               <w:tab/>
               <w:t>• Argos Localization</w:t>
               <w:tab/>
-              <w:t>• Asset Organizer Tool</w:t>
+              <w:t>• Asset Organizer</w:t>
               <w:tab/>
               <w:t>• Arrow Strike</w:t>
             </w:r>
@@ -751,12 +751,12 @@
         <w:tc>
           <w:tcPr>
             <w:gridSpan w:val="2"/>
-            <w:tcW w:w="11220" w:type="dxa"/>
+            <w:tcW w:w="11630" w:type="dxa"/>
             <w:tcMar>
-              <w:top w:w="46" w:type="dxa"/>
-              <w:bottom w:w="46" w:type="dxa"/>
-              <w:left w:w="85" w:type="dxa"/>
-              <w:right w:w="85" w:type="dxa"/>
+              <w:top w:w="24" w:type="dxa"/>
+              <w:bottom w:w="24" w:type="dxa"/>
+              <w:left w:w="65" w:type="dxa"/>
+              <w:right w:w="65" w:type="dxa"/>
             </w:tcMar>
             <w:shd w:fill="F8FAFC"/>
             <w:tcBorders>
@@ -768,13 +768,13 @@
           </w:tcPr>
           <w:p>
             <w:pPr>
-              <w:spacing w:before="0" w:after="36"/>
+              <w:spacing w:before="0" w:after="16"/>
             </w:pPr>
             <w:r>
               <w:rPr>
                 <w:b/>
                 <w:color w:val="0F172A"/>
-                <w:sz w:val="25"/>
+                <w:sz w:val="29"/>
               </w:rPr>
               <w:t xml:space="preserve">Early-Career Prototypes    </w:t>
             </w:r>
@@ -785,15 +785,15 @@
                   <w:color w:val="9333EA"/>
                   <w:u w:val="single"/>
                   <w:b/>
-                  <w:sz w:val="22"/>
-                  <w:szCs w:val="22"/>
+                  <w:sz w:val="26"/>
+                  <w:szCs w:val="26"/>
                 </w:rPr>
                 <w:t>[GitLab Repo ↗]</w:t>
               </w:r>
             </w:hyperlink>
             <w:r>
               <w:rPr>
-                <w:sz w:val="22"/>
+                <w:sz w:val="26"/>
               </w:rPr>
               <w:t xml:space="preserve">    </w:t>
             </w:r>
@@ -804,8 +804,8 @@
                   <w:color w:val="9333EA"/>
                   <w:u w:val="single"/>
                   <w:b/>
-                  <w:sz w:val="22"/>
-                  <w:szCs w:val="22"/>
+                  <w:sz w:val="26"/>
+                  <w:szCs w:val="26"/>
                 </w:rPr>
                 <w:t>[Demos ↗]</w:t>
               </w:r>
@@ -813,7 +813,7 @@
           </w:p>
           <w:p>
             <w:pPr>
-              <w:spacing w:before="0" w:after="0" w:line="252" w:lineRule="auto"/>
+              <w:spacing w:before="0" w:after="0" w:line="230" w:lineRule="auto"/>
             </w:pPr>
             <w:hyperlink r:id="rId20">
               <w:r>
@@ -822,22 +822,22 @@
                   <w:color w:val="7E22CE"/>
                   <w:u w:val="single"/>
                   <w:b/>
-                  <w:sz w:val="21"/>
-                  <w:szCs w:val="21"/>
+                  <w:sz w:val="25"/>
+                  <w:szCs w:val="25"/>
                 </w:rPr>
                 <w:t>This Is Blast</w:t>
               </w:r>
               <w:r>
                 <w:rPr>
                   <w:rFonts w:ascii="Calibri" w:hAnsi="Calibri"/>
-                  <w:sz w:val="19"/>
+                  <w:sz w:val="23"/>
                 </w:rPr>
                 <w:t xml:space="preserve"> </w:t>
               </w:r>
               <w:r>
                 <w:drawing>
                   <wp:inline xmlns:a="http://schemas.openxmlformats.org/drawingml/2006/main" xmlns:pic="http://schemas.openxmlformats.org/drawingml/2006/picture">
-                    <wp:extent cx="111760" cy="111760"/>
+                    <wp:extent cx="133350" cy="133350"/>
                     <wp:docPr id="1" name="Picture 1"/>
                     <wp:cNvGraphicFramePr>
                       <a:graphicFrameLocks noChangeAspect="1"/>
@@ -858,7 +858,7 @@
                           <pic:spPr>
                             <a:xfrm>
                               <a:off x="0" y="0"/>
-                              <a:ext cx="111760" cy="111760"/>
+                              <a:ext cx="133350" cy="133350"/>
                             </a:xfrm>
                             <a:prstGeom prst="rect"/>
                           </pic:spPr>
@@ -872,9 +872,9 @@
             <w:r>
               <w:rPr>
                 <w:color w:val="94A3B8"/>
-                <w:sz w:val="21"/>
+                <w:sz w:val="25"/>
               </w:rPr>
-              <w:t xml:space="preserve">   •   </w:t>
+              <w:t xml:space="preserve">  •  </w:t>
             </w:r>
             <w:hyperlink r:id="rId22">
               <w:r>
@@ -883,22 +883,22 @@
                   <w:color w:val="7E22CE"/>
                   <w:u w:val="single"/>
                   <w:b/>
-                  <w:sz w:val="21"/>
-                  <w:szCs w:val="21"/>
+                  <w:sz w:val="25"/>
+                  <w:szCs w:val="25"/>
                 </w:rPr>
                 <w:t>Arrow Strike</w:t>
               </w:r>
               <w:r>
                 <w:rPr>
                   <w:rFonts w:ascii="Calibri" w:hAnsi="Calibri"/>
-                  <w:sz w:val="19"/>
+                  <w:sz w:val="23"/>
                 </w:rPr>
                 <w:t xml:space="preserve"> </w:t>
               </w:r>
               <w:r>
                 <w:drawing>
                   <wp:inline xmlns:a="http://schemas.openxmlformats.org/drawingml/2006/main" xmlns:pic="http://schemas.openxmlformats.org/drawingml/2006/picture">
-                    <wp:extent cx="111760" cy="111760"/>
+                    <wp:extent cx="133350" cy="133350"/>
                     <wp:docPr id="2" name="Picture 2"/>
                     <wp:cNvGraphicFramePr>
                       <a:graphicFrameLocks noChangeAspect="1"/>
@@ -919,7 +919,7 @@
                           <pic:spPr>
                             <a:xfrm>
                               <a:off x="0" y="0"/>
-                              <a:ext cx="111760" cy="111760"/>
+                              <a:ext cx="133350" cy="133350"/>
                             </a:xfrm>
                             <a:prstGeom prst="rect"/>
                           </pic:spPr>
@@ -933,9 +933,9 @@
             <w:r>
               <w:rPr>
                 <w:color w:val="94A3B8"/>
-                <w:sz w:val="21"/>
+                <w:sz w:val="25"/>
               </w:rPr>
-              <w:t xml:space="preserve">   •   </w:t>
+              <w:t xml:space="preserve">  •  </w:t>
             </w:r>
             <w:hyperlink r:id="rId23">
               <w:r>
@@ -944,22 +944,22 @@
                   <w:color w:val="7E22CE"/>
                   <w:u w:val="single"/>
                   <w:b/>
-                  <w:sz w:val="21"/>
-                  <w:szCs w:val="21"/>
+                  <w:sz w:val="25"/>
+                  <w:szCs w:val="25"/>
                 </w:rPr>
                 <w:t>Tank Battle</w:t>
               </w:r>
               <w:r>
                 <w:rPr>
                   <w:rFonts w:ascii="Calibri" w:hAnsi="Calibri"/>
-                  <w:sz w:val="19"/>
+                  <w:sz w:val="23"/>
                 </w:rPr>
                 <w:t xml:space="preserve"> </w:t>
               </w:r>
               <w:r>
                 <w:drawing>
                   <wp:inline xmlns:a="http://schemas.openxmlformats.org/drawingml/2006/main" xmlns:pic="http://schemas.openxmlformats.org/drawingml/2006/picture">
-                    <wp:extent cx="111760" cy="111760"/>
+                    <wp:extent cx="133350" cy="133350"/>
                     <wp:docPr id="3" name="Picture 3"/>
                     <wp:cNvGraphicFramePr>
                       <a:graphicFrameLocks noChangeAspect="1"/>
@@ -980,7 +980,7 @@
                           <pic:spPr>
                             <a:xfrm>
                               <a:off x="0" y="0"/>
-                              <a:ext cx="111760" cy="111760"/>
+                              <a:ext cx="133350" cy="133350"/>
                             </a:xfrm>
                             <a:prstGeom prst="rect"/>
                           </pic:spPr>
@@ -994,9 +994,9 @@
             <w:r>
               <w:rPr>
                 <w:color w:val="94A3B8"/>
-                <w:sz w:val="21"/>
+                <w:sz w:val="25"/>
               </w:rPr>
-              <w:t xml:space="preserve">   •   </w:t>
+              <w:t xml:space="preserve">  •  </w:t>
             </w:r>
             <w:hyperlink r:id="rId24">
               <w:r>
@@ -1005,22 +1005,22 @@
                   <w:color w:val="7E22CE"/>
                   <w:u w:val="single"/>
                   <w:b/>
-                  <w:sz w:val="21"/>
-                  <w:szCs w:val="21"/>
+                  <w:sz w:val="25"/>
+                  <w:szCs w:val="25"/>
                 </w:rPr>
                 <w:t>Bullet Chess</w:t>
               </w:r>
               <w:r>
                 <w:rPr>
                   <w:rFonts w:ascii="Calibri" w:hAnsi="Calibri"/>
-                  <w:sz w:val="19"/>
+                  <w:sz w:val="23"/>
                 </w:rPr>
                 <w:t xml:space="preserve"> </w:t>
               </w:r>
               <w:r>
                 <w:drawing>
                   <wp:inline xmlns:a="http://schemas.openxmlformats.org/drawingml/2006/main" xmlns:pic="http://schemas.openxmlformats.org/drawingml/2006/picture">
-                    <wp:extent cx="111760" cy="111760"/>
+                    <wp:extent cx="133350" cy="133350"/>
                     <wp:docPr id="4" name="Picture 4"/>
                     <wp:cNvGraphicFramePr>
                       <a:graphicFrameLocks noChangeAspect="1"/>
@@ -1041,7 +1041,7 @@
                           <pic:spPr>
                             <a:xfrm>
                               <a:off x="0" y="0"/>
-                              <a:ext cx="111760" cy="111760"/>
+                              <a:ext cx="133350" cy="133350"/>
                             </a:xfrm>
                             <a:prstGeom prst="rect"/>
                           </pic:spPr>
@@ -1055,9 +1055,9 @@
             <w:r>
               <w:rPr>
                 <w:color w:val="94A3B8"/>
-                <w:sz w:val="21"/>
+                <w:sz w:val="25"/>
               </w:rPr>
-              <w:t xml:space="preserve">   •   </w:t>
+              <w:t xml:space="preserve">  •  </w:t>
             </w:r>
             <w:hyperlink r:id="rId25">
               <w:r>
@@ -1066,22 +1066,22 @@
                   <w:color w:val="7E22CE"/>
                   <w:u w:val="single"/>
                   <w:b/>
-                  <w:sz w:val="21"/>
-                  <w:szCs w:val="21"/>
+                  <w:sz w:val="25"/>
+                  <w:szCs w:val="25"/>
                 </w:rPr>
                 <w:t>Tycoon RTS</w:t>
               </w:r>
               <w:r>
                 <w:rPr>
                   <w:rFonts w:ascii="Calibri" w:hAnsi="Calibri"/>
-                  <w:sz w:val="19"/>
+                  <w:sz w:val="23"/>
                 </w:rPr>
                 <w:t xml:space="preserve"> </w:t>
               </w:r>
               <w:r>
                 <w:drawing>
                   <wp:inline xmlns:a="http://schemas.openxmlformats.org/drawingml/2006/main" xmlns:pic="http://schemas.openxmlformats.org/drawingml/2006/picture">
-                    <wp:extent cx="111760" cy="111760"/>
+                    <wp:extent cx="133350" cy="133350"/>
                     <wp:docPr id="5" name="Picture 5"/>
                     <wp:cNvGraphicFramePr>
                       <a:graphicFrameLocks noChangeAspect="1"/>
@@ -1102,7 +1102,7 @@
                           <pic:spPr>
                             <a:xfrm>
                               <a:off x="0" y="0"/>
-                              <a:ext cx="111760" cy="111760"/>
+                              <a:ext cx="133350" cy="133350"/>
                             </a:xfrm>
                             <a:prstGeom prst="rect"/>
                           </pic:spPr>
@@ -1116,9 +1116,9 @@
             <w:r>
               <w:rPr>
                 <w:color w:val="94A3B8"/>
-                <w:sz w:val="21"/>
+                <w:sz w:val="25"/>
               </w:rPr>
-              <w:t xml:space="preserve">   •   </w:t>
+              <w:t xml:space="preserve">  •  </w:t>
             </w:r>
             <w:hyperlink r:id="rId19">
               <w:r>
@@ -1127,22 +1127,22 @@
                   <w:color w:val="7E22CE"/>
                   <w:u w:val="single"/>
                   <w:b/>
-                  <w:sz w:val="21"/>
-                  <w:szCs w:val="21"/>
+                  <w:sz w:val="25"/>
+                  <w:szCs w:val="25"/>
                 </w:rPr>
                 <w:t>Trivologist</w:t>
               </w:r>
               <w:r>
                 <w:rPr>
                   <w:rFonts w:ascii="Calibri" w:hAnsi="Calibri"/>
-                  <w:sz w:val="19"/>
+                  <w:sz w:val="23"/>
                 </w:rPr>
                 <w:t xml:space="preserve"> </w:t>
               </w:r>
               <w:r>
                 <w:drawing>
                   <wp:inline xmlns:a="http://schemas.openxmlformats.org/drawingml/2006/main" xmlns:pic="http://schemas.openxmlformats.org/drawingml/2006/picture">
-                    <wp:extent cx="111760" cy="111760"/>
+                    <wp:extent cx="133350" cy="133350"/>
                     <wp:docPr id="6" name="Picture 6"/>
                     <wp:cNvGraphicFramePr>
                       <a:graphicFrameLocks noChangeAspect="1"/>
@@ -1163,7 +1163,7 @@
                           <pic:spPr>
                             <a:xfrm>
                               <a:off x="0" y="0"/>
-                              <a:ext cx="111760" cy="111760"/>
+                              <a:ext cx="133350" cy="133350"/>
                             </a:xfrm>
                             <a:prstGeom prst="rect"/>
                           </pic:spPr>
@@ -1182,12 +1182,12 @@
       <w:pPr>
         <w:keepNext/>
         <w:tabs>
-          <w:tab w:pos="11318" w:val="right"/>
+          <w:tab w:pos="11722" w:val="right"/>
         </w:tabs>
-        <w:spacing w:before="90" w:after="50"/>
+        <w:spacing w:before="40" w:after="24"/>
         <w:pBdr>
           <w:left w:val="single" w:sz="24" w:space="6" w:color="4F46E5"/>
-          <w:bottom w:val="single" w:sz="6" w:space="2" w:color="CBD5E1"/>
+          <w:bottom w:val="single" w:sz="6" w:space="1" w:color="CBD5E1"/>
         </w:pBdr>
       </w:pPr>
       <w:r>
@@ -1195,7 +1195,7 @@
           <w:rFonts w:ascii="Calibri" w:hAnsi="Calibri"/>
           <w:b/>
           <w:color w:val="0F172A"/>
-          <w:sz w:val="24"/>
+          <w:sz w:val="28"/>
         </w:rPr>
         <w:t>PROFESSIONAL STUDIO EXPERIENCE</w:t>
       </w:r>
@@ -1204,7 +1204,7 @@
           <w:rFonts w:ascii="Calibri" w:hAnsi="Calibri"/>
           <w:b w:val="0"/>
           <w:color w:val="64748B"/>
-          <w:sz w:val="21"/>
+          <w:sz w:val="25"/>
         </w:rPr>
         <w:tab/>
         <w:t>Commercial Production Roles &amp; Systems</w:t>
@@ -1218,7 +1218,7 @@
         <w:tblLook w:firstColumn="1" w:firstRow="1" w:lastColumn="0" w:lastRow="0" w:noHBand="0" w:noVBand="1" w:val="04A0"/>
       </w:tblPr>
       <w:tblGrid>
-        <w:gridCol w:w="11318"/>
+        <w:gridCol w:w="11720"/>
       </w:tblGrid>
       <w:tr>
         <w:trPr>
@@ -1226,7 +1226,7 @@
         </w:trPr>
         <w:tc>
           <w:tcPr>
-            <w:tcW w:w="11318" w:type="dxa"/>
+            <w:tcW w:w="11720" w:type="dxa"/>
             <w:shd w:fill="F8FAFC"/>
             <w:tcBorders>
               <w:top w:val="single" w:sz="16" w:space="0" w:color="2563EB"/>
@@ -1235,39 +1235,39 @@
               <w:right w:val="single" w:sz="6" w:space="0" w:color="60A5FA"/>
             </w:tcBorders>
             <w:tcMar>
-              <w:top w:w="46" w:type="dxa"/>
-              <w:bottom w:w="46" w:type="dxa"/>
-              <w:left w:w="90" w:type="dxa"/>
-              <w:right w:w="90" w:type="dxa"/>
+              <w:top w:w="22" w:type="dxa"/>
+              <w:bottom w:w="22" w:type="dxa"/>
+              <w:left w:w="65" w:type="dxa"/>
+              <w:right w:w="65" w:type="dxa"/>
             </w:tcMar>
           </w:tcPr>
           <w:p>
             <w:pPr>
               <w:tabs>
-                <w:tab w:pos="10872" w:val="right"/>
+                <w:tab w:pos="11405" w:val="right"/>
               </w:tabs>
-              <w:spacing w:before="0" w:after="20"/>
+              <w:spacing w:before="0" w:after="10"/>
             </w:pPr>
             <w:r>
               <w:rPr>
                 <w:b/>
                 <w:color w:val="0F172A"/>
-                <w:sz w:val="26"/>
+                <w:sz w:val="30"/>
               </w:rPr>
               <w:t>Vasundhara Game Studio</w:t>
             </w:r>
             <w:r>
               <w:rPr>
                 <w:color w:val="94A3B8"/>
-                <w:sz w:val="24"/>
+                <w:sz w:val="28"/>
               </w:rPr>
-              <w:t xml:space="preserve">   |   </w:t>
+              <w:t xml:space="preserve">  |  </w:t>
             </w:r>
             <w:r>
               <w:rPr>
                 <w:b/>
                 <w:color w:val="334155"/>
-                <w:sz w:val="24"/>
+                <w:sz w:val="28"/>
               </w:rPr>
               <w:t>AI Product Developer — Unity Systems &amp; Gameplay</w:t>
             </w:r>
@@ -1275,7 +1275,7 @@
               <w:rPr>
                 <w:b/>
                 <w:color w:val="059669"/>
-                <w:sz w:val="21"/>
+                <w:sz w:val="25"/>
               </w:rPr>
               <w:tab/>
               <w:t>[ CURRENT ]</w:t>
@@ -1283,168 +1283,168 @@
           </w:p>
           <w:p>
             <w:pPr>
-              <w:spacing w:before="0" w:after="50"/>
+              <w:spacing w:before="0" w:after="24"/>
               <w:pBdr>
-                <w:bottom w:val="single" w:sz="4" w:space="2" w:color="CBD5E1"/>
+                <w:bottom w:val="single" w:sz="4" w:space="1" w:color="CBD5E1"/>
               </w:pBdr>
             </w:pPr>
             <w:r>
               <w:rPr>
                 <w:color w:val="64748B"/>
-                <w:sz w:val="21"/>
+                <w:sz w:val="25"/>
               </w:rPr>
-              <w:t xml:space="preserve">Surat, GJ   •   </w:t>
+              <w:t xml:space="preserve">Surat, GJ  •  </w:t>
             </w:r>
             <w:r>
               <w:rPr>
                 <w:b/>
                 <w:color w:val="0F172A"/>
-                <w:sz w:val="21"/>
+                <w:sz w:val="25"/>
               </w:rPr>
               <w:t>Dec 2024 – Jan 2025 &amp; Dec 2025 – Present</w:t>
             </w:r>
           </w:p>
           <w:p>
             <w:pPr>
-              <w:spacing w:before="0" w:after="32" w:line="252" w:lineRule="auto"/>
-              <w:ind w:left="230" w:hanging="202"/>
+              <w:spacing w:before="0" w:after="12" w:line="228" w:lineRule="auto"/>
+              <w:ind w:left="202" w:hanging="173"/>
             </w:pPr>
             <w:r>
               <w:rPr>
                 <w:b/>
                 <w:color w:val="2563EB"/>
-                <w:sz w:val="22"/>
+                <w:sz w:val="26"/>
               </w:rPr>
-              <w:t xml:space="preserve">•  </w:t>
+              <w:t xml:space="preserve">• </w:t>
             </w:r>
             <w:r>
               <w:rPr>
                 <w:b/>
                 <w:color w:val="0F172A"/>
-                <w:sz w:val="22"/>
+                <w:sz w:val="26"/>
               </w:rPr>
               <w:t xml:space="preserve">Procedural Jigsaw &amp; Shader Mask (Calm Jigsaw): </w:t>
             </w:r>
             <w:r>
               <w:rPr>
                 <w:color w:val="334155"/>
-                <w:sz w:val="22"/>
+                <w:sz w:val="26"/>
               </w:rPr>
-              <w:t>Architected N×N Bezier puzzle generator using 9 mathematical edge signatures, dynamic UV quad mesh generation, and custom URP/HLSL shader masking with zero pre-sliced art.</w:t>
+              <w:t>Architected N×N Bezier puzzle generator using 9 mathematical edge signatures, dynamic UV quad meshes, and custom URP/HLSL shader masking with zero pre-sliced art.</w:t>
             </w:r>
           </w:p>
           <w:p>
             <w:pPr>
-              <w:spacing w:before="0" w:after="32" w:line="252" w:lineRule="auto"/>
-              <w:ind w:left="230" w:hanging="202"/>
+              <w:spacing w:before="0" w:after="12" w:line="228" w:lineRule="auto"/>
+              <w:ind w:left="202" w:hanging="173"/>
             </w:pPr>
             <w:r>
               <w:rPr>
                 <w:b/>
                 <w:color w:val="2563EB"/>
-                <w:sz w:val="22"/>
+                <w:sz w:val="26"/>
               </w:rPr>
-              <w:t xml:space="preserve">•  </w:t>
+              <w:t xml:space="preserve">• </w:t>
             </w:r>
             <w:r>
               <w:rPr>
                 <w:b/>
                 <w:color w:val="0F172A"/>
-                <w:sz w:val="22"/>
+                <w:sz w:val="26"/>
               </w:rPr>
               <w:t xml:space="preserve">Native Image Bridge &amp; OTA Sync: </w:t>
             </w:r>
             <w:r>
               <w:rPr>
                 <w:color w:val="334155"/>
-                <w:sz w:val="22"/>
+                <w:sz w:val="26"/>
               </w:rPr>
               <w:t>Engineered C# bridge over native Android (JNI) / iOS (Obj-C) APIs for 3-tier RAM LRU and disk caching, texture downsampling, and non-blocking OTA manifest level delivery.</w:t>
             </w:r>
           </w:p>
           <w:p>
             <w:pPr>
-              <w:spacing w:before="0" w:after="32" w:line="252" w:lineRule="auto"/>
-              <w:ind w:left="230" w:hanging="202"/>
+              <w:spacing w:before="0" w:after="12" w:line="228" w:lineRule="auto"/>
+              <w:ind w:left="202" w:hanging="173"/>
             </w:pPr>
             <w:r>
               <w:rPr>
                 <w:b/>
                 <w:color w:val="2563EB"/>
-                <w:sz w:val="22"/>
+                <w:sz w:val="26"/>
               </w:rPr>
-              <w:t xml:space="preserve">•  </w:t>
+              <w:t xml:space="preserve">• </w:t>
             </w:r>
             <w:r>
               <w:rPr>
                 <w:b/>
                 <w:color w:val="0F172A"/>
-                <w:sz w:val="22"/>
+                <w:sz w:val="26"/>
               </w:rPr>
               <w:t xml:space="preserve">Hybrid Logic &amp; Hint-Cascade Solver (MeowSweeper): </w:t>
             </w:r>
             <w:r>
               <w:rPr>
                 <w:color w:val="334155"/>
-                <w:sz w:val="22"/>
+                <w:sz w:val="26"/>
               </w:rPr>
-              <w:t>Built hybrid Sudoku/Minesweeper/Star-Battle puzzle engine with backtracking hint-cascade solver FSM, discrete multi-touch locks, and persistent IAP powerup wallet.</w:t>
+              <w:t>Built hybrid Sudoku/Minesweeper/Star-Battle puzzle engine with backtracking hint-cascade solver FSM, discrete multi-touch locks, and IAP powerup wallet.</w:t>
             </w:r>
           </w:p>
           <w:p>
             <w:pPr>
-              <w:spacing w:before="0" w:after="32" w:line="252" w:lineRule="auto"/>
-              <w:ind w:left="230" w:hanging="202"/>
+              <w:spacing w:before="0" w:after="12" w:line="228" w:lineRule="auto"/>
+              <w:ind w:left="202" w:hanging="173"/>
             </w:pPr>
             <w:r>
               <w:rPr>
                 <w:b/>
                 <w:color w:val="2563EB"/>
-                <w:sz w:val="22"/>
+                <w:sz w:val="26"/>
               </w:rPr>
-              <w:t xml:space="preserve">•  </w:t>
+              <w:t xml:space="preserve">• </w:t>
             </w:r>
             <w:r>
               <w:rPr>
                 <w:b/>
                 <w:color w:val="0F172A"/>
-                <w:sz w:val="22"/>
+                <w:sz w:val="26"/>
               </w:rPr>
               <w:t xml:space="preserve">Card Seam Merging &amp; Arrow Mechanics (Calm Solitaire &amp; Arrow): </w:t>
             </w:r>
             <w:r>
               <w:rPr>
                 <w:color w:val="334155"/>
-                <w:sz w:val="22"/>
+                <w:sz w:val="26"/>
               </w:rPr>
               <w:t>Engineered rectangular card-grid 0px seam merging, displacement swapping, procedural flame noise shaders, and outside-in peeling arrow escape mechanics.</w:t>
             </w:r>
           </w:p>
           <w:p>
             <w:pPr>
-              <w:spacing w:before="0" w:after="0" w:line="252" w:lineRule="auto"/>
-              <w:ind w:left="230" w:hanging="202"/>
+              <w:spacing w:before="0" w:after="0" w:line="228" w:lineRule="auto"/>
+              <w:ind w:left="202" w:hanging="173"/>
             </w:pPr>
             <w:r>
               <w:rPr>
                 <w:b/>
                 <w:color w:val="2563EB"/>
-                <w:sz w:val="22"/>
+                <w:sz w:val="26"/>
               </w:rPr>
-              <w:t xml:space="preserve">•  </w:t>
+              <w:t xml:space="preserve">• </w:t>
             </w:r>
             <w:r>
               <w:rPr>
                 <w:b/>
                 <w:color w:val="0F172A"/>
-                <w:sz w:val="22"/>
+                <w:sz w:val="26"/>
               </w:rPr>
               <w:t xml:space="preserve">Offline Leaderboard, IAP &amp; Editor Tooling: </w:t>
             </w:r>
             <w:r>
               <w:rPr>
                 <w:color w:val="334155"/>
-                <w:sz w:val="22"/>
+                <w:sz w:val="26"/>
               </w:rPr>
               <w:t>Built zero-server bot-paced seasonal leaderboards with anti-rollback clamping, Google/Apple IAP state machines, Asset Organizer EditorWindow, and Argos IPC localization.</w:t>
             </w:r>
@@ -1456,13 +1456,13 @@
       <w:pPr>
         <w:keepNext/>
         <w:tabs>
-          <w:tab w:pos="11318" w:val="right"/>
+          <w:tab w:pos="11722" w:val="right"/>
         </w:tabs>
-        <w:spacing w:before="0" w:after="110"/>
+        <w:spacing w:before="0" w:after="70"/>
         <w:pageBreakBefore/>
         <w:pBdr>
           <w:left w:val="single" w:sz="24" w:space="6" w:color="4F46E5"/>
-          <w:bottom w:val="single" w:sz="6" w:space="2" w:color="CBD5E1"/>
+          <w:bottom w:val="single" w:sz="6" w:space="1" w:color="CBD5E1"/>
         </w:pBdr>
       </w:pPr>
       <w:r>
@@ -1470,7 +1470,7 @@
           <w:rFonts w:ascii="Calibri" w:hAnsi="Calibri"/>
           <w:b/>
           <w:color w:val="0F172A"/>
-          <w:sz w:val="24"/>
+          <w:sz w:val="28"/>
         </w:rPr>
         <w:t>PROFESSIONAL STUDIO EXPERIENCE (CONTINUED)</w:t>
       </w:r>
@@ -1479,7 +1479,7 @@
           <w:rFonts w:ascii="Calibri" w:hAnsi="Calibri"/>
           <w:b w:val="0"/>
           <w:color w:val="64748B"/>
-          <w:sz w:val="21"/>
+          <w:sz w:val="25"/>
         </w:rPr>
         <w:tab/>
         <w:t>Multiplayer, AI &amp; Standalone Game Architecture</w:t>
@@ -1493,7 +1493,7 @@
         <w:tblLook w:firstColumn="1" w:firstRow="1" w:lastColumn="0" w:lastRow="0" w:noHBand="0" w:noVBand="1" w:val="04A0"/>
       </w:tblPr>
       <w:tblGrid>
-        <w:gridCol w:w="11318"/>
+        <w:gridCol w:w="11720"/>
       </w:tblGrid>
       <w:tr>
         <w:trPr>
@@ -1501,7 +1501,7 @@
         </w:trPr>
         <w:tc>
           <w:tcPr>
-            <w:tcW w:w="11318" w:type="dxa"/>
+            <w:tcW w:w="11720" w:type="dxa"/>
             <w:shd w:fill="F8FAFC"/>
             <w:tcBorders>
               <w:top w:val="single" w:sz="16" w:space="0" w:color="4F46E5"/>
@@ -1510,42 +1510,42 @@
               <w:right w:val="single" w:sz="6" w:space="0" w:color="818CF8"/>
             </w:tcBorders>
             <w:tcMar>
-              <w:top w:w="85" w:type="dxa"/>
-              <w:bottom w:w="85" w:type="dxa"/>
-              <w:left w:w="90" w:type="dxa"/>
-              <w:right w:w="90" w:type="dxa"/>
+              <w:top w:w="48" w:type="dxa"/>
+              <w:bottom w:w="48" w:type="dxa"/>
+              <w:left w:w="65" w:type="dxa"/>
+              <w:right w:w="65" w:type="dxa"/>
             </w:tcMar>
           </w:tcPr>
           <w:p>
             <w:pPr>
               <w:tabs>
-                <w:tab w:pos="10872" w:val="right"/>
+                <w:tab w:pos="11405" w:val="right"/>
               </w:tabs>
-              <w:spacing w:before="0" w:after="90"/>
+              <w:spacing w:before="0" w:after="50"/>
               <w:pBdr>
-                <w:bottom w:val="single" w:sz="4" w:space="4" w:color="CBD5E1"/>
+                <w:bottom w:val="single" w:sz="4" w:space="2" w:color="CBD5E1"/>
               </w:pBdr>
             </w:pPr>
             <w:r>
               <w:rPr>
                 <w:b/>
                 <w:color w:val="0F172A"/>
-                <w:sz w:val="26"/>
+                <w:sz w:val="30"/>
               </w:rPr>
               <w:t>Appzia</w:t>
             </w:r>
             <w:r>
               <w:rPr>
                 <w:color w:val="94A3B8"/>
-                <w:sz w:val="24"/>
+                <w:sz w:val="28"/>
               </w:rPr>
-              <w:t xml:space="preserve">   |   </w:t>
+              <w:t xml:space="preserve">  |  </w:t>
             </w:r>
             <w:r>
               <w:rPr>
                 <w:b/>
                 <w:color w:val="334155"/>
-                <w:sz w:val="24"/>
+                <w:sz w:val="28"/>
               </w:rPr>
               <w:t>Unity3D Systems &amp; Gameplay Developer</w:t>
             </w:r>
@@ -1553,7 +1553,7 @@
               <w:rPr>
                 <w:b/>
                 <w:color w:val="475569"/>
-                <w:sz w:val="21"/>
+                <w:sz w:val="25"/>
               </w:rPr>
               <w:tab/>
               <w:t>Pune, India  •  June 2024 – July 2025</w:t>
@@ -1561,58 +1561,58 @@
           </w:p>
           <w:p>
             <w:pPr>
-              <w:spacing w:before="0" w:after="90" w:line="283" w:lineRule="auto"/>
-              <w:ind w:left="230" w:hanging="202"/>
+              <w:spacing w:before="0" w:after="50" w:line="250" w:lineRule="auto"/>
+              <w:ind w:left="202" w:hanging="173"/>
             </w:pPr>
             <w:r>
               <w:rPr>
                 <w:b/>
                 <w:color w:val="2563EB"/>
-                <w:sz w:val="22"/>
+                <w:sz w:val="26"/>
               </w:rPr>
-              <w:t xml:space="preserve">•  </w:t>
+              <w:t xml:space="preserve">• </w:t>
             </w:r>
             <w:r>
               <w:rPr>
                 <w:b/>
                 <w:color w:val="0F172A"/>
-                <w:sz w:val="22"/>
+                <w:sz w:val="26"/>
               </w:rPr>
               <w:t xml:space="preserve">Stockfish AI &amp; Real-Time Chess (Bullet Chess): </w:t>
             </w:r>
             <w:r>
               <w:rPr>
                 <w:color w:val="334155"/>
-                <w:sz w:val="22"/>
+                <w:sz w:val="26"/>
               </w:rPr>
               <w:t>Architected multiplayer chess engine using Photon (PUN 2) and Stockfish API for live move evaluation, client-side board validation, clock sync, and tournament brackets.</w:t>
             </w:r>
           </w:p>
           <w:p>
             <w:pPr>
-              <w:spacing w:before="0" w:after="0" w:line="283" w:lineRule="auto"/>
-              <w:ind w:left="230" w:hanging="202"/>
+              <w:spacing w:before="0" w:after="0" w:line="250" w:lineRule="auto"/>
+              <w:ind w:left="202" w:hanging="173"/>
             </w:pPr>
             <w:r>
               <w:rPr>
                 <w:b/>
                 <w:color w:val="2563EB"/>
-                <w:sz w:val="22"/>
+                <w:sz w:val="26"/>
               </w:rPr>
-              <w:t xml:space="preserve">•  </w:t>
+              <w:t xml:space="preserve">• </w:t>
             </w:r>
             <w:r>
               <w:rPr>
                 <w:b/>
                 <w:color w:val="0F172A"/>
-                <w:sz w:val="22"/>
+                <w:sz w:val="26"/>
               </w:rPr>
               <w:t xml:space="preserve">Arcade Simulation &amp; Economy Systems (Pinnacle): </w:t>
             </w:r>
             <w:r>
               <w:rPr>
                 <w:color w:val="334155"/>
-                <w:sz w:val="22"/>
+                <w:sz w:val="26"/>
               </w:rPr>
               <w:t>Led development of Pinnacle arcade simulation replicating physical machines, implementing deterministic FSMs, secure Apple/Google IAP, and Zero-GC object pooling at 60 FPS.</w:t>
             </w:r>
@@ -1622,7 +1622,7 @@
     </w:tbl>
     <w:p>
       <w:pPr>
-        <w:spacing w:before="0" w:after="140"/>
+        <w:spacing w:before="0" w:after="90"/>
       </w:pPr>
       <w:r>
         <w:rPr>
@@ -1638,7 +1638,7 @@
         <w:tblLook w:firstColumn="1" w:firstRow="1" w:lastColumn="0" w:lastRow="0" w:noHBand="0" w:noVBand="1" w:val="04A0"/>
       </w:tblPr>
       <w:tblGrid>
-        <w:gridCol w:w="11318"/>
+        <w:gridCol w:w="11720"/>
       </w:tblGrid>
       <w:tr>
         <w:trPr>
@@ -1646,7 +1646,7 @@
         </w:trPr>
         <w:tc>
           <w:tcPr>
-            <w:tcW w:w="11318" w:type="dxa"/>
+            <w:tcW w:w="11720" w:type="dxa"/>
             <w:shd w:fill="F8FAFC"/>
             <w:tcBorders>
               <w:top w:val="single" w:sz="16" w:space="0" w:color="D97706"/>
@@ -1655,42 +1655,42 @@
               <w:right w:val="single" w:sz="6" w:space="0" w:color="FBBF24"/>
             </w:tcBorders>
             <w:tcMar>
-              <w:top w:w="85" w:type="dxa"/>
-              <w:bottom w:w="85" w:type="dxa"/>
-              <w:left w:w="90" w:type="dxa"/>
-              <w:right w:w="90" w:type="dxa"/>
+              <w:top w:w="48" w:type="dxa"/>
+              <w:bottom w:w="48" w:type="dxa"/>
+              <w:left w:w="65" w:type="dxa"/>
+              <w:right w:w="65" w:type="dxa"/>
             </w:tcMar>
           </w:tcPr>
           <w:p>
             <w:pPr>
               <w:tabs>
-                <w:tab w:pos="10872" w:val="right"/>
+                <w:tab w:pos="11405" w:val="right"/>
               </w:tabs>
-              <w:spacing w:before="0" w:after="90"/>
+              <w:spacing w:before="0" w:after="50"/>
               <w:pBdr>
-                <w:bottom w:val="single" w:sz="4" w:space="4" w:color="CBD5E1"/>
+                <w:bottom w:val="single" w:sz="4" w:space="2" w:color="CBD5E1"/>
               </w:pBdr>
             </w:pPr>
             <w:r>
               <w:rPr>
                 <w:b/>
                 <w:color w:val="0F172A"/>
-                <w:sz w:val="26"/>
+                <w:sz w:val="30"/>
               </w:rPr>
               <w:t>StudioKrew</w:t>
             </w:r>
             <w:r>
               <w:rPr>
                 <w:color w:val="94A3B8"/>
-                <w:sz w:val="24"/>
+                <w:sz w:val="28"/>
               </w:rPr>
-              <w:t xml:space="preserve">   |   </w:t>
+              <w:t xml:space="preserve">  |  </w:t>
             </w:r>
             <w:r>
               <w:rPr>
                 <w:b/>
                 <w:color w:val="334155"/>
-                <w:sz w:val="24"/>
+                <w:sz w:val="28"/>
               </w:rPr>
               <w:t>Unity Game Developer (Remote)</w:t>
             </w:r>
@@ -1698,7 +1698,7 @@
               <w:rPr>
                 <w:b/>
                 <w:color w:val="475569"/>
-                <w:sz w:val="21"/>
+                <w:sz w:val="25"/>
               </w:rPr>
               <w:tab/>
               <w:t>Delhi, India (Remote)  •  March 2024 – May 2024</w:t>
@@ -1706,87 +1706,87 @@
           </w:p>
           <w:p>
             <w:pPr>
-              <w:spacing w:before="0" w:after="90" w:line="283" w:lineRule="auto"/>
-              <w:ind w:left="230" w:hanging="202"/>
+              <w:spacing w:before="0" w:after="50" w:line="250" w:lineRule="auto"/>
+              <w:ind w:left="202" w:hanging="173"/>
             </w:pPr>
             <w:r>
               <w:rPr>
                 <w:b/>
                 <w:color w:val="2563EB"/>
-                <w:sz w:val="22"/>
+                <w:sz w:val="26"/>
               </w:rPr>
-              <w:t xml:space="preserve">•  </w:t>
+              <w:t xml:space="preserve">• </w:t>
             </w:r>
             <w:r>
               <w:rPr>
                 <w:b/>
                 <w:color w:val="0F172A"/>
-                <w:sz w:val="22"/>
+                <w:sz w:val="26"/>
               </w:rPr>
               <w:t xml:space="preserve">Solo Card Game Architecture (FreeCell &amp; Solitaire): </w:t>
             </w:r>
             <w:r>
               <w:rPr>
                 <w:color w:val="334155"/>
-                <w:sz w:val="22"/>
+                <w:sz w:val="26"/>
               </w:rPr>
               <w:t>Delivered complete end-to-end development independently, architecting deterministic card stack rules, memento-based undo/redo state history, and responsive touch controls.</w:t>
             </w:r>
           </w:p>
           <w:p>
             <w:pPr>
-              <w:spacing w:before="0" w:after="90" w:line="283" w:lineRule="auto"/>
-              <w:ind w:left="230" w:hanging="202"/>
+              <w:spacing w:before="0" w:after="50" w:line="250" w:lineRule="auto"/>
+              <w:ind w:left="202" w:hanging="173"/>
             </w:pPr>
             <w:r>
               <w:rPr>
                 <w:b/>
                 <w:color w:val="2563EB"/>
-                <w:sz w:val="22"/>
+                <w:sz w:val="26"/>
               </w:rPr>
-              <w:t xml:space="preserve">•  </w:t>
+              <w:t xml:space="preserve">• </w:t>
             </w:r>
             <w:r>
               <w:rPr>
                 <w:b/>
                 <w:color w:val="0F172A"/>
-                <w:sz w:val="22"/>
+                <w:sz w:val="26"/>
               </w:rPr>
               <w:t xml:space="preserve">Dice Physics &amp; Scoring State Machine (Yahtzee): </w:t>
             </w:r>
             <w:r>
               <w:rPr>
                 <w:color w:val="334155"/>
-                <w:sz w:val="22"/>
+                <w:sz w:val="26"/>
               </w:rPr>
               <w:t>Engineered probabilistic dice-rolling physics, category score validation state machines, and turn-based round flow with fluid particle animations.</w:t>
             </w:r>
           </w:p>
           <w:p>
             <w:pPr>
-              <w:spacing w:before="0" w:after="0" w:line="283" w:lineRule="auto"/>
-              <w:ind w:left="230" w:hanging="202"/>
+              <w:spacing w:before="0" w:after="0" w:line="250" w:lineRule="auto"/>
+              <w:ind w:left="202" w:hanging="173"/>
             </w:pPr>
             <w:r>
               <w:rPr>
                 <w:b/>
                 <w:color w:val="2563EB"/>
-                <w:sz w:val="22"/>
+                <w:sz w:val="26"/>
               </w:rPr>
-              <w:t xml:space="preserve">•  </w:t>
+              <w:t xml:space="preserve">• </w:t>
             </w:r>
             <w:r>
               <w:rPr>
                 <w:b/>
                 <w:color w:val="0F172A"/>
-                <w:sz w:val="22"/>
+                <w:sz w:val="26"/>
               </w:rPr>
               <w:t xml:space="preserve">Grid Puzzle Engine &amp; Serialization (BrokenTiles): </w:t>
             </w:r>
             <w:r>
               <w:rPr>
                 <w:color w:val="334155"/>
-                <w:sz w:val="22"/>
+                <w:sz w:val="26"/>
               </w:rPr>
               <w:t>Developed reactive grid-matching algorithms with cascading tile clearing, implementing lightweight JSON save serialization for instant session recovery.</w:t>
             </w:r>
@@ -1796,7 +1796,7 @@
     </w:tbl>
     <w:p>
       <w:pPr>
-        <w:spacing w:before="0" w:after="100"/>
+        <w:spacing w:before="0" w:after="60"/>
       </w:pPr>
       <w:r>
         <w:rPr>
@@ -1808,12 +1808,12 @@
       <w:pPr>
         <w:keepNext/>
         <w:tabs>
-          <w:tab w:pos="11318" w:val="right"/>
+          <w:tab w:pos="11722" w:val="right"/>
         </w:tabs>
-        <w:spacing w:before="200" w:after="110"/>
+        <w:spacing w:before="100" w:after="70"/>
         <w:pBdr>
           <w:left w:val="single" w:sz="24" w:space="6" w:color="9333EA"/>
-          <w:bottom w:val="single" w:sz="6" w:space="2" w:color="CBD5E1"/>
+          <w:bottom w:val="single" w:sz="6" w:space="1" w:color="CBD5E1"/>
         </w:pBdr>
       </w:pPr>
       <w:r>
@@ -1821,7 +1821,7 @@
           <w:rFonts w:ascii="Calibri" w:hAnsi="Calibri"/>
           <w:b/>
           <w:color w:val="0F172A"/>
-          <w:sz w:val="24"/>
+          <w:sz w:val="28"/>
         </w:rPr>
         <w:t>TECHNICAL SKILLS &amp; ENGINE STACK</w:t>
       </w:r>
@@ -1830,7 +1830,7 @@
           <w:rFonts w:ascii="Calibri" w:hAnsi="Calibri"/>
           <w:b w:val="0"/>
           <w:color w:val="64748B"/>
-          <w:sz w:val="21"/>
+          <w:sz w:val="25"/>
         </w:rPr>
         <w:tab/>
         <w:t>Production Engineering &amp; Tooling Matrix</w:t>
@@ -1842,12 +1842,12 @@
         <w:jc w:val="center"/>
         <w:tblLayout w:type="fixed"/>
         <w:tblLook w:firstColumn="1" w:firstRow="1" w:lastColumn="0" w:lastRow="0" w:noHBand="0" w:noVBand="1" w:val="04A0"/>
-        <w:tblCellSpacing w:w="70" w:type="dxa"/>
+        <w:tblCellSpacing w:w="50" w:type="dxa"/>
       </w:tblPr>
       <w:tblGrid>
-        <w:gridCol w:w="3680"/>
-        <w:gridCol w:w="3680"/>
-        <w:gridCol w:w="3680"/>
+        <w:gridCol w:w="3840"/>
+        <w:gridCol w:w="3840"/>
+        <w:gridCol w:w="3840"/>
       </w:tblGrid>
       <w:tr>
         <w:trPr>
@@ -1855,7 +1855,7 @@
         </w:trPr>
         <w:tc>
           <w:tcPr>
-            <w:tcW w:w="3680" w:type="dxa"/>
+            <w:tcW w:w="3840" w:type="dxa"/>
             <w:shd w:fill="F8FAFC"/>
             <w:tcBorders>
               <w:top w:val="single" w:sz="16" w:space="0" w:color="2563EB"/>
@@ -1864,45 +1864,45 @@
               <w:right w:val="single" w:sz="6" w:space="0" w:color="60A5FA"/>
             </w:tcBorders>
             <w:tcMar>
-              <w:top w:w="85" w:type="dxa"/>
-              <w:bottom w:w="85" w:type="dxa"/>
-              <w:left w:w="95" w:type="dxa"/>
-              <w:right w:w="95" w:type="dxa"/>
+              <w:top w:w="50" w:type="dxa"/>
+              <w:bottom w:w="50" w:type="dxa"/>
+              <w:left w:w="75" w:type="dxa"/>
+              <w:right w:w="75" w:type="dxa"/>
             </w:tcMar>
           </w:tcPr>
           <w:p>
             <w:pPr>
-              <w:spacing w:before="0" w:after="90"/>
+              <w:spacing w:before="0" w:after="50"/>
               <w:pBdr>
-                <w:bottom w:val="single" w:sz="4" w:space="3" w:color="CBD5E1"/>
+                <w:bottom w:val="single" w:sz="4" w:space="2" w:color="CBD5E1"/>
               </w:pBdr>
             </w:pPr>
             <w:r>
               <w:rPr>
                 <w:b/>
                 <w:color w:val="0F172A"/>
-                <w:sz w:val="23"/>
+                <w:sz w:val="27"/>
               </w:rPr>
               <w:t>Core Engine &amp; Languages</w:t>
             </w:r>
           </w:p>
           <w:p>
             <w:pPr>
-              <w:spacing w:before="40" w:after="0" w:line="293" w:lineRule="auto"/>
+              <w:spacing w:before="20" w:after="0" w:line="254" w:lineRule="auto"/>
             </w:pPr>
             <w:r>
               <w:rPr>
                 <w:b/>
                 <w:color w:val="334155"/>
-                <w:sz w:val="21"/>
+                <w:sz w:val="25"/>
               </w:rPr>
-              <w:t>Unity 3D (2020–2023 LTS / Unity 6)  •  C# (.NET)  •  HLSL / ShaderLab  •  Python</w:t>
+              <w:t>Unity 3D (2020–2023 LTS / Unity 6)  •  C# (.NET)  •  HLSL / ShaderLab  •  Python</w:t>
             </w:r>
           </w:p>
         </w:tc>
         <w:tc>
           <w:tcPr>
-            <w:tcW w:w="3680" w:type="dxa"/>
+            <w:tcW w:w="3840" w:type="dxa"/>
             <w:shd w:fill="F8FAFC"/>
             <w:tcBorders>
               <w:top w:val="single" w:sz="16" w:space="0" w:color="059669"/>
@@ -1911,37 +1911,37 @@
               <w:right w:val="single" w:sz="6" w:space="0" w:color="34D399"/>
             </w:tcBorders>
             <w:tcMar>
-              <w:top w:w="85" w:type="dxa"/>
-              <w:bottom w:w="85" w:type="dxa"/>
-              <w:left w:w="95" w:type="dxa"/>
-              <w:right w:w="95" w:type="dxa"/>
+              <w:top w:w="50" w:type="dxa"/>
+              <w:bottom w:w="50" w:type="dxa"/>
+              <w:left w:w="75" w:type="dxa"/>
+              <w:right w:w="75" w:type="dxa"/>
             </w:tcMar>
           </w:tcPr>
           <w:p>
             <w:pPr>
-              <w:spacing w:before="0" w:after="90"/>
+              <w:spacing w:before="0" w:after="50"/>
               <w:pBdr>
-                <w:bottom w:val="single" w:sz="4" w:space="3" w:color="CBD5E1"/>
+                <w:bottom w:val="single" w:sz="4" w:space="2" w:color="CBD5E1"/>
               </w:pBdr>
             </w:pPr>
             <w:r>
               <w:rPr>
                 <w:b/>
                 <w:color w:val="0F172A"/>
-                <w:sz w:val="23"/>
+                <w:sz w:val="27"/>
               </w:rPr>
               <w:t>Rendering &amp; Optimization</w:t>
             </w:r>
           </w:p>
           <w:p>
             <w:pPr>
-              <w:spacing w:before="40" w:after="0" w:line="293" w:lineRule="auto"/>
+              <w:spacing w:before="20" w:after="0" w:line="254" w:lineRule="auto"/>
             </w:pPr>
             <w:r>
               <w:rPr>
                 <w:b/>
                 <w:color w:val="334155"/>
-                <w:sz w:val="21"/>
+                <w:sz w:val="25"/>
               </w:rPr>
               <w:t>URP  •  SRP Batcher  •  GPU Instancing  •  ASTC Compression  •  Custom UI Shaders</w:t>
             </w:r>
@@ -1949,7 +1949,7 @@
         </w:tc>
         <w:tc>
           <w:tcPr>
-            <w:tcW w:w="3680" w:type="dxa"/>
+            <w:tcW w:w="3840" w:type="dxa"/>
             <w:shd w:fill="F8FAFC"/>
             <w:tcBorders>
               <w:top w:val="single" w:sz="16" w:space="0" w:color="9333EA"/>
@@ -1958,37 +1958,37 @@
               <w:right w:val="single" w:sz="6" w:space="0" w:color="C084FC"/>
             </w:tcBorders>
             <w:tcMar>
-              <w:top w:w="85" w:type="dxa"/>
-              <w:bottom w:w="85" w:type="dxa"/>
-              <w:left w:w="95" w:type="dxa"/>
-              <w:right w:w="95" w:type="dxa"/>
+              <w:top w:w="50" w:type="dxa"/>
+              <w:bottom w:w="50" w:type="dxa"/>
+              <w:left w:w="75" w:type="dxa"/>
+              <w:right w:w="75" w:type="dxa"/>
             </w:tcMar>
           </w:tcPr>
           <w:p>
             <w:pPr>
-              <w:spacing w:before="0" w:after="90"/>
+              <w:spacing w:before="0" w:after="50"/>
               <w:pBdr>
-                <w:bottom w:val="single" w:sz="4" w:space="3" w:color="CBD5E1"/>
+                <w:bottom w:val="single" w:sz="4" w:space="2" w:color="CBD5E1"/>
               </w:pBdr>
             </w:pPr>
             <w:r>
               <w:rPr>
                 <w:b/>
                 <w:color w:val="0F172A"/>
-                <w:sz w:val="23"/>
+                <w:sz w:val="27"/>
               </w:rPr>
               <w:t>Profiling &amp; Debugging</w:t>
             </w:r>
           </w:p>
           <w:p>
             <w:pPr>
-              <w:spacing w:before="40" w:after="0" w:line="293" w:lineRule="auto"/>
+              <w:spacing w:before="20" w:after="0" w:line="254" w:lineRule="auto"/>
             </w:pPr>
             <w:r>
               <w:rPr>
                 <w:b/>
                 <w:color w:val="334155"/>
-                <w:sz w:val="21"/>
+                <w:sz w:val="25"/>
               </w:rPr>
               <w:t>Unity Profiler  •  Memory Profiler  •  Frame Debugger  •  RenderDoc  •  Android Logcat / ADB</w:t>
             </w:r>
@@ -2001,7 +2001,7 @@
         </w:trPr>
         <w:tc>
           <w:tcPr>
-            <w:tcW w:w="3680" w:type="dxa"/>
+            <w:tcW w:w="3840" w:type="dxa"/>
             <w:shd w:fill="F8FAFC"/>
             <w:tcBorders>
               <w:top w:val="single" w:sz="16" w:space="0" w:color="4F46E5"/>
@@ -2010,45 +2010,45 @@
               <w:right w:val="single" w:sz="6" w:space="0" w:color="818CF8"/>
             </w:tcBorders>
             <w:tcMar>
-              <w:top w:w="85" w:type="dxa"/>
-              <w:bottom w:w="85" w:type="dxa"/>
-              <w:left w:w="95" w:type="dxa"/>
-              <w:right w:w="95" w:type="dxa"/>
+              <w:top w:w="50" w:type="dxa"/>
+              <w:bottom w:w="50" w:type="dxa"/>
+              <w:left w:w="75" w:type="dxa"/>
+              <w:right w:w="75" w:type="dxa"/>
             </w:tcMar>
           </w:tcPr>
           <w:p>
             <w:pPr>
-              <w:spacing w:before="0" w:after="90"/>
+              <w:spacing w:before="0" w:after="50"/>
               <w:pBdr>
-                <w:bottom w:val="single" w:sz="4" w:space="3" w:color="CBD5E1"/>
+                <w:bottom w:val="single" w:sz="4" w:space="2" w:color="CBD5E1"/>
               </w:pBdr>
             </w:pPr>
             <w:r>
               <w:rPr>
                 <w:b/>
                 <w:color w:val="0F172A"/>
-                <w:sz w:val="23"/>
+                <w:sz w:val="27"/>
               </w:rPr>
               <w:t>Platform &amp; Native Bridges</w:t>
             </w:r>
           </w:p>
           <w:p>
             <w:pPr>
-              <w:spacing w:before="40" w:after="0" w:line="293" w:lineRule="auto"/>
+              <w:spacing w:before="20" w:after="0" w:line="254" w:lineRule="auto"/>
             </w:pPr>
             <w:r>
               <w:rPr>
                 <w:b/>
                 <w:color w:val="334155"/>
-                <w:sz w:val="21"/>
+                <w:sz w:val="25"/>
               </w:rPr>
-              <w:t>Android (JNI / Java)  •  iOS (Obj-C Bridge)  •  WebGL (WASM)  •  OTA Manifest Sync</w:t>
+              <w:t>Android (JNI / Java)  •  iOS (Obj-C Bridge)  •  WebGL (WASM)  •  OTA Manifest Sync</w:t>
             </w:r>
           </w:p>
         </w:tc>
         <w:tc>
           <w:tcPr>
-            <w:tcW w:w="3680" w:type="dxa"/>
+            <w:tcW w:w="3840" w:type="dxa"/>
             <w:shd w:fill="F8FAFC"/>
             <w:tcBorders>
               <w:top w:val="single" w:sz="16" w:space="0" w:color="D97706"/>
@@ -2057,37 +2057,37 @@
               <w:right w:val="single" w:sz="6" w:space="0" w:color="FBBF24"/>
             </w:tcBorders>
             <w:tcMar>
-              <w:top w:w="85" w:type="dxa"/>
-              <w:bottom w:w="85" w:type="dxa"/>
-              <w:left w:w="95" w:type="dxa"/>
-              <w:right w:w="95" w:type="dxa"/>
+              <w:top w:w="50" w:type="dxa"/>
+              <w:bottom w:w="50" w:type="dxa"/>
+              <w:left w:w="75" w:type="dxa"/>
+              <w:right w:w="75" w:type="dxa"/>
             </w:tcMar>
           </w:tcPr>
           <w:p>
             <w:pPr>
-              <w:spacing w:before="0" w:after="90"/>
+              <w:spacing w:before="0" w:after="50"/>
               <w:pBdr>
-                <w:bottom w:val="single" w:sz="4" w:space="3" w:color="CBD5E1"/>
+                <w:bottom w:val="single" w:sz="4" w:space="2" w:color="CBD5E1"/>
               </w:pBdr>
             </w:pPr>
             <w:r>
               <w:rPr>
                 <w:b/>
                 <w:color w:val="0F172A"/>
-                <w:sz w:val="23"/>
+                <w:sz w:val="27"/>
               </w:rPr>
               <w:t>Architecture &amp; AI Systems</w:t>
             </w:r>
           </w:p>
           <w:p>
             <w:pPr>
-              <w:spacing w:before="40" w:after="0" w:line="293" w:lineRule="auto"/>
+              <w:spacing w:before="20" w:after="0" w:line="254" w:lineRule="auto"/>
             </w:pPr>
             <w:r>
               <w:rPr>
                 <w:b/>
                 <w:color w:val="334155"/>
-                <w:sz w:val="21"/>
+                <w:sz w:val="25"/>
               </w:rPr>
               <w:t>Deterministic FSMs  •  MVP / ScriptableObjects  •  Zero-GC Object Pooling  •  Stockfish / A* / Backtracking</w:t>
             </w:r>
@@ -2095,7 +2095,7 @@
         </w:tc>
         <w:tc>
           <w:tcPr>
-            <w:tcW w:w="3680" w:type="dxa"/>
+            <w:tcW w:w="3840" w:type="dxa"/>
             <w:shd w:fill="F8FAFC"/>
             <w:tcBorders>
               <w:top w:val="single" w:sz="16" w:space="0" w:color="475569"/>
@@ -2104,37 +2104,37 @@
               <w:right w:val="single" w:sz="6" w:space="0" w:color="94A3B8"/>
             </w:tcBorders>
             <w:tcMar>
-              <w:top w:w="85" w:type="dxa"/>
-              <w:bottom w:w="85" w:type="dxa"/>
-              <w:left w:w="95" w:type="dxa"/>
-              <w:right w:w="95" w:type="dxa"/>
+              <w:top w:w="50" w:type="dxa"/>
+              <w:bottom w:w="50" w:type="dxa"/>
+              <w:left w:w="75" w:type="dxa"/>
+              <w:right w:w="75" w:type="dxa"/>
             </w:tcMar>
           </w:tcPr>
           <w:p>
             <w:pPr>
-              <w:spacing w:before="0" w:after="90"/>
+              <w:spacing w:before="0" w:after="50"/>
               <w:pBdr>
-                <w:bottom w:val="single" w:sz="4" w:space="3" w:color="CBD5E1"/>
+                <w:bottom w:val="single" w:sz="4" w:space="2" w:color="CBD5E1"/>
               </w:pBdr>
             </w:pPr>
             <w:r>
               <w:rPr>
                 <w:b/>
                 <w:color w:val="0F172A"/>
-                <w:sz w:val="23"/>
+                <w:sz w:val="27"/>
               </w:rPr>
               <w:t>LiveOps, SDKs &amp; Tooling</w:t>
             </w:r>
           </w:p>
           <w:p>
             <w:pPr>
-              <w:spacing w:before="40" w:after="0" w:line="293" w:lineRule="auto"/>
+              <w:spacing w:before="20" w:after="0" w:line="254" w:lineRule="auto"/>
             </w:pPr>
             <w:r>
               <w:rPr>
                 <w:b/>
                 <w:color w:val="334155"/>
-                <w:sz w:val="21"/>
+                <w:sz w:val="25"/>
               </w:rPr>
               <w:t>Google / Apple IAP  •  Ads Mediation  •  Firebase  •  Custom EditorWindows  •  Git / GitLab</w:t>
             </w:r>
@@ -2146,12 +2146,12 @@
       <w:pPr>
         <w:keepNext/>
         <w:tabs>
-          <w:tab w:pos="11318" w:val="right"/>
+          <w:tab w:pos="11722" w:val="right"/>
         </w:tabs>
-        <w:spacing w:before="210" w:after="110"/>
+        <w:spacing w:before="100" w:after="70"/>
         <w:pBdr>
           <w:left w:val="single" w:sz="24" w:space="6" w:color="D97706"/>
-          <w:bottom w:val="single" w:sz="6" w:space="2" w:color="CBD5E1"/>
+          <w:bottom w:val="single" w:sz="6" w:space="1" w:color="CBD5E1"/>
         </w:pBdr>
       </w:pPr>
       <w:r>
@@ -2159,7 +2159,7 @@
           <w:rFonts w:ascii="Calibri" w:hAnsi="Calibri"/>
           <w:b/>
           <w:color w:val="0F172A"/>
-          <w:sz w:val="24"/>
+          <w:sz w:val="28"/>
         </w:rPr>
         <w:t>EDUCATION</w:t>
       </w:r>
@@ -2168,7 +2168,7 @@
           <w:rFonts w:ascii="Calibri" w:hAnsi="Calibri"/>
           <w:b w:val="0"/>
           <w:color w:val="64748B"/>
-          <w:sz w:val="21"/>
+          <w:sz w:val="25"/>
         </w:rPr>
         <w:tab/>
         <w:t>Academic Qualifications &amp; Computer Science Foundation</w:t>
@@ -2180,11 +2180,11 @@
         <w:jc w:val="center"/>
         <w:tblLayout w:type="fixed"/>
         <w:tblLook w:firstColumn="1" w:firstRow="1" w:lastColumn="0" w:lastRow="0" w:noHBand="0" w:noVBand="1" w:val="04A0"/>
-        <w:tblCellSpacing w:w="75" w:type="dxa"/>
+        <w:tblCellSpacing w:w="55" w:type="dxa"/>
       </w:tblPr>
       <w:tblGrid>
-        <w:gridCol w:w="5580"/>
-        <w:gridCol w:w="5580"/>
+        <w:gridCol w:w="5790"/>
+        <w:gridCol w:w="5790"/>
       </w:tblGrid>
       <w:tr>
         <w:trPr>
@@ -2192,7 +2192,7 @@
         </w:trPr>
         <w:tc>
           <w:tcPr>
-            <w:tcW w:w="5580" w:type="dxa"/>
+            <w:tcW w:w="5790" w:type="dxa"/>
             <w:shd w:fill="F8FAFC"/>
             <w:tcBorders>
               <w:top w:val="single" w:sz="16" w:space="0" w:color="2563EB"/>
@@ -2201,24 +2201,24 @@
               <w:right w:val="single" w:sz="6" w:space="0" w:color="60A5FA"/>
             </w:tcBorders>
             <w:tcMar>
-              <w:top w:w="85" w:type="dxa"/>
-              <w:bottom w:w="85" w:type="dxa"/>
-              <w:left w:w="100" w:type="dxa"/>
-              <w:right w:w="100" w:type="dxa"/>
+              <w:top w:w="50" w:type="dxa"/>
+              <w:bottom w:w="50" w:type="dxa"/>
+              <w:left w:w="65" w:type="dxa"/>
+              <w:right w:w="65" w:type="dxa"/>
             </w:tcMar>
           </w:tcPr>
           <w:p>
             <w:pPr>
               <w:tabs>
-                <w:tab w:pos="5256" w:val="right"/>
+                <w:tab w:pos="5616" w:val="right"/>
               </w:tabs>
-              <w:spacing w:before="0" w:after="40"/>
+              <w:spacing w:before="0" w:after="30"/>
             </w:pPr>
             <w:r>
               <w:rPr>
                 <w:b/>
                 <w:color w:val="0F172A"/>
-                <w:sz w:val="22"/>
+                <w:sz w:val="25"/>
               </w:rPr>
               <w:t>Master of Computer Application (MCA)</w:t>
             </w:r>
@@ -2226,24 +2226,24 @@
               <w:rPr>
                 <w:b/>
                 <w:color w:val="0F172A"/>
-                <w:sz w:val="21"/>
+                <w:sz w:val="24"/>
               </w:rPr>
               <w:tab/>
-              <w:t>[ CGPA: 7.52 ]</w:t>
+              <w:t>[ CGPA: 7.52 ]</w:t>
             </w:r>
           </w:p>
           <w:p>
             <w:pPr>
-              <w:spacing w:before="0" w:after="90"/>
+              <w:spacing w:before="0" w:after="50"/>
               <w:pBdr>
-                <w:bottom w:val="single" w:sz="4" w:space="3" w:color="CBD5E1"/>
+                <w:bottom w:val="single" w:sz="4" w:space="2" w:color="CBD5E1"/>
               </w:pBdr>
             </w:pPr>
             <w:r>
               <w:rPr>
                 <w:b/>
                 <w:color w:val="334155"/>
-                <w:sz w:val="21"/>
+                <w:sz w:val="25"/>
               </w:rPr>
               <w:t>Government Autonomous Engineering College</w:t>
             </w:r>
@@ -2251,14 +2251,14 @@
           <w:p>
             <w:pPr>
               <w:tabs>
-                <w:tab w:pos="5256" w:val="right"/>
+                <w:tab w:pos="5616" w:val="right"/>
               </w:tabs>
-              <w:spacing w:before="40" w:after="0"/>
+              <w:spacing w:before="30" w:after="0"/>
             </w:pPr>
             <w:r>
               <w:rPr>
                 <w:color w:val="64748B"/>
-                <w:sz w:val="21"/>
+                <w:sz w:val="25"/>
               </w:rPr>
               <w:t>Aurangabad, Maharashtra</w:t>
             </w:r>
@@ -2266,7 +2266,7 @@
               <w:rPr>
                 <w:b/>
                 <w:color w:val="0F172A"/>
-                <w:sz w:val="21"/>
+                <w:sz w:val="25"/>
               </w:rPr>
               <w:tab/>
               <w:t>Dec 2021 – Jan 2023</w:t>
@@ -2275,7 +2275,7 @@
         </w:tc>
         <w:tc>
           <w:tcPr>
-            <w:tcW w:w="5580" w:type="dxa"/>
+            <w:tcW w:w="5790" w:type="dxa"/>
             <w:shd w:fill="F8FAFC"/>
             <w:tcBorders>
               <w:top w:val="single" w:sz="16" w:space="0" w:color="059669"/>
@@ -2284,24 +2284,24 @@
               <w:right w:val="single" w:sz="6" w:space="0" w:color="34D399"/>
             </w:tcBorders>
             <w:tcMar>
-              <w:top w:w="85" w:type="dxa"/>
-              <w:bottom w:w="85" w:type="dxa"/>
-              <w:left w:w="100" w:type="dxa"/>
-              <w:right w:w="100" w:type="dxa"/>
+              <w:top w:w="50" w:type="dxa"/>
+              <w:bottom w:w="50" w:type="dxa"/>
+              <w:left w:w="65" w:type="dxa"/>
+              <w:right w:w="65" w:type="dxa"/>
             </w:tcMar>
           </w:tcPr>
           <w:p>
             <w:pPr>
               <w:tabs>
-                <w:tab w:pos="5256" w:val="right"/>
+                <w:tab w:pos="5616" w:val="right"/>
               </w:tabs>
-              <w:spacing w:before="0" w:after="40"/>
+              <w:spacing w:before="0" w:after="30"/>
             </w:pPr>
             <w:r>
               <w:rPr>
                 <w:b/>
                 <w:color w:val="0F172A"/>
-                <w:sz w:val="22"/>
+                <w:sz w:val="25"/>
               </w:rPr>
               <w:t>Bachelor of Computer Science (B.Sc. CS)</w:t>
             </w:r>
@@ -2309,24 +2309,24 @@
               <w:rPr>
                 <w:b/>
                 <w:color w:val="0F172A"/>
-                <w:sz w:val="21"/>
+                <w:sz w:val="24"/>
               </w:rPr>
               <w:tab/>
-              <w:t>[ CGPA: 7.50 ]</w:t>
+              <w:t>[ CGPA: 7.50 ]</w:t>
             </w:r>
           </w:p>
           <w:p>
             <w:pPr>
-              <w:spacing w:before="0" w:after="90"/>
+              <w:spacing w:before="0" w:after="50"/>
               <w:pBdr>
-                <w:bottom w:val="single" w:sz="4" w:space="3" w:color="CBD5E1"/>
+                <w:bottom w:val="single" w:sz="4" w:space="2" w:color="CBD5E1"/>
               </w:pBdr>
             </w:pPr>
             <w:r>
               <w:rPr>
                 <w:b/>
                 <w:color w:val="334155"/>
-                <w:sz w:val="21"/>
+                <w:sz w:val="25"/>
               </w:rPr>
               <w:t>Vivekanand Arts and Science College</w:t>
             </w:r>
@@ -2334,14 +2334,14 @@
           <w:p>
             <w:pPr>
               <w:tabs>
-                <w:tab w:pos="5256" w:val="right"/>
+                <w:tab w:pos="5616" w:val="right"/>
               </w:tabs>
-              <w:spacing w:before="40" w:after="0"/>
+              <w:spacing w:before="30" w:after="0"/>
             </w:pPr>
             <w:r>
               <w:rPr>
                 <w:color w:val="64748B"/>
-                <w:sz w:val="21"/>
+                <w:sz w:val="25"/>
               </w:rPr>
               <w:t>Aurangabad, Maharashtra</w:t>
             </w:r>
@@ -2349,7 +2349,7 @@
               <w:rPr>
                 <w:b/>
                 <w:color w:val="0F172A"/>
-                <w:sz w:val="21"/>
+                <w:sz w:val="25"/>
               </w:rPr>
               <w:tab/>
               <w:t>Apr 2018 – Oct 2021</w:t>
@@ -2360,7 +2360,7 @@
     </w:tbl>
     <w:sectPr>
       <w:pgSz w:w="12240" w:h="15840"/>
-      <w:pgMar w:top="403" w:right="461" w:bottom="403" w:left="461" w:header="720" w:footer="720" w:gutter="0"/>
+      <w:pgMar w:top="230" w:right="259" w:bottom="230" w:left="259" w:header="720" w:footer="720" w:gutter="0"/>
       <w:cols w:space="720"/>
       <w:docGrid w:linePitch="360"/>
     </w:sectPr>
@@ -2734,7 +2734,7 @@
     <w:rPr>
       <w:rFonts w:ascii="Calibri" w:hAnsi="Calibri"/>
       <w:color w:val="0F172A"/>
-      <w:sz w:val="22"/>
+      <w:sz w:val="26"/>
     </w:rPr>
   </w:style>
   <w:style w:type="paragraph" w:styleId="Header">

</xml_diff>

<commit_message>
Update Tech Skills: Add Revenue Systems & Product Growth and reorganize Core Engine & Developer Tooling
</commit_message>
<xml_diff>
--- a/assets/resume/Arpit_Jaiswal_Game_Dev_Resume.docx
+++ b/assets/resume/Arpit_Jaiswal_Game_Dev_Resume.docx
@@ -1810,7 +1810,7 @@
         <w:tabs>
           <w:tab w:pos="11722" w:val="right"/>
         </w:tabs>
-        <w:spacing w:before="100" w:after="70"/>
+        <w:spacing w:before="60" w:after="40"/>
         <w:pBdr>
           <w:left w:val="single" w:sz="24" w:space="6" w:color="9333EA"/>
           <w:bottom w:val="single" w:sz="6" w:space="1" w:color="CBD5E1"/>
@@ -1842,7 +1842,7 @@
         <w:jc w:val="center"/>
         <w:tblLayout w:type="fixed"/>
         <w:tblLook w:firstColumn="1" w:firstRow="1" w:lastColumn="0" w:lastRow="0" w:noHBand="0" w:noVBand="1" w:val="04A0"/>
-        <w:tblCellSpacing w:w="50" w:type="dxa"/>
+        <w:tblCellSpacing w:w="35" w:type="dxa"/>
       </w:tblPr>
       <w:tblGrid>
         <w:gridCol w:w="3840"/>
@@ -1864,15 +1864,15 @@
               <w:right w:val="single" w:sz="6" w:space="0" w:color="60A5FA"/>
             </w:tcBorders>
             <w:tcMar>
-              <w:top w:w="50" w:type="dxa"/>
-              <w:bottom w:w="50" w:type="dxa"/>
-              <w:left w:w="75" w:type="dxa"/>
-              <w:right w:w="75" w:type="dxa"/>
+              <w:top w:w="35" w:type="dxa"/>
+              <w:bottom w:w="35" w:type="dxa"/>
+              <w:left w:w="65" w:type="dxa"/>
+              <w:right w:w="65" w:type="dxa"/>
             </w:tcMar>
           </w:tcPr>
           <w:p>
             <w:pPr>
-              <w:spacing w:before="0" w:after="50"/>
+              <w:spacing w:before="0" w:after="30"/>
               <w:pBdr>
                 <w:bottom w:val="single" w:sz="4" w:space="2" w:color="CBD5E1"/>
               </w:pBdr>
@@ -1881,14 +1881,14 @@
               <w:rPr>
                 <w:b/>
                 <w:color w:val="0F172A"/>
-                <w:sz w:val="27"/>
+                <w:sz w:val="26"/>
               </w:rPr>
-              <w:t>Core Engine &amp; Languages</w:t>
+              <w:t>Revenue Systems &amp; Product Growth</w:t>
             </w:r>
           </w:p>
           <w:p>
             <w:pPr>
-              <w:spacing w:before="20" w:after="0" w:line="254" w:lineRule="auto"/>
+              <w:spacing w:before="10" w:after="0" w:line="235" w:lineRule="auto"/>
             </w:pPr>
             <w:r>
               <w:rPr>
@@ -1896,7 +1896,7 @@
                 <w:color w:val="334155"/>
                 <w:sz w:val="25"/>
               </w:rPr>
-              <w:t>Unity 3D (2020–2023 LTS / Unity 6)  •  C# (.NET)  •  HLSL / ShaderLab  •  Python</w:t>
+              <w:t>Google / Apple IAP  •  Ads Mediation  •  Event Funnels &amp; Attribution  •  User Engagement &amp; Session Loops  •  Revenue Tracking &amp; Cohort Analytics</w:t>
             </w:r>
           </w:p>
         </w:tc>
@@ -1911,15 +1911,15 @@
               <w:right w:val="single" w:sz="6" w:space="0" w:color="34D399"/>
             </w:tcBorders>
             <w:tcMar>
-              <w:top w:w="50" w:type="dxa"/>
-              <w:bottom w:w="50" w:type="dxa"/>
-              <w:left w:w="75" w:type="dxa"/>
-              <w:right w:w="75" w:type="dxa"/>
+              <w:top w:w="35" w:type="dxa"/>
+              <w:bottom w:w="35" w:type="dxa"/>
+              <w:left w:w="65" w:type="dxa"/>
+              <w:right w:w="65" w:type="dxa"/>
             </w:tcMar>
           </w:tcPr>
           <w:p>
             <w:pPr>
-              <w:spacing w:before="0" w:after="50"/>
+              <w:spacing w:before="0" w:after="30"/>
               <w:pBdr>
                 <w:bottom w:val="single" w:sz="4" w:space="2" w:color="CBD5E1"/>
               </w:pBdr>
@@ -1928,14 +1928,14 @@
               <w:rPr>
                 <w:b/>
                 <w:color w:val="0F172A"/>
-                <w:sz w:val="27"/>
+                <w:sz w:val="26"/>
               </w:rPr>
               <w:t>Rendering &amp; Optimization</w:t>
             </w:r>
           </w:p>
           <w:p>
             <w:pPr>
-              <w:spacing w:before="20" w:after="0" w:line="254" w:lineRule="auto"/>
+              <w:spacing w:before="10" w:after="0" w:line="235" w:lineRule="auto"/>
             </w:pPr>
             <w:r>
               <w:rPr>
@@ -1958,15 +1958,15 @@
               <w:right w:val="single" w:sz="6" w:space="0" w:color="C084FC"/>
             </w:tcBorders>
             <w:tcMar>
-              <w:top w:w="50" w:type="dxa"/>
-              <w:bottom w:w="50" w:type="dxa"/>
-              <w:left w:w="75" w:type="dxa"/>
-              <w:right w:w="75" w:type="dxa"/>
+              <w:top w:w="35" w:type="dxa"/>
+              <w:bottom w:w="35" w:type="dxa"/>
+              <w:left w:w="65" w:type="dxa"/>
+              <w:right w:w="65" w:type="dxa"/>
             </w:tcMar>
           </w:tcPr>
           <w:p>
             <w:pPr>
-              <w:spacing w:before="0" w:after="50"/>
+              <w:spacing w:before="0" w:after="30"/>
               <w:pBdr>
                 <w:bottom w:val="single" w:sz="4" w:space="2" w:color="CBD5E1"/>
               </w:pBdr>
@@ -1975,14 +1975,14 @@
               <w:rPr>
                 <w:b/>
                 <w:color w:val="0F172A"/>
-                <w:sz w:val="27"/>
+                <w:sz w:val="26"/>
               </w:rPr>
               <w:t>Profiling &amp; Debugging</w:t>
             </w:r>
           </w:p>
           <w:p>
             <w:pPr>
-              <w:spacing w:before="20" w:after="0" w:line="254" w:lineRule="auto"/>
+              <w:spacing w:before="10" w:after="0" w:line="235" w:lineRule="auto"/>
             </w:pPr>
             <w:r>
               <w:rPr>
@@ -2010,15 +2010,15 @@
               <w:right w:val="single" w:sz="6" w:space="0" w:color="818CF8"/>
             </w:tcBorders>
             <w:tcMar>
-              <w:top w:w="50" w:type="dxa"/>
-              <w:bottom w:w="50" w:type="dxa"/>
-              <w:left w:w="75" w:type="dxa"/>
-              <w:right w:w="75" w:type="dxa"/>
+              <w:top w:w="35" w:type="dxa"/>
+              <w:bottom w:w="35" w:type="dxa"/>
+              <w:left w:w="65" w:type="dxa"/>
+              <w:right w:w="65" w:type="dxa"/>
             </w:tcMar>
           </w:tcPr>
           <w:p>
             <w:pPr>
-              <w:spacing w:before="0" w:after="50"/>
+              <w:spacing w:before="0" w:after="30"/>
               <w:pBdr>
                 <w:bottom w:val="single" w:sz="4" w:space="2" w:color="CBD5E1"/>
               </w:pBdr>
@@ -2027,14 +2027,14 @@
               <w:rPr>
                 <w:b/>
                 <w:color w:val="0F172A"/>
-                <w:sz w:val="27"/>
+                <w:sz w:val="26"/>
               </w:rPr>
               <w:t>Platform &amp; Native Bridges</w:t>
             </w:r>
           </w:p>
           <w:p>
             <w:pPr>
-              <w:spacing w:before="20" w:after="0" w:line="254" w:lineRule="auto"/>
+              <w:spacing w:before="10" w:after="0" w:line="235" w:lineRule="auto"/>
             </w:pPr>
             <w:r>
               <w:rPr>
@@ -2057,15 +2057,15 @@
               <w:right w:val="single" w:sz="6" w:space="0" w:color="FBBF24"/>
             </w:tcBorders>
             <w:tcMar>
-              <w:top w:w="50" w:type="dxa"/>
-              <w:bottom w:w="50" w:type="dxa"/>
-              <w:left w:w="75" w:type="dxa"/>
-              <w:right w:w="75" w:type="dxa"/>
+              <w:top w:w="35" w:type="dxa"/>
+              <w:bottom w:w="35" w:type="dxa"/>
+              <w:left w:w="65" w:type="dxa"/>
+              <w:right w:w="65" w:type="dxa"/>
             </w:tcMar>
           </w:tcPr>
           <w:p>
             <w:pPr>
-              <w:spacing w:before="0" w:after="50"/>
+              <w:spacing w:before="0" w:after="30"/>
               <w:pBdr>
                 <w:bottom w:val="single" w:sz="4" w:space="2" w:color="CBD5E1"/>
               </w:pBdr>
@@ -2074,14 +2074,14 @@
               <w:rPr>
                 <w:b/>
                 <w:color w:val="0F172A"/>
-                <w:sz w:val="27"/>
+                <w:sz w:val="26"/>
               </w:rPr>
               <w:t>Architecture &amp; AI Systems</w:t>
             </w:r>
           </w:p>
           <w:p>
             <w:pPr>
-              <w:spacing w:before="20" w:after="0" w:line="254" w:lineRule="auto"/>
+              <w:spacing w:before="10" w:after="0" w:line="235" w:lineRule="auto"/>
             </w:pPr>
             <w:r>
               <w:rPr>
@@ -2104,15 +2104,15 @@
               <w:right w:val="single" w:sz="6" w:space="0" w:color="94A3B8"/>
             </w:tcBorders>
             <w:tcMar>
-              <w:top w:w="50" w:type="dxa"/>
-              <w:bottom w:w="50" w:type="dxa"/>
-              <w:left w:w="75" w:type="dxa"/>
-              <w:right w:w="75" w:type="dxa"/>
+              <w:top w:w="35" w:type="dxa"/>
+              <w:bottom w:w="35" w:type="dxa"/>
+              <w:left w:w="65" w:type="dxa"/>
+              <w:right w:w="65" w:type="dxa"/>
             </w:tcMar>
           </w:tcPr>
           <w:p>
             <w:pPr>
-              <w:spacing w:before="0" w:after="50"/>
+              <w:spacing w:before="0" w:after="30"/>
               <w:pBdr>
                 <w:bottom w:val="single" w:sz="4" w:space="2" w:color="CBD5E1"/>
               </w:pBdr>
@@ -2121,14 +2121,14 @@
               <w:rPr>
                 <w:b/>
                 <w:color w:val="0F172A"/>
-                <w:sz w:val="27"/>
+                <w:sz w:val="26"/>
               </w:rPr>
-              <w:t>LiveOps, SDKs &amp; Tooling</w:t>
+              <w:t>Core Engine &amp; Developer Tooling</w:t>
             </w:r>
           </w:p>
           <w:p>
             <w:pPr>
-              <w:spacing w:before="20" w:after="0" w:line="254" w:lineRule="auto"/>
+              <w:spacing w:before="10" w:after="0" w:line="235" w:lineRule="auto"/>
             </w:pPr>
             <w:r>
               <w:rPr>
@@ -2136,7 +2136,7 @@
                 <w:color w:val="334155"/>
                 <w:sz w:val="25"/>
               </w:rPr>
-              <w:t>Google / Apple IAP  •  Ads Mediation  •  Firebase  •  Custom EditorWindows  •  Git / GitLab</w:t>
+              <w:t>Unity 3D (2020–2023 LTS / Unity 6)  •  C# (.NET)  •  HLSL / ShaderLab  •  Custom EditorWindows  •  Git / GitLab</w:t>
             </w:r>
           </w:p>
         </w:tc>
@@ -2148,7 +2148,7 @@
         <w:tabs>
           <w:tab w:pos="11722" w:val="right"/>
         </w:tabs>
-        <w:spacing w:before="100" w:after="70"/>
+        <w:spacing w:before="60" w:after="40"/>
         <w:pBdr>
           <w:left w:val="single" w:sz="24" w:space="6" w:color="D97706"/>
           <w:bottom w:val="single" w:sz="6" w:space="1" w:color="CBD5E1"/>
@@ -2180,7 +2180,7 @@
         <w:jc w:val="center"/>
         <w:tblLayout w:type="fixed"/>
         <w:tblLook w:firstColumn="1" w:firstRow="1" w:lastColumn="0" w:lastRow="0" w:noHBand="0" w:noVBand="1" w:val="04A0"/>
-        <w:tblCellSpacing w:w="55" w:type="dxa"/>
+        <w:tblCellSpacing w:w="40" w:type="dxa"/>
       </w:tblPr>
       <w:tblGrid>
         <w:gridCol w:w="5790"/>
@@ -2201,8 +2201,8 @@
               <w:right w:val="single" w:sz="6" w:space="0" w:color="60A5FA"/>
             </w:tcBorders>
             <w:tcMar>
-              <w:top w:w="50" w:type="dxa"/>
-              <w:bottom w:w="50" w:type="dxa"/>
+              <w:top w:w="35" w:type="dxa"/>
+              <w:bottom w:w="35" w:type="dxa"/>
               <w:left w:w="65" w:type="dxa"/>
               <w:right w:w="65" w:type="dxa"/>
             </w:tcMar>
@@ -2212,7 +2212,7 @@
               <w:tabs>
                 <w:tab w:pos="5616" w:val="right"/>
               </w:tabs>
-              <w:spacing w:before="0" w:after="30"/>
+              <w:spacing w:before="0" w:after="24"/>
             </w:pPr>
             <w:r>
               <w:rPr>
@@ -2234,7 +2234,7 @@
           </w:p>
           <w:p>
             <w:pPr>
-              <w:spacing w:before="0" w:after="50"/>
+              <w:spacing w:before="0" w:after="30"/>
               <w:pBdr>
                 <w:bottom w:val="single" w:sz="4" w:space="2" w:color="CBD5E1"/>
               </w:pBdr>
@@ -2253,7 +2253,7 @@
               <w:tabs>
                 <w:tab w:pos="5616" w:val="right"/>
               </w:tabs>
-              <w:spacing w:before="30" w:after="0"/>
+              <w:spacing w:before="20" w:after="0"/>
             </w:pPr>
             <w:r>
               <w:rPr>
@@ -2284,8 +2284,8 @@
               <w:right w:val="single" w:sz="6" w:space="0" w:color="34D399"/>
             </w:tcBorders>
             <w:tcMar>
-              <w:top w:w="50" w:type="dxa"/>
-              <w:bottom w:w="50" w:type="dxa"/>
+              <w:top w:w="35" w:type="dxa"/>
+              <w:bottom w:w="35" w:type="dxa"/>
               <w:left w:w="65" w:type="dxa"/>
               <w:right w:w="65" w:type="dxa"/>
             </w:tcMar>
@@ -2295,7 +2295,7 @@
               <w:tabs>
                 <w:tab w:pos="5616" w:val="right"/>
               </w:tabs>
-              <w:spacing w:before="0" w:after="30"/>
+              <w:spacing w:before="0" w:after="24"/>
             </w:pPr>
             <w:r>
               <w:rPr>
@@ -2317,7 +2317,7 @@
           </w:p>
           <w:p>
             <w:pPr>
-              <w:spacing w:before="0" w:after="50"/>
+              <w:spacing w:before="0" w:after="30"/>
               <w:pBdr>
                 <w:bottom w:val="single" w:sz="4" w:space="2" w:color="CBD5E1"/>
               </w:pBdr>
@@ -2336,7 +2336,7 @@
               <w:tabs>
                 <w:tab w:pos="5616" w:val="right"/>
               </w:tabs>
-              <w:spacing w:before="30" w:after="0"/>
+              <w:spacing w:before="20" w:after="0"/>
             </w:pPr>
             <w:r>
               <w:rPr>

</xml_diff>

<commit_message>
Remove Early-Career Prototypes section and 4th bullet point from Vasundhara Game Studio
</commit_message>
<xml_diff>
--- a/assets/resume/Arpit_Jaiswal_Game_Dev_Resume.docx
+++ b/assets/resume/Arpit_Jaiswal_Game_Dev_Resume.docx
@@ -649,8 +649,8 @@
             <w:gridSpan w:val="2"/>
             <w:tcW w:w="11630" w:type="dxa"/>
             <w:tcMar>
-              <w:top w:w="24" w:type="dxa"/>
-              <w:bottom w:w="24" w:type="dxa"/>
+              <w:top w:w="28" w:type="dxa"/>
+              <w:bottom w:w="28" w:type="dxa"/>
               <w:left w:w="65" w:type="dxa"/>
               <w:right w:w="65" w:type="dxa"/>
             </w:tcMar>
@@ -664,7 +664,7 @@
           </w:tcPr>
           <w:p>
             <w:pPr>
-              <w:spacing w:before="0" w:after="16"/>
+              <w:spacing w:before="0" w:after="24"/>
             </w:pPr>
             <w:r>
               <w:rPr>
@@ -696,7 +696,7 @@
                 <w:tab w:pos="7142" w:val="left"/>
                 <w:tab w:pos="9389" w:val="left"/>
               </w:tabs>
-              <w:spacing w:before="0" w:after="10" w:line="230" w:lineRule="auto"/>
+              <w:spacing w:before="0" w:after="20" w:line="240" w:lineRule="auto"/>
             </w:pPr>
             <w:r>
               <w:rPr>
@@ -723,7 +723,7 @@
                 <w:tab w:pos="7142" w:val="left"/>
                 <w:tab w:pos="9389" w:val="left"/>
               </w:tabs>
-              <w:spacing w:before="0" w:after="0" w:line="230" w:lineRule="auto"/>
+              <w:spacing w:before="0" w:after="0" w:line="240" w:lineRule="auto"/>
             </w:pPr>
             <w:r>
               <w:rPr>
@@ -744,439 +744,6 @@
           </w:p>
         </w:tc>
       </w:tr>
-      <w:tr>
-        <w:trPr>
-          <w:cantSplit/>
-        </w:trPr>
-        <w:tc>
-          <w:tcPr>
-            <w:gridSpan w:val="2"/>
-            <w:tcW w:w="11630" w:type="dxa"/>
-            <w:tcMar>
-              <w:top w:w="24" w:type="dxa"/>
-              <w:bottom w:w="24" w:type="dxa"/>
-              <w:left w:w="65" w:type="dxa"/>
-              <w:right w:w="65" w:type="dxa"/>
-            </w:tcMar>
-            <w:shd w:fill="F8FAFC"/>
-            <w:tcBorders>
-              <w:top w:val="single" w:sz="16" w:space="0" w:color="9333EA"/>
-              <w:left w:val="single" w:sz="6" w:space="0" w:color="C084FC"/>
-              <w:bottom w:val="single" w:sz="6" w:space="0" w:color="C084FC"/>
-              <w:right w:val="single" w:sz="6" w:space="0" w:color="C084FC"/>
-            </w:tcBorders>
-          </w:tcPr>
-          <w:p>
-            <w:pPr>
-              <w:spacing w:before="0" w:after="16"/>
-            </w:pPr>
-            <w:r>
-              <w:rPr>
-                <w:b/>
-                <w:color w:val="0F172A"/>
-                <w:sz w:val="29"/>
-              </w:rPr>
-              <w:t xml:space="preserve">Early-Career Prototypes    </w:t>
-            </w:r>
-            <w:hyperlink r:id="rId18">
-              <w:r>
-                <w:rPr>
-                  <w:rFonts w:ascii="Calibri" w:hAnsi="Calibri"/>
-                  <w:color w:val="9333EA"/>
-                  <w:u w:val="single"/>
-                  <w:b/>
-                  <w:sz w:val="26"/>
-                  <w:szCs w:val="26"/>
-                </w:rPr>
-                <w:t>[GitLab Repo ↗]</w:t>
-              </w:r>
-            </w:hyperlink>
-            <w:r>
-              <w:rPr>
-                <w:sz w:val="26"/>
-              </w:rPr>
-              <w:t xml:space="preserve">    </w:t>
-            </w:r>
-            <w:hyperlink r:id="rId19">
-              <w:r>
-                <w:rPr>
-                  <w:rFonts w:ascii="Calibri" w:hAnsi="Calibri"/>
-                  <w:color w:val="9333EA"/>
-                  <w:u w:val="single"/>
-                  <w:b/>
-                  <w:sz w:val="26"/>
-                  <w:szCs w:val="26"/>
-                </w:rPr>
-                <w:t>[Demos ↗]</w:t>
-              </w:r>
-            </w:hyperlink>
-          </w:p>
-          <w:p>
-            <w:pPr>
-              <w:spacing w:before="0" w:after="0" w:line="230" w:lineRule="auto"/>
-            </w:pPr>
-            <w:hyperlink r:id="rId20">
-              <w:r>
-                <w:rPr>
-                  <w:rFonts w:ascii="Calibri" w:hAnsi="Calibri"/>
-                  <w:color w:val="7E22CE"/>
-                  <w:u w:val="single"/>
-                  <w:b/>
-                  <w:sz w:val="25"/>
-                  <w:szCs w:val="25"/>
-                </w:rPr>
-                <w:t>This Is Blast</w:t>
-              </w:r>
-              <w:r>
-                <w:rPr>
-                  <w:rFonts w:ascii="Calibri" w:hAnsi="Calibri"/>
-                  <w:sz w:val="23"/>
-                </w:rPr>
-                <w:t xml:space="preserve"> </w:t>
-              </w:r>
-              <w:r>
-                <w:drawing>
-                  <wp:inline xmlns:a="http://schemas.openxmlformats.org/drawingml/2006/main" xmlns:pic="http://schemas.openxmlformats.org/drawingml/2006/picture">
-                    <wp:extent cx="133350" cy="133350"/>
-                    <wp:docPr id="1" name="Picture 1"/>
-                    <wp:cNvGraphicFramePr>
-                      <a:graphicFrameLocks noChangeAspect="1"/>
-                    </wp:cNvGraphicFramePr>
-                    <a:graphic>
-                      <a:graphicData uri="http://schemas.openxmlformats.org/drawingml/2006/picture">
-                        <pic:pic>
-                          <pic:nvPicPr>
-                            <pic:cNvPr id="0" name="github_icon.png"/>
-                            <pic:cNvPicPr/>
-                          </pic:nvPicPr>
-                          <pic:blipFill>
-                            <a:blip r:embed="rId21"/>
-                            <a:stretch>
-                              <a:fillRect/>
-                            </a:stretch>
-                          </pic:blipFill>
-                          <pic:spPr>
-                            <a:xfrm>
-                              <a:off x="0" y="0"/>
-                              <a:ext cx="133350" cy="133350"/>
-                            </a:xfrm>
-                            <a:prstGeom prst="rect"/>
-                          </pic:spPr>
-                        </pic:pic>
-                      </a:graphicData>
-                    </a:graphic>
-                  </wp:inline>
-                </w:drawing>
-              </w:r>
-            </w:hyperlink>
-            <w:r>
-              <w:rPr>
-                <w:color w:val="94A3B8"/>
-                <w:sz w:val="25"/>
-              </w:rPr>
-              <w:t xml:space="preserve">  •  </w:t>
-            </w:r>
-            <w:hyperlink r:id="rId22">
-              <w:r>
-                <w:rPr>
-                  <w:rFonts w:ascii="Calibri" w:hAnsi="Calibri"/>
-                  <w:color w:val="7E22CE"/>
-                  <w:u w:val="single"/>
-                  <w:b/>
-                  <w:sz w:val="25"/>
-                  <w:szCs w:val="25"/>
-                </w:rPr>
-                <w:t>Arrow Strike</w:t>
-              </w:r>
-              <w:r>
-                <w:rPr>
-                  <w:rFonts w:ascii="Calibri" w:hAnsi="Calibri"/>
-                  <w:sz w:val="23"/>
-                </w:rPr>
-                <w:t xml:space="preserve"> </w:t>
-              </w:r>
-              <w:r>
-                <w:drawing>
-                  <wp:inline xmlns:a="http://schemas.openxmlformats.org/drawingml/2006/main" xmlns:pic="http://schemas.openxmlformats.org/drawingml/2006/picture">
-                    <wp:extent cx="133350" cy="133350"/>
-                    <wp:docPr id="2" name="Picture 2"/>
-                    <wp:cNvGraphicFramePr>
-                      <a:graphicFrameLocks noChangeAspect="1"/>
-                    </wp:cNvGraphicFramePr>
-                    <a:graphic>
-                      <a:graphicData uri="http://schemas.openxmlformats.org/drawingml/2006/picture">
-                        <pic:pic>
-                          <pic:nvPicPr>
-                            <pic:cNvPr id="0" name="github_icon.png"/>
-                            <pic:cNvPicPr/>
-                          </pic:nvPicPr>
-                          <pic:blipFill>
-                            <a:blip r:embed="rId21"/>
-                            <a:stretch>
-                              <a:fillRect/>
-                            </a:stretch>
-                          </pic:blipFill>
-                          <pic:spPr>
-                            <a:xfrm>
-                              <a:off x="0" y="0"/>
-                              <a:ext cx="133350" cy="133350"/>
-                            </a:xfrm>
-                            <a:prstGeom prst="rect"/>
-                          </pic:spPr>
-                        </pic:pic>
-                      </a:graphicData>
-                    </a:graphic>
-                  </wp:inline>
-                </w:drawing>
-              </w:r>
-            </w:hyperlink>
-            <w:r>
-              <w:rPr>
-                <w:color w:val="94A3B8"/>
-                <w:sz w:val="25"/>
-              </w:rPr>
-              <w:t xml:space="preserve">  •  </w:t>
-            </w:r>
-            <w:hyperlink r:id="rId23">
-              <w:r>
-                <w:rPr>
-                  <w:rFonts w:ascii="Calibri" w:hAnsi="Calibri"/>
-                  <w:color w:val="7E22CE"/>
-                  <w:u w:val="single"/>
-                  <w:b/>
-                  <w:sz w:val="25"/>
-                  <w:szCs w:val="25"/>
-                </w:rPr>
-                <w:t>Tank Battle</w:t>
-              </w:r>
-              <w:r>
-                <w:rPr>
-                  <w:rFonts w:ascii="Calibri" w:hAnsi="Calibri"/>
-                  <w:sz w:val="23"/>
-                </w:rPr>
-                <w:t xml:space="preserve"> </w:t>
-              </w:r>
-              <w:r>
-                <w:drawing>
-                  <wp:inline xmlns:a="http://schemas.openxmlformats.org/drawingml/2006/main" xmlns:pic="http://schemas.openxmlformats.org/drawingml/2006/picture">
-                    <wp:extent cx="133350" cy="133350"/>
-                    <wp:docPr id="3" name="Picture 3"/>
-                    <wp:cNvGraphicFramePr>
-                      <a:graphicFrameLocks noChangeAspect="1"/>
-                    </wp:cNvGraphicFramePr>
-                    <a:graphic>
-                      <a:graphicData uri="http://schemas.openxmlformats.org/drawingml/2006/picture">
-                        <pic:pic>
-                          <pic:nvPicPr>
-                            <pic:cNvPr id="0" name="github_icon.png"/>
-                            <pic:cNvPicPr/>
-                          </pic:nvPicPr>
-                          <pic:blipFill>
-                            <a:blip r:embed="rId21"/>
-                            <a:stretch>
-                              <a:fillRect/>
-                            </a:stretch>
-                          </pic:blipFill>
-                          <pic:spPr>
-                            <a:xfrm>
-                              <a:off x="0" y="0"/>
-                              <a:ext cx="133350" cy="133350"/>
-                            </a:xfrm>
-                            <a:prstGeom prst="rect"/>
-                          </pic:spPr>
-                        </pic:pic>
-                      </a:graphicData>
-                    </a:graphic>
-                  </wp:inline>
-                </w:drawing>
-              </w:r>
-            </w:hyperlink>
-            <w:r>
-              <w:rPr>
-                <w:color w:val="94A3B8"/>
-                <w:sz w:val="25"/>
-              </w:rPr>
-              <w:t xml:space="preserve">  •  </w:t>
-            </w:r>
-            <w:hyperlink r:id="rId24">
-              <w:r>
-                <w:rPr>
-                  <w:rFonts w:ascii="Calibri" w:hAnsi="Calibri"/>
-                  <w:color w:val="7E22CE"/>
-                  <w:u w:val="single"/>
-                  <w:b/>
-                  <w:sz w:val="25"/>
-                  <w:szCs w:val="25"/>
-                </w:rPr>
-                <w:t>Bullet Chess</w:t>
-              </w:r>
-              <w:r>
-                <w:rPr>
-                  <w:rFonts w:ascii="Calibri" w:hAnsi="Calibri"/>
-                  <w:sz w:val="23"/>
-                </w:rPr>
-                <w:t xml:space="preserve"> </w:t>
-              </w:r>
-              <w:r>
-                <w:drawing>
-                  <wp:inline xmlns:a="http://schemas.openxmlformats.org/drawingml/2006/main" xmlns:pic="http://schemas.openxmlformats.org/drawingml/2006/picture">
-                    <wp:extent cx="133350" cy="133350"/>
-                    <wp:docPr id="4" name="Picture 4"/>
-                    <wp:cNvGraphicFramePr>
-                      <a:graphicFrameLocks noChangeAspect="1"/>
-                    </wp:cNvGraphicFramePr>
-                    <a:graphic>
-                      <a:graphicData uri="http://schemas.openxmlformats.org/drawingml/2006/picture">
-                        <pic:pic>
-                          <pic:nvPicPr>
-                            <pic:cNvPr id="0" name="github_icon.png"/>
-                            <pic:cNvPicPr/>
-                          </pic:nvPicPr>
-                          <pic:blipFill>
-                            <a:blip r:embed="rId21"/>
-                            <a:stretch>
-                              <a:fillRect/>
-                            </a:stretch>
-                          </pic:blipFill>
-                          <pic:spPr>
-                            <a:xfrm>
-                              <a:off x="0" y="0"/>
-                              <a:ext cx="133350" cy="133350"/>
-                            </a:xfrm>
-                            <a:prstGeom prst="rect"/>
-                          </pic:spPr>
-                        </pic:pic>
-                      </a:graphicData>
-                    </a:graphic>
-                  </wp:inline>
-                </w:drawing>
-              </w:r>
-            </w:hyperlink>
-            <w:r>
-              <w:rPr>
-                <w:color w:val="94A3B8"/>
-                <w:sz w:val="25"/>
-              </w:rPr>
-              <w:t xml:space="preserve">  •  </w:t>
-            </w:r>
-            <w:hyperlink r:id="rId25">
-              <w:r>
-                <w:rPr>
-                  <w:rFonts w:ascii="Calibri" w:hAnsi="Calibri"/>
-                  <w:color w:val="7E22CE"/>
-                  <w:u w:val="single"/>
-                  <w:b/>
-                  <w:sz w:val="25"/>
-                  <w:szCs w:val="25"/>
-                </w:rPr>
-                <w:t>Tycoon RTS</w:t>
-              </w:r>
-              <w:r>
-                <w:rPr>
-                  <w:rFonts w:ascii="Calibri" w:hAnsi="Calibri"/>
-                  <w:sz w:val="23"/>
-                </w:rPr>
-                <w:t xml:space="preserve"> </w:t>
-              </w:r>
-              <w:r>
-                <w:drawing>
-                  <wp:inline xmlns:a="http://schemas.openxmlformats.org/drawingml/2006/main" xmlns:pic="http://schemas.openxmlformats.org/drawingml/2006/picture">
-                    <wp:extent cx="133350" cy="133350"/>
-                    <wp:docPr id="5" name="Picture 5"/>
-                    <wp:cNvGraphicFramePr>
-                      <a:graphicFrameLocks noChangeAspect="1"/>
-                    </wp:cNvGraphicFramePr>
-                    <a:graphic>
-                      <a:graphicData uri="http://schemas.openxmlformats.org/drawingml/2006/picture">
-                        <pic:pic>
-                          <pic:nvPicPr>
-                            <pic:cNvPr id="0" name="github_icon.png"/>
-                            <pic:cNvPicPr/>
-                          </pic:nvPicPr>
-                          <pic:blipFill>
-                            <a:blip r:embed="rId21"/>
-                            <a:stretch>
-                              <a:fillRect/>
-                            </a:stretch>
-                          </pic:blipFill>
-                          <pic:spPr>
-                            <a:xfrm>
-                              <a:off x="0" y="0"/>
-                              <a:ext cx="133350" cy="133350"/>
-                            </a:xfrm>
-                            <a:prstGeom prst="rect"/>
-                          </pic:spPr>
-                        </pic:pic>
-                      </a:graphicData>
-                    </a:graphic>
-                  </wp:inline>
-                </w:drawing>
-              </w:r>
-            </w:hyperlink>
-            <w:r>
-              <w:rPr>
-                <w:color w:val="94A3B8"/>
-                <w:sz w:val="25"/>
-              </w:rPr>
-              <w:t xml:space="preserve">  •  </w:t>
-            </w:r>
-            <w:hyperlink r:id="rId19">
-              <w:r>
-                <w:rPr>
-                  <w:rFonts w:ascii="Calibri" w:hAnsi="Calibri"/>
-                  <w:color w:val="7E22CE"/>
-                  <w:u w:val="single"/>
-                  <w:b/>
-                  <w:sz w:val="25"/>
-                  <w:szCs w:val="25"/>
-                </w:rPr>
-                <w:t>Trivologist</w:t>
-              </w:r>
-              <w:r>
-                <w:rPr>
-                  <w:rFonts w:ascii="Calibri" w:hAnsi="Calibri"/>
-                  <w:sz w:val="23"/>
-                </w:rPr>
-                <w:t xml:space="preserve"> </w:t>
-              </w:r>
-              <w:r>
-                <w:drawing>
-                  <wp:inline xmlns:a="http://schemas.openxmlformats.org/drawingml/2006/main" xmlns:pic="http://schemas.openxmlformats.org/drawingml/2006/picture">
-                    <wp:extent cx="133350" cy="133350"/>
-                    <wp:docPr id="6" name="Picture 6"/>
-                    <wp:cNvGraphicFramePr>
-                      <a:graphicFrameLocks noChangeAspect="1"/>
-                    </wp:cNvGraphicFramePr>
-                    <a:graphic>
-                      <a:graphicData uri="http://schemas.openxmlformats.org/drawingml/2006/picture">
-                        <pic:pic>
-                          <pic:nvPicPr>
-                            <pic:cNvPr id="0" name="github_icon.png"/>
-                            <pic:cNvPicPr/>
-                          </pic:nvPicPr>
-                          <pic:blipFill>
-                            <a:blip r:embed="rId21"/>
-                            <a:stretch>
-                              <a:fillRect/>
-                            </a:stretch>
-                          </pic:blipFill>
-                          <pic:spPr>
-                            <a:xfrm>
-                              <a:off x="0" y="0"/>
-                              <a:ext cx="133350" cy="133350"/>
-                            </a:xfrm>
-                            <a:prstGeom prst="rect"/>
-                          </pic:spPr>
-                        </pic:pic>
-                      </a:graphicData>
-                    </a:graphic>
-                  </wp:inline>
-                </w:drawing>
-              </w:r>
-            </w:hyperlink>
-          </w:p>
-        </w:tc>
-      </w:tr>
     </w:tbl>
     <w:p>
       <w:pPr>
@@ -1184,7 +751,7 @@
         <w:tabs>
           <w:tab w:pos="11722" w:val="right"/>
         </w:tabs>
-        <w:spacing w:before="40" w:after="24"/>
+        <w:spacing w:before="90" w:after="50"/>
         <w:pBdr>
           <w:left w:val="single" w:sz="24" w:space="6" w:color="4F46E5"/>
           <w:bottom w:val="single" w:sz="6" w:space="1" w:color="CBD5E1"/>
@@ -1235,8 +802,8 @@
               <w:right w:val="single" w:sz="6" w:space="0" w:color="60A5FA"/>
             </w:tcBorders>
             <w:tcMar>
-              <w:top w:w="22" w:type="dxa"/>
-              <w:bottom w:w="22" w:type="dxa"/>
+              <w:top w:w="30" w:type="dxa"/>
+              <w:bottom w:w="30" w:type="dxa"/>
               <w:left w:w="65" w:type="dxa"/>
               <w:right w:w="65" w:type="dxa"/>
             </w:tcMar>
@@ -1283,7 +850,7 @@
           </w:p>
           <w:p>
             <w:pPr>
-              <w:spacing w:before="0" w:after="24"/>
+              <w:spacing w:before="0" w:after="30"/>
               <w:pBdr>
                 <w:bottom w:val="single" w:sz="4" w:space="1" w:color="CBD5E1"/>
               </w:pBdr>
@@ -1306,7 +873,7 @@
           </w:p>
           <w:p>
             <w:pPr>
-              <w:spacing w:before="0" w:after="12" w:line="228" w:lineRule="auto"/>
+              <w:spacing w:before="0" w:after="20" w:line="245" w:lineRule="auto"/>
               <w:ind w:left="202" w:hanging="173"/>
             </w:pPr>
             <w:r>
@@ -1335,7 +902,7 @@
           </w:p>
           <w:p>
             <w:pPr>
-              <w:spacing w:before="0" w:after="12" w:line="228" w:lineRule="auto"/>
+              <w:spacing w:before="0" w:after="20" w:line="245" w:lineRule="auto"/>
               <w:ind w:left="202" w:hanging="173"/>
             </w:pPr>
             <w:r>
@@ -1364,7 +931,7 @@
           </w:p>
           <w:p>
             <w:pPr>
-              <w:spacing w:before="0" w:after="12" w:line="228" w:lineRule="auto"/>
+              <w:spacing w:before="0" w:after="20" w:line="245" w:lineRule="auto"/>
               <w:ind w:left="202" w:hanging="173"/>
             </w:pPr>
             <w:r>
@@ -1393,36 +960,7 @@
           </w:p>
           <w:p>
             <w:pPr>
-              <w:spacing w:before="0" w:after="12" w:line="228" w:lineRule="auto"/>
-              <w:ind w:left="202" w:hanging="173"/>
-            </w:pPr>
-            <w:r>
-              <w:rPr>
-                <w:b/>
-                <w:color w:val="2563EB"/>
-                <w:sz w:val="26"/>
-              </w:rPr>
-              <w:t xml:space="preserve">• </w:t>
-            </w:r>
-            <w:r>
-              <w:rPr>
-                <w:b/>
-                <w:color w:val="0F172A"/>
-                <w:sz w:val="26"/>
-              </w:rPr>
-              <w:t xml:space="preserve">Card Seam Merging &amp; Arrow Mechanics (Calm Solitaire &amp; Arrow): </w:t>
-            </w:r>
-            <w:r>
-              <w:rPr>
-                <w:color w:val="334155"/>
-                <w:sz w:val="26"/>
-              </w:rPr>
-              <w:t>Engineered rectangular card-grid 0px seam merging, displacement swapping, procedural flame noise shaders, and outside-in peeling arrow escape mechanics.</w:t>
-            </w:r>
-          </w:p>
-          <w:p>
-            <w:pPr>
-              <w:spacing w:before="0" w:after="0" w:line="228" w:lineRule="auto"/>
+              <w:spacing w:before="0" w:after="0" w:line="245" w:lineRule="auto"/>
               <w:ind w:left="202" w:hanging="173"/>
             </w:pPr>
             <w:r>

</xml_diff>

<commit_message>
Add row gap between contact details and executive profile, add half-line bullet padding, and update bullet 1 text
</commit_message>
<xml_diff>
--- a/assets/resume/Arpit_Jaiswal_Game_Dev_Resume.docx
+++ b/assets/resume/Arpit_Jaiswal_Game_Dev_Resume.docx
@@ -18,7 +18,7 @@
     </w:p>
     <w:p>
       <w:pPr>
-        <w:spacing w:before="0" w:after="170"/>
+        <w:spacing w:before="0" w:after="20"/>
         <w:jc w:val="center"/>
       </w:pPr>
       <w:r>
@@ -51,7 +51,7 @@
         <w:tabs>
           <w:tab w:pos="11722" w:val="right"/>
         </w:tabs>
-        <w:spacing w:before="0" w:after="30"/>
+        <w:spacing w:before="0" w:after="70"/>
         <w:pBdr>
           <w:bottom w:val="single" w:sz="16" w:space="2" w:color="1E293B"/>
         </w:pBdr>
@@ -175,7 +175,7 @@
         <w:tabs>
           <w:tab w:pos="11722" w:val="right"/>
         </w:tabs>
-        <w:spacing w:before="36" w:after="24"/>
+        <w:spacing w:before="80" w:after="36"/>
         <w:pBdr>
           <w:left w:val="single" w:sz="24" w:space="6" w:color="2563EB"/>
           <w:bottom w:val="single" w:sz="6" w:space="1" w:color="CBD5E1"/>
@@ -234,7 +234,7 @@
           </w:tcPr>
           <w:p>
             <w:pPr>
-              <w:spacing w:before="0" w:after="20" w:line="230" w:lineRule="auto"/>
+              <w:spacing w:before="0" w:after="120" w:line="230" w:lineRule="auto"/>
               <w:ind w:left="202" w:hanging="173"/>
             </w:pPr>
             <w:r>
@@ -263,7 +263,7 @@
           </w:p>
           <w:p>
             <w:pPr>
-              <w:spacing w:before="0" w:after="20" w:line="230" w:lineRule="auto"/>
+              <w:spacing w:before="0" w:after="120" w:line="230" w:lineRule="auto"/>
               <w:ind w:left="202" w:hanging="173"/>
             </w:pPr>
             <w:r>

</xml_diff>

<commit_message>
Update title to Unity & AI Systems Developer, experience to 3+, Vasundhara duration, Google Play ratings, fitWidth button, and resume download dropdown
</commit_message>
<xml_diff>
--- a/assets/resume/Arpit_Jaiswal_Game_Dev_Resume.docx
+++ b/assets/resume/Arpit_Jaiswal_Game_Dev_Resume.docx
@@ -18,7 +18,7 @@
     </w:p>
     <w:p>
       <w:pPr>
-        <w:spacing w:before="0" w:after="20"/>
+        <w:spacing w:before="0" w:after="220"/>
         <w:jc w:val="center"/>
       </w:pPr>
       <w:r>
@@ -27,15 +27,7 @@
           <w:color w:val="0F172A"/>
           <w:sz w:val="29"/>
         </w:rPr>
-        <w:t>GAMEPLAY &amp; AI SYSTEMS DEVELOPER</w:t>
-      </w:r>
-      <w:r>
-        <w:rPr>
-          <w:b/>
-          <w:color w:val="059669"/>
-          <w:sz w:val="27"/>
-        </w:rPr>
-        <w:t xml:space="preserve">   [ UNITY DEVELOPER ]</w:t>
+        <w:t>|  Unity &amp; AI Systems Developer  |</w:t>
       </w:r>
       <w:r>
         <w:rPr>
@@ -43,7 +35,7 @@
           <w:color w:val="1D4ED8"/>
           <w:sz w:val="27"/>
         </w:rPr>
-        <w:t xml:space="preserve">   [ 3.5+ YRS EXPERIENCE ]</w:t>
+        <w:t xml:space="preserve">   [ 3+ YRS EXPERIENCE ]</w:t>
       </w:r>
     </w:p>
     <w:p>
@@ -175,7 +167,7 @@
         <w:tabs>
           <w:tab w:pos="11722" w:val="right"/>
         </w:tabs>
-        <w:spacing w:before="80" w:after="36"/>
+        <w:spacing w:before="200" w:after="36"/>
         <w:pBdr>
           <w:left w:val="single" w:sz="24" w:space="6" w:color="2563EB"/>
           <w:bottom w:val="single" w:sz="6" w:space="1" w:color="CBD5E1"/>
@@ -251,14 +243,14 @@
                 <w:color w:val="0F172A"/>
                 <w:sz w:val="26"/>
               </w:rPr>
-              <w:t xml:space="preserve">Production &amp; Multiplayer Systems (Unity C#): </w:t>
+              <w:t xml:space="preserve">Production &amp; Multiplayer: </w:t>
             </w:r>
             <w:r>
               <w:rPr>
                 <w:color w:val="334155"/>
                 <w:sz w:val="26"/>
               </w:rPr>
-              <w:t>Gameplay &amp; Systems Engineer with 3.5+ years shipping 3 Google Play titles and real-time multiplayer games using Photon (PUN 2), Stockfish AI, and deterministic FSMs.</w:t>
+              <w:t>3+ years across 3 studios. Shipped 3 Google Play puzzle games rated 4.8–5.0★ and Bullet Chess, a real-time multiplayer game built with Photon PUN 2 and Stockfish AI.</w:t>
             </w:r>
           </w:p>
           <w:p>
@@ -280,14 +272,14 @@
                 <w:color w:val="0F172A"/>
                 <w:sz w:val="26"/>
               </w:rPr>
-              <w:t xml:space="preserve">Architecture, Native Bridges &amp; 60 FPS: </w:t>
+              <w:t xml:space="preserve">Systems &amp; Performance: </w:t>
             </w:r>
             <w:r>
               <w:rPr>
                 <w:color w:val="334155"/>
                 <w:sz w:val="26"/>
               </w:rPr>
-              <w:t>Specialist in procedural N×N mesh/puzzle generation, native Android (JNI) / iOS (Obj-C) bridges, non-blocking OTA content delivery, and Zero-GC object pooling locked at 60 FPS.</w:t>
+              <w:t>Procedural N×N jigsaw meshes (9 edge signatures, no pre-cut art), backtracking hint solvers, JNI/Obj-C image bridges with 3-tier caching, OTA level sync, and Zero-GC pooling at 60 FPS.</w:t>
             </w:r>
           </w:p>
           <w:p>
@@ -309,14 +301,14 @@
                 <w:color w:val="0F172A"/>
                 <w:sz w:val="26"/>
               </w:rPr>
-              <w:t xml:space="preserve">AI-Augmented Tooling &amp; LiveOps: </w:t>
+              <w:t xml:space="preserve">Tooling, LiveOps &amp; AI: </w:t>
             </w:r>
             <w:r>
               <w:rPr>
                 <w:color w:val="334155"/>
                 <w:sz w:val="26"/>
               </w:rPr>
-              <w:t>Leverages Claude, ChatGPT/Codex, and custom Unity EditorWindows to accelerate URP/HLSL shader prototyping, offline localization pipelines, and Google/Apple IAP monetization.</w:t>
+              <w:t>Custom Unity EditorWindows (Asset Organizer, Argos localization), offline bot leaderboards, Google/Apple IAP, and 8 playable WebGL demos, built faster with Claude and Codex.</w:t>
             </w:r>
           </w:p>
         </w:tc>
@@ -400,7 +392,7 @@
                 <w:color w:val="0F172A"/>
                 <w:sz w:val="29"/>
               </w:rPr>
-              <w:t>3.5+ Years</w:t>
+              <w:t>3+ Years</w:t>
             </w:r>
             <w:r>
               <w:rPr>
@@ -437,7 +429,7 @@
                 <w:color w:val="334155"/>
                 <w:sz w:val="24"/>
               </w:rPr>
-              <w:t xml:space="preserve"> • Dec 2024 – Jan 2025 &amp; Dec 2025 – Present</w:t>
+              <w:t xml:space="preserve"> • Jan 2023 – Jan 2024  &amp;  Dec 2025 – Present</w:t>
             </w:r>
           </w:p>
           <w:p>
@@ -868,7 +860,7 @@
                 <w:color w:val="0F172A"/>
                 <w:sz w:val="25"/>
               </w:rPr>
-              <w:t>Dec 2024 – Jan 2025 &amp; Dec 2025 – Present</w:t>
+              <w:t>Jan 2023 – Jan 2024  &amp;  Dec 2025 – Present</w:t>
             </w:r>
           </w:p>
           <w:p>

</xml_diff>